<commit_message>
v2.0.0: Versión Web Premium con selector de tasas, modo oscuro y diseño mejorado
</commit_message>
<xml_diff>
--- a/Documentación/Bitacora de implementación.docx
+++ b/Documentación/Bitacora de implementación.docx
@@ -4837,8 +4837,14 @@
                 <w:iCs w:val="0"/>
               </w:rPr>
             </w:pPr>
-            <w:bookmarkStart w:id="0" w:name="_GoBack"/>
-            <w:bookmarkEnd w:id="0"/>
+            <w:r>
+              <w:rPr>
+                <w:i w:val="0"/>
+                <w:iCs w:val="0"/>
+              </w:rPr>
+              <w:lastRenderedPageBreak/>
+              <w:t>6/4/2026</w:t>
+            </w:r>
           </w:p>
         </w:tc>
         <w:tc>
@@ -4849,6 +4855,567 @@
             <w:pPr>
               <w:cnfStyle w:val="000000100000" w:firstRow="0" w:lastRow="0" w:firstColumn="0" w:lastColumn="0" w:oddVBand="0" w:evenVBand="0" w:oddHBand="1" w:evenHBand="0" w:firstRowFirstColumn="0" w:firstRowLastColumn="0" w:lastRowFirstColumn="0" w:lastRowLastColumn="0"/>
             </w:pPr>
+            <w:proofErr w:type="spellStart"/>
+            <w:r>
+              <w:t>Estabamos</w:t>
+            </w:r>
+            <w:proofErr w:type="spellEnd"/>
+            <w:r>
+              <w:t xml:space="preserve"> siguiendo una planificación para actualizar el repositorio que tengo en </w:t>
+            </w:r>
+            <w:proofErr w:type="spellStart"/>
+            <w:r>
+              <w:t>github</w:t>
+            </w:r>
+            <w:proofErr w:type="spellEnd"/>
+            <w:r>
+              <w:t xml:space="preserve"> para actualizarlo a la nueva versión de la aplicación </w:t>
+            </w:r>
+            <w:proofErr w:type="spellStart"/>
+            <w:r>
+              <w:t>dolar_bcv</w:t>
+            </w:r>
+            <w:proofErr w:type="spellEnd"/>
+            <w:r>
+              <w:t xml:space="preserve"> que trata de una calculadora de conversión de monetaria para sumar los productos que se comprar en un supermercado o tienda que por lo general manejas precios en dólares y en bolívares </w:t>
+            </w:r>
+            <w:proofErr w:type="spellStart"/>
+            <w:r>
+              <w:t>simultaneamente</w:t>
+            </w:r>
+            <w:proofErr w:type="spellEnd"/>
+            <w:r>
+              <w:t xml:space="preserve">. Hicimos un alto para reiniciar </w:t>
+            </w:r>
+            <w:proofErr w:type="spellStart"/>
+            <w:r>
+              <w:t>Antigravity</w:t>
+            </w:r>
+            <w:proofErr w:type="spellEnd"/>
+            <w:r>
+              <w:t>, nuestro entorno de desarrollo, porque tu consola no estaba respondiendo y se quedaba pegada. ¿Puedes por favor revisar si se resolvió tu acceso a la consola y si puedes retomar el plan que habías hecho?</w:t>
+            </w:r>
+          </w:p>
+          <w:p>
+            <w:pPr>
+              <w:cnfStyle w:val="000000100000" w:firstRow="0" w:lastRow="0" w:firstColumn="0" w:lastColumn="0" w:oddVBand="0" w:evenVBand="0" w:oddHBand="1" w:evenHBand="0" w:firstRowFirstColumn="0" w:firstRowLastColumn="0" w:lastRowFirstColumn="0" w:lastRowLastColumn="0"/>
+            </w:pPr>
+          </w:p>
+        </w:tc>
+      </w:tr>
+      <w:tr>
+        <w:tc>
+          <w:tcPr>
+            <w:cnfStyle w:val="001000000000" w:firstRow="0" w:lastRow="0" w:firstColumn="1" w:lastColumn="0" w:oddVBand="0" w:evenVBand="0" w:oddHBand="0" w:evenHBand="0" w:firstRowFirstColumn="0" w:firstRowLastColumn="0" w:lastRowFirstColumn="0" w:lastRowLastColumn="0"/>
+            <w:tcW w:w="1056" w:type="dxa"/>
+          </w:tcPr>
+          <w:p>
+            <w:pPr>
+              <w:rPr>
+                <w:i w:val="0"/>
+                <w:iCs w:val="0"/>
+              </w:rPr>
+            </w:pPr>
+          </w:p>
+        </w:tc>
+        <w:tc>
+          <w:tcPr>
+            <w:tcW w:w="9619" w:type="dxa"/>
+          </w:tcPr>
+          <w:p>
+            <w:pPr>
+              <w:cnfStyle w:val="000000000000" w:firstRow="0" w:lastRow="0" w:firstColumn="0" w:lastColumn="0" w:oddVBand="0" w:evenVBand="0" w:oddHBand="0" w:evenHBand="0" w:firstRowFirstColumn="0" w:firstRowLastColumn="0" w:lastRowFirstColumn="0" w:lastRowLastColumn="0"/>
+            </w:pPr>
+            <w:r>
+              <w:t xml:space="preserve">He actualizado los archivos principales (index.html, styles.css y script.js) para implementar todas las funcionalidades que teníamos en la versión </w:t>
+            </w:r>
+            <w:proofErr w:type="spellStart"/>
+            <w:r>
+              <w:t>Flutter</w:t>
+            </w:r>
+            <w:proofErr w:type="spellEnd"/>
+            <w:r>
+              <w:t>, pero optimizadas para la web:</w:t>
+            </w:r>
+          </w:p>
+          <w:p>
+            <w:pPr>
+              <w:cnfStyle w:val="000000000000" w:firstRow="0" w:lastRow="0" w:firstColumn="0" w:lastColumn="0" w:oddVBand="0" w:evenVBand="0" w:oddHBand="0" w:evenHBand="0" w:firstRowFirstColumn="0" w:firstRowLastColumn="0" w:lastRowFirstColumn="0" w:lastRowLastColumn="0"/>
+            </w:pPr>
+            <w:r>
+              <w:rPr>
+                <w:rFonts w:ascii="Segoe UI Symbol" w:hAnsi="Segoe UI Symbol" w:cs="Segoe UI Symbol"/>
+              </w:rPr>
+              <w:t>✅</w:t>
+            </w:r>
+            <w:r>
+              <w:t xml:space="preserve"> Cambios Realizados:</w:t>
+            </w:r>
+          </w:p>
+          <w:p>
+            <w:pPr>
+              <w:numPr>
+                <w:ilvl w:val="0"/>
+                <w:numId w:val="23"/>
+              </w:numPr>
+              <w:cnfStyle w:val="000000000000" w:firstRow="0" w:lastRow="0" w:firstColumn="0" w:lastColumn="0" w:oddVBand="0" w:evenVBand="0" w:oddHBand="0" w:evenHBand="0" w:firstRowFirstColumn="0" w:firstRowLastColumn="0" w:lastRowFirstColumn="0" w:lastRowLastColumn="0"/>
+            </w:pPr>
+            <w:r>
+              <w:rPr>
+                <w:b/>
+                <w:bCs/>
+              </w:rPr>
+              <w:t>Selector de Tasas:</w:t>
+            </w:r>
+            <w:r>
+              <w:t> Ahora puedes alternar entre </w:t>
+            </w:r>
+            <w:r>
+              <w:rPr>
+                <w:b/>
+                <w:bCs/>
+              </w:rPr>
+              <w:t>BCV</w:t>
+            </w:r>
+            <w:r>
+              <w:t>, </w:t>
+            </w:r>
+            <w:r>
+              <w:rPr>
+                <w:b/>
+                <w:bCs/>
+              </w:rPr>
+              <w:t>USDT</w:t>
+            </w:r>
+            <w:r>
+              <w:t> (Paralelo) y </w:t>
+            </w:r>
+            <w:r>
+              <w:rPr>
+                <w:b/>
+                <w:bCs/>
+              </w:rPr>
+              <w:t>Manual</w:t>
+            </w:r>
+            <w:r>
+              <w:t>. La aplicación descarga ambas tasas automáticamente al iniciar.</w:t>
+            </w:r>
+          </w:p>
+          <w:p>
+            <w:pPr>
+              <w:numPr>
+                <w:ilvl w:val="0"/>
+                <w:numId w:val="23"/>
+              </w:numPr>
+              <w:cnfStyle w:val="000000000000" w:firstRow="0" w:lastRow="0" w:firstColumn="0" w:lastColumn="0" w:oddVBand="0" w:evenVBand="0" w:oddHBand="0" w:evenHBand="0" w:firstRowFirstColumn="0" w:firstRowLastColumn="0" w:lastRowFirstColumn="0" w:lastRowLastColumn="0"/>
+            </w:pPr>
+            <w:r>
+              <w:rPr>
+                <w:b/>
+                <w:bCs/>
+              </w:rPr>
+              <w:t>Modo Oscuro/Claro:</w:t>
+            </w:r>
+            <w:r>
+              <w:t xml:space="preserve"> Añadí un </w:t>
+            </w:r>
+            <w:proofErr w:type="spellStart"/>
+            <w:r>
+              <w:t>toggle</w:t>
+            </w:r>
+            <w:proofErr w:type="spellEnd"/>
+            <w:r>
+              <w:t xml:space="preserve"> (icono de luna/sol) con persistencia en el navegador. El diseño sigue una estética </w:t>
+            </w:r>
+            <w:r>
+              <w:rPr>
+                <w:i/>
+                <w:iCs/>
+              </w:rPr>
+              <w:t xml:space="preserve">Premium </w:t>
+            </w:r>
+            <w:proofErr w:type="spellStart"/>
+            <w:r>
+              <w:rPr>
+                <w:i/>
+                <w:iCs/>
+              </w:rPr>
+              <w:t>Glassmorphism</w:t>
+            </w:r>
+            <w:proofErr w:type="spellEnd"/>
+            <w:r>
+              <w:t>.</w:t>
+            </w:r>
+          </w:p>
+          <w:p>
+            <w:pPr>
+              <w:numPr>
+                <w:ilvl w:val="0"/>
+                <w:numId w:val="23"/>
+              </w:numPr>
+              <w:cnfStyle w:val="000000000000" w:firstRow="0" w:lastRow="0" w:firstColumn="0" w:lastColumn="0" w:oddVBand="0" w:evenVBand="0" w:oddHBand="0" w:evenHBand="0" w:firstRowFirstColumn="0" w:firstRowLastColumn="0" w:lastRowFirstColumn="0" w:lastRowLastColumn="0"/>
+            </w:pPr>
+            <w:r>
+              <w:rPr>
+                <w:b/>
+                <w:bCs/>
+              </w:rPr>
+              <w:t>Subtotal Dual:</w:t>
+            </w:r>
+            <w:r>
+              <w:t> Ahora ves cuánto suma el producto actual tanto en Bolívares como en Dólares simultáneamente antes de agregarlo al total.</w:t>
+            </w:r>
+          </w:p>
+          <w:p>
+            <w:pPr>
+              <w:numPr>
+                <w:ilvl w:val="0"/>
+                <w:numId w:val="23"/>
+              </w:numPr>
+              <w:cnfStyle w:val="000000000000" w:firstRow="0" w:lastRow="0" w:firstColumn="0" w:lastColumn="0" w:oddVBand="0" w:evenVBand="0" w:oddHBand="0" w:evenHBand="0" w:firstRowFirstColumn="0" w:firstRowLastColumn="0" w:lastRowFirstColumn="0" w:lastRowLastColumn="0"/>
+            </w:pPr>
+            <w:r>
+              <w:rPr>
+                <w:b/>
+                <w:bCs/>
+              </w:rPr>
+              <w:t>Cálculos Inteligentes:</w:t>
+            </w:r>
+            <w:r>
+              <w:t> Si ingresas un monto en Dólares, calcula el equivalente en Bolívares y viceversa, basado en la tasa seleccionada.</w:t>
+            </w:r>
+          </w:p>
+          <w:p>
+            <w:pPr>
+              <w:numPr>
+                <w:ilvl w:val="0"/>
+                <w:numId w:val="23"/>
+              </w:numPr>
+              <w:cnfStyle w:val="000000000000" w:firstRow="0" w:lastRow="0" w:firstColumn="0" w:lastColumn="0" w:oddVBand="0" w:evenVBand="0" w:oddHBand="0" w:evenHBand="0" w:firstRowFirstColumn="0" w:firstRowLastColumn="0" w:lastRowFirstColumn="0" w:lastRowLastColumn="0"/>
+            </w:pPr>
+            <w:r>
+              <w:rPr>
+                <w:b/>
+                <w:bCs/>
+              </w:rPr>
+              <w:t>Persistencia:</w:t>
+            </w:r>
+            <w:r>
+              <w:t> El total y la lista de pendientes se guardan localmente para que no los pierdas al refrescar la página.</w:t>
+            </w:r>
+          </w:p>
+          <w:p>
+            <w:pPr>
+              <w:cnfStyle w:val="000000000000" w:firstRow="0" w:lastRow="0" w:firstColumn="0" w:lastColumn="0" w:oddVBand="0" w:evenVBand="0" w:oddHBand="0" w:evenHBand="0" w:firstRowFirstColumn="0" w:firstRowLastColumn="0" w:lastRowFirstColumn="0" w:lastRowLastColumn="0"/>
+            </w:pPr>
+            <w:r>
+              <w:rPr>
+                <w:rFonts w:ascii="Segoe UI Symbol" w:hAnsi="Segoe UI Symbol" w:cs="Segoe UI Symbol"/>
+              </w:rPr>
+              <w:t>🛠</w:t>
+            </w:r>
+            <w:r>
+              <w:t>️ Próximo Paso (Fase 3):</w:t>
+            </w:r>
+          </w:p>
+          <w:p>
+            <w:pPr>
+              <w:cnfStyle w:val="000000000000" w:firstRow="0" w:lastRow="0" w:firstColumn="0" w:lastColumn="0" w:oddVBand="0" w:evenVBand="0" w:oddHBand="0" w:evenHBand="0" w:firstRowFirstColumn="0" w:firstRowLastColumn="0" w:lastRowFirstColumn="0" w:lastRowLastColumn="0"/>
+            </w:pPr>
+            <w:r>
+              <w:t>Por favor, </w:t>
+            </w:r>
+            <w:r>
+              <w:rPr>
+                <w:b/>
+                <w:bCs/>
+              </w:rPr>
+              <w:t>abre el archivo index.html en tu navegador</w:t>
+            </w:r>
+            <w:r>
+              <w:t> y verifica:</w:t>
+            </w:r>
+          </w:p>
+          <w:p>
+            <w:pPr>
+              <w:numPr>
+                <w:ilvl w:val="0"/>
+                <w:numId w:val="24"/>
+              </w:numPr>
+              <w:cnfStyle w:val="000000000000" w:firstRow="0" w:lastRow="0" w:firstColumn="0" w:lastColumn="0" w:oddVBand="0" w:evenVBand="0" w:oddHBand="0" w:evenHBand="0" w:firstRowFirstColumn="0" w:firstRowLastColumn="0" w:lastRowFirstColumn="0" w:lastRowLastColumn="0"/>
+            </w:pPr>
+            <w:r>
+              <w:t>¿Las tasas cargan correctamente?</w:t>
+            </w:r>
+          </w:p>
+          <w:p>
+            <w:pPr>
+              <w:numPr>
+                <w:ilvl w:val="0"/>
+                <w:numId w:val="24"/>
+              </w:numPr>
+              <w:cnfStyle w:val="000000000000" w:firstRow="0" w:lastRow="0" w:firstColumn="0" w:lastColumn="0" w:oddVBand="0" w:evenVBand="0" w:oddHBand="0" w:evenHBand="0" w:firstRowFirstColumn="0" w:firstRowLastColumn="0" w:lastRowFirstColumn="0" w:lastRowLastColumn="0"/>
+            </w:pPr>
+            <w:r>
+              <w:t>¿El cambio entre modo oscuro y claro funciona bien?</w:t>
+            </w:r>
+          </w:p>
+          <w:p>
+            <w:pPr>
+              <w:numPr>
+                <w:ilvl w:val="0"/>
+                <w:numId w:val="24"/>
+              </w:numPr>
+              <w:cnfStyle w:val="000000000000" w:firstRow="0" w:lastRow="0" w:firstColumn="0" w:lastColumn="0" w:oddVBand="0" w:evenVBand="0" w:oddHBand="0" w:evenHBand="0" w:firstRowFirstColumn="0" w:firstRowLastColumn="0" w:lastRowFirstColumn="0" w:lastRowLastColumn="0"/>
+            </w:pPr>
+            <w:r>
+              <w:t>¿Los cálculos del subtotal y el total son correctos?</w:t>
+            </w:r>
+          </w:p>
+          <w:p>
+            <w:pPr>
+              <w:cnfStyle w:val="000000000000" w:firstRow="0" w:lastRow="0" w:firstColumn="0" w:lastColumn="0" w:oddVBand="0" w:evenVBand="0" w:oddHBand="0" w:evenHBand="0" w:firstRowFirstColumn="0" w:firstRowLastColumn="0" w:lastRowFirstColumn="0" w:lastRowLastColumn="0"/>
+            </w:pPr>
+            <w:r>
+              <w:t>Una vez que me confirmes que todo está funcionando a tu gusto, procederemos con la </w:t>
+            </w:r>
+            <w:r>
+              <w:rPr>
+                <w:b/>
+                <w:bCs/>
+              </w:rPr>
+              <w:t>Fase 4: Sincronizar con GitHub</w:t>
+            </w:r>
+            <w:r>
+              <w:t> para que los cambios sean públicos.</w:t>
+            </w:r>
+          </w:p>
+          <w:p>
+            <w:pPr>
+              <w:cnfStyle w:val="000000000000" w:firstRow="0" w:lastRow="0" w:firstColumn="0" w:lastColumn="0" w:oddVBand="0" w:evenVBand="0" w:oddHBand="0" w:evenHBand="0" w:firstRowFirstColumn="0" w:firstRowLastColumn="0" w:lastRowFirstColumn="0" w:lastRowLastColumn="0"/>
+            </w:pPr>
+          </w:p>
+        </w:tc>
+      </w:tr>
+      <w:tr>
+        <w:trPr>
+          <w:cnfStyle w:val="000000100000" w:firstRow="0" w:lastRow="0" w:firstColumn="0" w:lastColumn="0" w:oddVBand="0" w:evenVBand="0" w:oddHBand="1" w:evenHBand="0" w:firstRowFirstColumn="0" w:firstRowLastColumn="0" w:lastRowFirstColumn="0" w:lastRowLastColumn="0"/>
+        </w:trPr>
+        <w:tc>
+          <w:tcPr>
+            <w:cnfStyle w:val="001000000000" w:firstRow="0" w:lastRow="0" w:firstColumn="1" w:lastColumn="0" w:oddVBand="0" w:evenVBand="0" w:oddHBand="0" w:evenHBand="0" w:firstRowFirstColumn="0" w:firstRowLastColumn="0" w:lastRowFirstColumn="0" w:lastRowLastColumn="0"/>
+            <w:tcW w:w="1056" w:type="dxa"/>
+          </w:tcPr>
+          <w:p>
+            <w:pPr>
+              <w:rPr>
+                <w:i w:val="0"/>
+                <w:iCs w:val="0"/>
+              </w:rPr>
+            </w:pPr>
+            <w:r>
+              <w:rPr>
+                <w:i w:val="0"/>
+                <w:iCs w:val="0"/>
+              </w:rPr>
+              <w:t>6/4/2026</w:t>
+            </w:r>
+          </w:p>
+        </w:tc>
+        <w:tc>
+          <w:tcPr>
+            <w:tcW w:w="9619" w:type="dxa"/>
+          </w:tcPr>
+          <w:p>
+            <w:pPr>
+              <w:cnfStyle w:val="000000100000" w:firstRow="0" w:lastRow="0" w:firstColumn="0" w:lastColumn="0" w:oddVBand="0" w:evenVBand="0" w:oddHBand="1" w:evenHBand="0" w:firstRowFirstColumn="0" w:firstRowLastColumn="0" w:lastRowFirstColumn="0" w:lastRowLastColumn="0"/>
+            </w:pPr>
+            <w:r>
+              <w:t>Sí, me gusta como ha quedado, solo encontré unos detalles sencillos pero importante: en la cabecera Faltó el Título "</w:t>
+            </w:r>
+            <w:proofErr w:type="spellStart"/>
+            <w:r>
+              <w:t>Dolar</w:t>
+            </w:r>
+            <w:proofErr w:type="spellEnd"/>
+            <w:r>
+              <w:t xml:space="preserve"> BCV Premium" antes del botón para cambiar de modo claro/oscuro; y en los cuadros de entradas para 'Ingresar monto' y para escribir los </w:t>
+            </w:r>
+            <w:proofErr w:type="spellStart"/>
+            <w:r>
+              <w:t>items</w:t>
+            </w:r>
+            <w:proofErr w:type="spellEnd"/>
+            <w:r>
+              <w:t xml:space="preserve"> nuevos de la lista, el color de la fuente es blanco y en el modo claro no se ve. En el modo oscuro se ve perfecto.</w:t>
+            </w:r>
+          </w:p>
+          <w:p>
+            <w:pPr>
+              <w:cnfStyle w:val="000000100000" w:firstRow="0" w:lastRow="0" w:firstColumn="0" w:lastColumn="0" w:oddVBand="0" w:evenVBand="0" w:oddHBand="1" w:evenHBand="0" w:firstRowFirstColumn="0" w:firstRowLastColumn="0" w:lastRowFirstColumn="0" w:lastRowLastColumn="0"/>
+            </w:pPr>
+          </w:p>
+        </w:tc>
+      </w:tr>
+      <w:tr>
+        <w:tc>
+          <w:tcPr>
+            <w:cnfStyle w:val="001000000000" w:firstRow="0" w:lastRow="0" w:firstColumn="1" w:lastColumn="0" w:oddVBand="0" w:evenVBand="0" w:oddHBand="0" w:evenHBand="0" w:firstRowFirstColumn="0" w:firstRowLastColumn="0" w:lastRowFirstColumn="0" w:lastRowLastColumn="0"/>
+            <w:tcW w:w="1056" w:type="dxa"/>
+          </w:tcPr>
+          <w:p>
+            <w:pPr>
+              <w:rPr>
+                <w:i w:val="0"/>
+                <w:iCs w:val="0"/>
+              </w:rPr>
+            </w:pPr>
+          </w:p>
+        </w:tc>
+        <w:tc>
+          <w:tcPr>
+            <w:tcW w:w="9619" w:type="dxa"/>
+          </w:tcPr>
+          <w:p>
+            <w:pPr>
+              <w:cnfStyle w:val="000000000000" w:firstRow="0" w:lastRow="0" w:firstColumn="0" w:lastColumn="0" w:oddVBand="0" w:evenVBand="0" w:oddHBand="0" w:evenHBand="0" w:firstRowFirstColumn="0" w:firstRowLastColumn="0" w:lastRowFirstColumn="0" w:lastRowLastColumn="0"/>
+            </w:pPr>
+            <w:r>
+              <w:t>¡Listo! He corregido esos detalles para que la experiencia sea perfecta en ambos modos:</w:t>
+            </w:r>
+          </w:p>
+          <w:p>
+            <w:pPr>
+              <w:numPr>
+                <w:ilvl w:val="0"/>
+                <w:numId w:val="25"/>
+              </w:numPr>
+              <w:cnfStyle w:val="000000000000" w:firstRow="0" w:lastRow="0" w:firstColumn="0" w:lastColumn="0" w:oddVBand="0" w:evenVBand="0" w:oddHBand="0" w:evenHBand="0" w:firstRowFirstColumn="0" w:firstRowLastColumn="0" w:lastRowFirstColumn="0" w:lastRowLastColumn="0"/>
+            </w:pPr>
+            <w:r>
+              <w:rPr>
+                <w:b/>
+                <w:bCs/>
+              </w:rPr>
+              <w:t>Cabecera:</w:t>
+            </w:r>
+            <w:r>
+              <w:t> Añadí el título </w:t>
+            </w:r>
+            <w:r>
+              <w:rPr>
+                <w:b/>
+                <w:bCs/>
+              </w:rPr>
+              <w:t>"</w:t>
+            </w:r>
+            <w:proofErr w:type="spellStart"/>
+            <w:r>
+              <w:rPr>
+                <w:b/>
+                <w:bCs/>
+              </w:rPr>
+              <w:t>Dolar</w:t>
+            </w:r>
+            <w:proofErr w:type="spellEnd"/>
+            <w:r>
+              <w:rPr>
+                <w:b/>
+                <w:bCs/>
+              </w:rPr>
+              <w:t xml:space="preserve"> BCV Premium"</w:t>
+            </w:r>
+            <w:r>
+              <w:t> en la parte superior izquierda, manteniendo el botón de modo oscuro a la derecha para un diseño balanceado.</w:t>
+            </w:r>
+          </w:p>
+          <w:p>
+            <w:pPr>
+              <w:numPr>
+                <w:ilvl w:val="0"/>
+                <w:numId w:val="25"/>
+              </w:numPr>
+              <w:cnfStyle w:val="000000000000" w:firstRow="0" w:lastRow="0" w:firstColumn="0" w:lastColumn="0" w:oddVBand="0" w:evenVBand="0" w:oddHBand="0" w:evenHBand="0" w:firstRowFirstColumn="0" w:firstRowLastColumn="0" w:lastRowFirstColumn="0" w:lastRowLastColumn="0"/>
+            </w:pPr>
+            <w:r>
+              <w:rPr>
+                <w:b/>
+                <w:bCs/>
+              </w:rPr>
+              <w:t>Visibilidad de Texto:</w:t>
+            </w:r>
+            <w:r>
+              <w:t> Cambié el color de la fuente en los campos de entrada de un blanco fijo a una variable dinámica. Ahora, el texto será oscuro en modo claro y claro en modo oscuro automáticamente.</w:t>
+            </w:r>
+          </w:p>
+          <w:p>
+            <w:pPr>
+              <w:numPr>
+                <w:ilvl w:val="0"/>
+                <w:numId w:val="25"/>
+              </w:numPr>
+              <w:cnfStyle w:val="000000000000" w:firstRow="0" w:lastRow="0" w:firstColumn="0" w:lastColumn="0" w:oddVBand="0" w:evenVBand="0" w:oddHBand="0" w:evenHBand="0" w:firstRowFirstColumn="0" w:firstRowLastColumn="0" w:lastRowFirstColumn="0" w:lastRowLastColumn="0"/>
+            </w:pPr>
+            <w:r>
+              <w:rPr>
+                <w:b/>
+                <w:bCs/>
+              </w:rPr>
+              <w:t>Fondos de Entrada:</w:t>
+            </w:r>
+            <w:r>
+              <w:t> También ajusté el fondo de los cuadros de texto para que tengan un contraste suave y elegante según el tema seleccionado.</w:t>
+            </w:r>
+          </w:p>
+          <w:p>
+            <w:pPr>
+              <w:cnfStyle w:val="000000000000" w:firstRow="0" w:lastRow="0" w:firstColumn="0" w:lastColumn="0" w:oddVBand="0" w:evenVBand="0" w:oddHBand="0" w:evenHBand="0" w:firstRowFirstColumn="0" w:firstRowLastColumn="0" w:lastRowFirstColumn="0" w:lastRowLastColumn="0"/>
+            </w:pPr>
+            <w:r>
+              <w:lastRenderedPageBreak/>
+              <w:t>Por favor, refresca la página en tu navegador (</w:t>
+            </w:r>
+            <w:proofErr w:type="spellStart"/>
+            <w:r>
+              <w:t>Ctrl</w:t>
+            </w:r>
+            <w:proofErr w:type="spellEnd"/>
+            <w:r>
+              <w:t xml:space="preserve"> + R o F5) y verifica cómo se ve ahora.</w:t>
+            </w:r>
+          </w:p>
+          <w:p>
+            <w:pPr>
+              <w:cnfStyle w:val="000000000000" w:firstRow="0" w:lastRow="0" w:firstColumn="0" w:lastColumn="0" w:oddVBand="0" w:evenVBand="0" w:oddHBand="0" w:evenHBand="0" w:firstRowFirstColumn="0" w:firstRowLastColumn="0" w:lastRowFirstColumn="0" w:lastRowLastColumn="0"/>
+            </w:pPr>
+            <w:r>
+              <w:t>Si todo está en orden, ya estamos listos para la </w:t>
+            </w:r>
+            <w:r>
+              <w:rPr>
+                <w:b/>
+                <w:bCs/>
+              </w:rPr>
+              <w:t>Fase 4: Sincronizar con GitHub</w:t>
+            </w:r>
+            <w:r>
+              <w:t xml:space="preserve">. ¿Procedemos con los comandos de </w:t>
+            </w:r>
+            <w:proofErr w:type="spellStart"/>
+            <w:r>
+              <w:t>Git</w:t>
+            </w:r>
+            <w:proofErr w:type="spellEnd"/>
+            <w:r>
+              <w:t>?</w:t>
+            </w:r>
+          </w:p>
+          <w:p>
+            <w:pPr>
+              <w:cnfStyle w:val="000000000000" w:firstRow="0" w:lastRow="0" w:firstColumn="0" w:lastColumn="0" w:oddVBand="0" w:evenVBand="0" w:oddHBand="0" w:evenHBand="0" w:firstRowFirstColumn="0" w:firstRowLastColumn="0" w:lastRowFirstColumn="0" w:lastRowLastColumn="0"/>
+            </w:pPr>
+            <w:bookmarkStart w:id="0" w:name="_GoBack"/>
+            <w:bookmarkEnd w:id="0"/>
           </w:p>
         </w:tc>
       </w:tr>
@@ -6294,6 +6861,119 @@
     </w:lvl>
   </w:abstractNum>
   <w:abstractNum w:abstractNumId="11" w15:restartNumberingAfterBreak="0">
+    <w:nsid w:val="4B0C4AB8"/>
+    <w:multiLevelType w:val="multilevel"/>
+    <w:tmpl w:val="53787B20"/>
+    <w:lvl w:ilvl="0">
+      <w:start w:val="1"/>
+      <w:numFmt w:val="decimal"/>
+      <w:lvlText w:val="%1."/>
+      <w:lvlJc w:val="left"/>
+      <w:pPr>
+        <w:tabs>
+          <w:tab w:val="num" w:pos="720"/>
+        </w:tabs>
+        <w:ind w:left="720" w:hanging="360"/>
+      </w:pPr>
+    </w:lvl>
+    <w:lvl w:ilvl="1" w:tentative="1">
+      <w:start w:val="1"/>
+      <w:numFmt w:val="decimal"/>
+      <w:lvlText w:val="%2."/>
+      <w:lvlJc w:val="left"/>
+      <w:pPr>
+        <w:tabs>
+          <w:tab w:val="num" w:pos="1440"/>
+        </w:tabs>
+        <w:ind w:left="1440" w:hanging="360"/>
+      </w:pPr>
+    </w:lvl>
+    <w:lvl w:ilvl="2" w:tentative="1">
+      <w:start w:val="1"/>
+      <w:numFmt w:val="decimal"/>
+      <w:lvlText w:val="%3."/>
+      <w:lvlJc w:val="left"/>
+      <w:pPr>
+        <w:tabs>
+          <w:tab w:val="num" w:pos="2160"/>
+        </w:tabs>
+        <w:ind w:left="2160" w:hanging="360"/>
+      </w:pPr>
+    </w:lvl>
+    <w:lvl w:ilvl="3" w:tentative="1">
+      <w:start w:val="1"/>
+      <w:numFmt w:val="decimal"/>
+      <w:lvlText w:val="%4."/>
+      <w:lvlJc w:val="left"/>
+      <w:pPr>
+        <w:tabs>
+          <w:tab w:val="num" w:pos="2880"/>
+        </w:tabs>
+        <w:ind w:left="2880" w:hanging="360"/>
+      </w:pPr>
+    </w:lvl>
+    <w:lvl w:ilvl="4" w:tentative="1">
+      <w:start w:val="1"/>
+      <w:numFmt w:val="decimal"/>
+      <w:lvlText w:val="%5."/>
+      <w:lvlJc w:val="left"/>
+      <w:pPr>
+        <w:tabs>
+          <w:tab w:val="num" w:pos="3600"/>
+        </w:tabs>
+        <w:ind w:left="3600" w:hanging="360"/>
+      </w:pPr>
+    </w:lvl>
+    <w:lvl w:ilvl="5" w:tentative="1">
+      <w:start w:val="1"/>
+      <w:numFmt w:val="decimal"/>
+      <w:lvlText w:val="%6."/>
+      <w:lvlJc w:val="left"/>
+      <w:pPr>
+        <w:tabs>
+          <w:tab w:val="num" w:pos="4320"/>
+        </w:tabs>
+        <w:ind w:left="4320" w:hanging="360"/>
+      </w:pPr>
+    </w:lvl>
+    <w:lvl w:ilvl="6" w:tentative="1">
+      <w:start w:val="1"/>
+      <w:numFmt w:val="decimal"/>
+      <w:lvlText w:val="%7."/>
+      <w:lvlJc w:val="left"/>
+      <w:pPr>
+        <w:tabs>
+          <w:tab w:val="num" w:pos="5040"/>
+        </w:tabs>
+        <w:ind w:left="5040" w:hanging="360"/>
+      </w:pPr>
+    </w:lvl>
+    <w:lvl w:ilvl="7" w:tentative="1">
+      <w:start w:val="1"/>
+      <w:numFmt w:val="decimal"/>
+      <w:lvlText w:val="%8."/>
+      <w:lvlJc w:val="left"/>
+      <w:pPr>
+        <w:tabs>
+          <w:tab w:val="num" w:pos="5760"/>
+        </w:tabs>
+        <w:ind w:left="5760" w:hanging="360"/>
+      </w:pPr>
+    </w:lvl>
+    <w:lvl w:ilvl="8" w:tentative="1">
+      <w:start w:val="1"/>
+      <w:numFmt w:val="decimal"/>
+      <w:lvlText w:val="%9."/>
+      <w:lvlJc w:val="left"/>
+      <w:pPr>
+        <w:tabs>
+          <w:tab w:val="num" w:pos="6480"/>
+        </w:tabs>
+        <w:ind w:left="6480" w:hanging="360"/>
+      </w:pPr>
+    </w:lvl>
+  </w:abstractNum>
+  <w:abstractNum w:abstractNumId="12" w15:restartNumberingAfterBreak="0">
     <w:nsid w:val="4E6C37E0"/>
     <w:multiLevelType w:val="multilevel"/>
     <w:tmpl w:val="7EBA1ECE"/>
@@ -6442,7 +7122,7 @@
       </w:rPr>
     </w:lvl>
   </w:abstractNum>
-  <w:abstractNum w:abstractNumId="12" w15:restartNumberingAfterBreak="0">
+  <w:abstractNum w:abstractNumId="13" w15:restartNumberingAfterBreak="0">
     <w:nsid w:val="50E70267"/>
     <w:multiLevelType w:val="multilevel"/>
     <w:tmpl w:val="C276993E"/>
@@ -6555,7 +7235,7 @@
       </w:pPr>
     </w:lvl>
   </w:abstractNum>
-  <w:abstractNum w:abstractNumId="13" w15:restartNumberingAfterBreak="0">
+  <w:abstractNum w:abstractNumId="14" w15:restartNumberingAfterBreak="0">
     <w:nsid w:val="525D7035"/>
     <w:multiLevelType w:val="multilevel"/>
     <w:tmpl w:val="BF4C4764"/>
@@ -6668,7 +7348,7 @@
       </w:pPr>
     </w:lvl>
   </w:abstractNum>
-  <w:abstractNum w:abstractNumId="14" w15:restartNumberingAfterBreak="0">
+  <w:abstractNum w:abstractNumId="15" w15:restartNumberingAfterBreak="0">
     <w:nsid w:val="58AE590B"/>
     <w:multiLevelType w:val="multilevel"/>
     <w:tmpl w:val="A594C366"/>
@@ -6785,7 +7465,7 @@
       </w:pPr>
     </w:lvl>
   </w:abstractNum>
-  <w:abstractNum w:abstractNumId="15" w15:restartNumberingAfterBreak="0">
+  <w:abstractNum w:abstractNumId="16" w15:restartNumberingAfterBreak="0">
     <w:nsid w:val="58C305FC"/>
     <w:multiLevelType w:val="multilevel"/>
     <w:tmpl w:val="8564D16C"/>
@@ -6898,7 +7578,7 @@
       </w:pPr>
     </w:lvl>
   </w:abstractNum>
-  <w:abstractNum w:abstractNumId="16" w15:restartNumberingAfterBreak="0">
+  <w:abstractNum w:abstractNumId="17" w15:restartNumberingAfterBreak="0">
     <w:nsid w:val="5C20721C"/>
     <w:multiLevelType w:val="multilevel"/>
     <w:tmpl w:val="F3A48638"/>
@@ -7047,7 +7727,7 @@
       </w:rPr>
     </w:lvl>
   </w:abstractNum>
-  <w:abstractNum w:abstractNumId="17" w15:restartNumberingAfterBreak="0">
+  <w:abstractNum w:abstractNumId="18" w15:restartNumberingAfterBreak="0">
     <w:nsid w:val="64C6550E"/>
     <w:multiLevelType w:val="multilevel"/>
     <w:tmpl w:val="A4B64600"/>
@@ -7164,7 +7844,7 @@
       </w:pPr>
     </w:lvl>
   </w:abstractNum>
-  <w:abstractNum w:abstractNumId="18" w15:restartNumberingAfterBreak="0">
+  <w:abstractNum w:abstractNumId="19" w15:restartNumberingAfterBreak="0">
     <w:nsid w:val="64D918EA"/>
     <w:multiLevelType w:val="multilevel"/>
     <w:tmpl w:val="E99A35EE"/>
@@ -7277,7 +7957,7 @@
       </w:pPr>
     </w:lvl>
   </w:abstractNum>
-  <w:abstractNum w:abstractNumId="19" w15:restartNumberingAfterBreak="0">
+  <w:abstractNum w:abstractNumId="20" w15:restartNumberingAfterBreak="0">
     <w:nsid w:val="66C01CC4"/>
     <w:multiLevelType w:val="multilevel"/>
     <w:tmpl w:val="98BAA73C"/>
@@ -7426,7 +8106,269 @@
       </w:rPr>
     </w:lvl>
   </w:abstractNum>
-  <w:abstractNum w:abstractNumId="20" w15:restartNumberingAfterBreak="0">
+  <w:abstractNum w:abstractNumId="21" w15:restartNumberingAfterBreak="0">
+    <w:nsid w:val="70801DA0"/>
+    <w:multiLevelType w:val="multilevel"/>
+    <w:tmpl w:val="8E083F02"/>
+    <w:lvl w:ilvl="0">
+      <w:start w:val="1"/>
+      <w:numFmt w:val="bullet"/>
+      <w:lvlText w:val=""/>
+      <w:lvlJc w:val="left"/>
+      <w:pPr>
+        <w:tabs>
+          <w:tab w:val="num" w:pos="720"/>
+        </w:tabs>
+        <w:ind w:left="720" w:hanging="360"/>
+      </w:pPr>
+      <w:rPr>
+        <w:rFonts w:ascii="Symbol" w:hAnsi="Symbol" w:hint="default"/>
+        <w:sz w:val="20"/>
+      </w:rPr>
+    </w:lvl>
+    <w:lvl w:ilvl="1" w:tentative="1">
+      <w:start w:val="1"/>
+      <w:numFmt w:val="bullet"/>
+      <w:lvlText w:val=""/>
+      <w:lvlJc w:val="left"/>
+      <w:pPr>
+        <w:tabs>
+          <w:tab w:val="num" w:pos="1440"/>
+        </w:tabs>
+        <w:ind w:left="1440" w:hanging="360"/>
+      </w:pPr>
+      <w:rPr>
+        <w:rFonts w:ascii="Symbol" w:hAnsi="Symbol" w:hint="default"/>
+        <w:sz w:val="20"/>
+      </w:rPr>
+    </w:lvl>
+    <w:lvl w:ilvl="2" w:tentative="1">
+      <w:start w:val="1"/>
+      <w:numFmt w:val="bullet"/>
+      <w:lvlText w:val=""/>
+      <w:lvlJc w:val="left"/>
+      <w:pPr>
+        <w:tabs>
+          <w:tab w:val="num" w:pos="2160"/>
+        </w:tabs>
+        <w:ind w:left="2160" w:hanging="360"/>
+      </w:pPr>
+      <w:rPr>
+        <w:rFonts w:ascii="Symbol" w:hAnsi="Symbol" w:hint="default"/>
+        <w:sz w:val="20"/>
+      </w:rPr>
+    </w:lvl>
+    <w:lvl w:ilvl="3" w:tentative="1">
+      <w:start w:val="1"/>
+      <w:numFmt w:val="bullet"/>
+      <w:lvlText w:val=""/>
+      <w:lvlJc w:val="left"/>
+      <w:pPr>
+        <w:tabs>
+          <w:tab w:val="num" w:pos="2880"/>
+        </w:tabs>
+        <w:ind w:left="2880" w:hanging="360"/>
+      </w:pPr>
+      <w:rPr>
+        <w:rFonts w:ascii="Symbol" w:hAnsi="Symbol" w:hint="default"/>
+        <w:sz w:val="20"/>
+      </w:rPr>
+    </w:lvl>
+    <w:lvl w:ilvl="4" w:tentative="1">
+      <w:start w:val="1"/>
+      <w:numFmt w:val="bullet"/>
+      <w:lvlText w:val=""/>
+      <w:lvlJc w:val="left"/>
+      <w:pPr>
+        <w:tabs>
+          <w:tab w:val="num" w:pos="3600"/>
+        </w:tabs>
+        <w:ind w:left="3600" w:hanging="360"/>
+      </w:pPr>
+      <w:rPr>
+        <w:rFonts w:ascii="Symbol" w:hAnsi="Symbol" w:hint="default"/>
+        <w:sz w:val="20"/>
+      </w:rPr>
+    </w:lvl>
+    <w:lvl w:ilvl="5" w:tentative="1">
+      <w:start w:val="1"/>
+      <w:numFmt w:val="bullet"/>
+      <w:lvlText w:val=""/>
+      <w:lvlJc w:val="left"/>
+      <w:pPr>
+        <w:tabs>
+          <w:tab w:val="num" w:pos="4320"/>
+        </w:tabs>
+        <w:ind w:left="4320" w:hanging="360"/>
+      </w:pPr>
+      <w:rPr>
+        <w:rFonts w:ascii="Symbol" w:hAnsi="Symbol" w:hint="default"/>
+        <w:sz w:val="20"/>
+      </w:rPr>
+    </w:lvl>
+    <w:lvl w:ilvl="6" w:tentative="1">
+      <w:start w:val="1"/>
+      <w:numFmt w:val="bullet"/>
+      <w:lvlText w:val=""/>
+      <w:lvlJc w:val="left"/>
+      <w:pPr>
+        <w:tabs>
+          <w:tab w:val="num" w:pos="5040"/>
+        </w:tabs>
+        <w:ind w:left="5040" w:hanging="360"/>
+      </w:pPr>
+      <w:rPr>
+        <w:rFonts w:ascii="Symbol" w:hAnsi="Symbol" w:hint="default"/>
+        <w:sz w:val="20"/>
+      </w:rPr>
+    </w:lvl>
+    <w:lvl w:ilvl="7" w:tentative="1">
+      <w:start w:val="1"/>
+      <w:numFmt w:val="bullet"/>
+      <w:lvlText w:val=""/>
+      <w:lvlJc w:val="left"/>
+      <w:pPr>
+        <w:tabs>
+          <w:tab w:val="num" w:pos="5760"/>
+        </w:tabs>
+        <w:ind w:left="5760" w:hanging="360"/>
+      </w:pPr>
+      <w:rPr>
+        <w:rFonts w:ascii="Symbol" w:hAnsi="Symbol" w:hint="default"/>
+        <w:sz w:val="20"/>
+      </w:rPr>
+    </w:lvl>
+    <w:lvl w:ilvl="8" w:tentative="1">
+      <w:start w:val="1"/>
+      <w:numFmt w:val="bullet"/>
+      <w:lvlText w:val=""/>
+      <w:lvlJc w:val="left"/>
+      <w:pPr>
+        <w:tabs>
+          <w:tab w:val="num" w:pos="6480"/>
+        </w:tabs>
+        <w:ind w:left="6480" w:hanging="360"/>
+      </w:pPr>
+      <w:rPr>
+        <w:rFonts w:ascii="Symbol" w:hAnsi="Symbol" w:hint="default"/>
+        <w:sz w:val="20"/>
+      </w:rPr>
+    </w:lvl>
+  </w:abstractNum>
+  <w:abstractNum w:abstractNumId="22" w15:restartNumberingAfterBreak="0">
+    <w:nsid w:val="73392FCD"/>
+    <w:multiLevelType w:val="multilevel"/>
+    <w:tmpl w:val="EB9ECC0C"/>
+    <w:lvl w:ilvl="0">
+      <w:start w:val="1"/>
+      <w:numFmt w:val="decimal"/>
+      <w:lvlText w:val="%1."/>
+      <w:lvlJc w:val="left"/>
+      <w:pPr>
+        <w:tabs>
+          <w:tab w:val="num" w:pos="720"/>
+        </w:tabs>
+        <w:ind w:left="720" w:hanging="360"/>
+      </w:pPr>
+    </w:lvl>
+    <w:lvl w:ilvl="1" w:tentative="1">
+      <w:start w:val="1"/>
+      <w:numFmt w:val="decimal"/>
+      <w:lvlText w:val="%2."/>
+      <w:lvlJc w:val="left"/>
+      <w:pPr>
+        <w:tabs>
+          <w:tab w:val="num" w:pos="1440"/>
+        </w:tabs>
+        <w:ind w:left="1440" w:hanging="360"/>
+      </w:pPr>
+    </w:lvl>
+    <w:lvl w:ilvl="2" w:tentative="1">
+      <w:start w:val="1"/>
+      <w:numFmt w:val="decimal"/>
+      <w:lvlText w:val="%3."/>
+      <w:lvlJc w:val="left"/>
+      <w:pPr>
+        <w:tabs>
+          <w:tab w:val="num" w:pos="2160"/>
+        </w:tabs>
+        <w:ind w:left="2160" w:hanging="360"/>
+      </w:pPr>
+    </w:lvl>
+    <w:lvl w:ilvl="3" w:tentative="1">
+      <w:start w:val="1"/>
+      <w:numFmt w:val="decimal"/>
+      <w:lvlText w:val="%4."/>
+      <w:lvlJc w:val="left"/>
+      <w:pPr>
+        <w:tabs>
+          <w:tab w:val="num" w:pos="2880"/>
+        </w:tabs>
+        <w:ind w:left="2880" w:hanging="360"/>
+      </w:pPr>
+    </w:lvl>
+    <w:lvl w:ilvl="4" w:tentative="1">
+      <w:start w:val="1"/>
+      <w:numFmt w:val="decimal"/>
+      <w:lvlText w:val="%5."/>
+      <w:lvlJc w:val="left"/>
+      <w:pPr>
+        <w:tabs>
+          <w:tab w:val="num" w:pos="3600"/>
+        </w:tabs>
+        <w:ind w:left="3600" w:hanging="360"/>
+      </w:pPr>
+    </w:lvl>
+    <w:lvl w:ilvl="5" w:tentative="1">
+      <w:start w:val="1"/>
+      <w:numFmt w:val="decimal"/>
+      <w:lvlText w:val="%6."/>
+      <w:lvlJc w:val="left"/>
+      <w:pPr>
+        <w:tabs>
+          <w:tab w:val="num" w:pos="4320"/>
+        </w:tabs>
+        <w:ind w:left="4320" w:hanging="360"/>
+      </w:pPr>
+    </w:lvl>
+    <w:lvl w:ilvl="6" w:tentative="1">
+      <w:start w:val="1"/>
+      <w:numFmt w:val="decimal"/>
+      <w:lvlText w:val="%7."/>
+      <w:lvlJc w:val="left"/>
+      <w:pPr>
+        <w:tabs>
+          <w:tab w:val="num" w:pos="5040"/>
+        </w:tabs>
+        <w:ind w:left="5040" w:hanging="360"/>
+      </w:pPr>
+    </w:lvl>
+    <w:lvl w:ilvl="7" w:tentative="1">
+      <w:start w:val="1"/>
+      <w:numFmt w:val="decimal"/>
+      <w:lvlText w:val="%8."/>
+      <w:lvlJc w:val="left"/>
+      <w:pPr>
+        <w:tabs>
+          <w:tab w:val="num" w:pos="5760"/>
+        </w:tabs>
+        <w:ind w:left="5760" w:hanging="360"/>
+      </w:pPr>
+    </w:lvl>
+    <w:lvl w:ilvl="8" w:tentative="1">
+      <w:start w:val="1"/>
+      <w:numFmt w:val="decimal"/>
+      <w:lvlText w:val="%9."/>
+      <w:lvlJc w:val="left"/>
+      <w:pPr>
+        <w:tabs>
+          <w:tab w:val="num" w:pos="6480"/>
+        </w:tabs>
+        <w:ind w:left="6480" w:hanging="360"/>
+      </w:pPr>
+    </w:lvl>
+  </w:abstractNum>
+  <w:abstractNum w:abstractNumId="23" w15:restartNumberingAfterBreak="0">
     <w:nsid w:val="78D97CE3"/>
     <w:multiLevelType w:val="multilevel"/>
     <w:tmpl w:val="AAF4FD30"/>
@@ -7575,7 +8517,7 @@
       </w:rPr>
     </w:lvl>
   </w:abstractNum>
-  <w:abstractNum w:abstractNumId="21" w15:restartNumberingAfterBreak="0">
+  <w:abstractNum w:abstractNumId="24" w15:restartNumberingAfterBreak="0">
     <w:nsid w:val="7F467DCB"/>
     <w:multiLevelType w:val="multilevel"/>
     <w:tmpl w:val="379A75E6"/>
@@ -7696,13 +8638,13 @@
     <w:abstractNumId w:val="10"/>
   </w:num>
   <w:num w:numId="2">
-    <w:abstractNumId w:val="20"/>
+    <w:abstractNumId w:val="23"/>
   </w:num>
   <w:num w:numId="3">
-    <w:abstractNumId w:val="16"/>
+    <w:abstractNumId w:val="17"/>
   </w:num>
   <w:num w:numId="4">
-    <w:abstractNumId w:val="11"/>
+    <w:abstractNumId w:val="12"/>
   </w:num>
   <w:num w:numId="5">
     <w:abstractNumId w:val="3"/>
@@ -7717,10 +8659,10 @@
     <w:abstractNumId w:val="9"/>
   </w:num>
   <w:num w:numId="9">
-    <w:abstractNumId w:val="18"/>
+    <w:abstractNumId w:val="19"/>
   </w:num>
   <w:num w:numId="10">
-    <w:abstractNumId w:val="19"/>
+    <w:abstractNumId w:val="20"/>
   </w:num>
   <w:num w:numId="11">
     <w:abstractNumId w:val="8"/>
@@ -7738,25 +8680,34 @@
     <w:abstractNumId w:val="4"/>
   </w:num>
   <w:num w:numId="16">
-    <w:abstractNumId w:val="12"/>
+    <w:abstractNumId w:val="13"/>
   </w:num>
   <w:num w:numId="17">
     <w:abstractNumId w:val="7"/>
   </w:num>
   <w:num w:numId="18">
+    <w:abstractNumId w:val="15"/>
+  </w:num>
+  <w:num w:numId="19">
     <w:abstractNumId w:val="14"/>
   </w:num>
-  <w:num w:numId="19">
-    <w:abstractNumId w:val="13"/>
-  </w:num>
   <w:num w:numId="20">
-    <w:abstractNumId w:val="15"/>
+    <w:abstractNumId w:val="16"/>
   </w:num>
   <w:num w:numId="21">
-    <w:abstractNumId w:val="17"/>
+    <w:abstractNumId w:val="18"/>
   </w:num>
   <w:num w:numId="22">
+    <w:abstractNumId w:val="24"/>
+  </w:num>
+  <w:num w:numId="23">
+    <w:abstractNumId w:val="11"/>
+  </w:num>
+  <w:num w:numId="24">
     <w:abstractNumId w:val="21"/>
+  </w:num>
+  <w:num w:numId="25">
+    <w:abstractNumId w:val="22"/>
   </w:num>
 </w:numbering>
 </file>

</xml_diff>

<commit_message>
v3.0.0 - Respaldo estable de la versión móvil (Dolar BCV) impecable y listo para usar.
</commit_message>
<xml_diff>
--- a/Documentación/Bitacora de implementación.docx
+++ b/Documentación/Bitacora de implementación.docx
@@ -5414,6 +5414,1022 @@
             <w:pPr>
               <w:cnfStyle w:val="000000000000" w:firstRow="0" w:lastRow="0" w:firstColumn="0" w:lastColumn="0" w:oddVBand="0" w:evenVBand="0" w:oddHBand="0" w:evenHBand="0" w:firstRowFirstColumn="0" w:firstRowLastColumn="0" w:lastRowFirstColumn="0" w:lastRowLastColumn="0"/>
             </w:pPr>
+          </w:p>
+        </w:tc>
+      </w:tr>
+      <w:tr>
+        <w:trPr>
+          <w:cnfStyle w:val="000000100000" w:firstRow="0" w:lastRow="0" w:firstColumn="0" w:lastColumn="0" w:oddVBand="0" w:evenVBand="0" w:oddHBand="1" w:evenHBand="0" w:firstRowFirstColumn="0" w:firstRowLastColumn="0" w:lastRowFirstColumn="0" w:lastRowLastColumn="0"/>
+        </w:trPr>
+        <w:tc>
+          <w:tcPr>
+            <w:cnfStyle w:val="001000000000" w:firstRow="0" w:lastRow="0" w:firstColumn="1" w:lastColumn="0" w:oddVBand="0" w:evenVBand="0" w:oddHBand="0" w:evenHBand="0" w:firstRowFirstColumn="0" w:firstRowLastColumn="0" w:lastRowFirstColumn="0" w:lastRowLastColumn="0"/>
+            <w:tcW w:w="1056" w:type="dxa"/>
+          </w:tcPr>
+          <w:p>
+            <w:pPr>
+              <w:rPr>
+                <w:i w:val="0"/>
+                <w:iCs w:val="0"/>
+              </w:rPr>
+            </w:pPr>
+            <w:r>
+              <w:rPr>
+                <w:i w:val="0"/>
+                <w:iCs w:val="0"/>
+              </w:rPr>
+              <w:lastRenderedPageBreak/>
+              <w:t>6/4/2026</w:t>
+            </w:r>
+          </w:p>
+        </w:tc>
+        <w:tc>
+          <w:tcPr>
+            <w:tcW w:w="9619" w:type="dxa"/>
+          </w:tcPr>
+          <w:p>
+            <w:pPr>
+              <w:cnfStyle w:val="000000100000" w:firstRow="0" w:lastRow="0" w:firstColumn="0" w:lastColumn="0" w:oddVBand="0" w:evenVBand="0" w:oddHBand="1" w:evenHBand="0" w:firstRowFirstColumn="0" w:firstRowLastColumn="0" w:lastRowFirstColumn="0" w:lastRowLastColumn="0"/>
+            </w:pPr>
+            <w:r>
+              <w:t>Un último cambio: en el modo claro, el degradado de los títulos "Calculadora de Mercado", "Total a pagar" e "</w:t>
+            </w:r>
+            <w:proofErr w:type="spellStart"/>
+            <w:r>
+              <w:t>Items</w:t>
+            </w:r>
+            <w:proofErr w:type="spellEnd"/>
+            <w:r>
+              <w:t xml:space="preserve"> pendientes" no se aprecia </w:t>
+            </w:r>
+            <w:proofErr w:type="gramStart"/>
+            <w:r>
+              <w:t>bien</w:t>
+            </w:r>
+            <w:proofErr w:type="gramEnd"/>
+            <w:r>
+              <w:t xml:space="preserve"> sino que desmejora la visibilidad del título. Sería </w:t>
+            </w:r>
+            <w:proofErr w:type="spellStart"/>
+            <w:r>
+              <w:t>prefericle</w:t>
+            </w:r>
+            <w:proofErr w:type="spellEnd"/>
+            <w:r>
+              <w:t xml:space="preserve"> quitar ese degrado o desvanecimiento del texto en esos títulos en modo claro.</w:t>
+            </w:r>
+          </w:p>
+          <w:p>
+            <w:pPr>
+              <w:cnfStyle w:val="000000100000" w:firstRow="0" w:lastRow="0" w:firstColumn="0" w:lastColumn="0" w:oddVBand="0" w:evenVBand="0" w:oddHBand="1" w:evenHBand="0" w:firstRowFirstColumn="0" w:firstRowLastColumn="0" w:lastRowFirstColumn="0" w:lastRowLastColumn="0"/>
+            </w:pPr>
+          </w:p>
+        </w:tc>
+      </w:tr>
+      <w:tr>
+        <w:tc>
+          <w:tcPr>
+            <w:cnfStyle w:val="001000000000" w:firstRow="0" w:lastRow="0" w:firstColumn="1" w:lastColumn="0" w:oddVBand="0" w:evenVBand="0" w:oddHBand="0" w:evenHBand="0" w:firstRowFirstColumn="0" w:firstRowLastColumn="0" w:lastRowFirstColumn="0" w:lastRowLastColumn="0"/>
+            <w:tcW w:w="1056" w:type="dxa"/>
+          </w:tcPr>
+          <w:p>
+            <w:pPr>
+              <w:rPr>
+                <w:i w:val="0"/>
+                <w:iCs w:val="0"/>
+              </w:rPr>
+            </w:pPr>
+          </w:p>
+        </w:tc>
+        <w:tc>
+          <w:tcPr>
+            <w:tcW w:w="9619" w:type="dxa"/>
+          </w:tcPr>
+          <w:p>
+            <w:pPr>
+              <w:cnfStyle w:val="000000000000" w:firstRow="0" w:lastRow="0" w:firstColumn="0" w:lastColumn="0" w:oddVBand="0" w:evenVBand="0" w:oddHBand="0" w:evenHBand="0" w:firstRowFirstColumn="0" w:firstRowLastColumn="0" w:lastRowFirstColumn="0" w:lastRowLastColumn="0"/>
+            </w:pPr>
+            <w:r>
+              <w:t>He corregido el diseño de los títulos para el modo claro. Ahora, en lugar de usar un degradado que dificultaba la lectura en fondos claros, los títulos utilizan un color sólido y nítido (</w:t>
+            </w:r>
+            <w:proofErr w:type="spellStart"/>
+            <w:r>
+              <w:t>var</w:t>
+            </w:r>
+            <w:proofErr w:type="spellEnd"/>
+            <w:r>
+              <w:t>(--</w:t>
+            </w:r>
+            <w:proofErr w:type="spellStart"/>
+            <w:r>
+              <w:t>text-main</w:t>
+            </w:r>
+            <w:proofErr w:type="spellEnd"/>
+            <w:r>
+              <w:t>)). El efecto de degradado se mantiene únicamente en el modo oscuro, donde luce mucho mejor sobre el fondo verde esmeralda.</w:t>
+            </w:r>
+          </w:p>
+          <w:p>
+            <w:pPr>
+              <w:cnfStyle w:val="000000000000" w:firstRow="0" w:lastRow="0" w:firstColumn="0" w:lastColumn="0" w:oddVBand="0" w:evenVBand="0" w:oddHBand="0" w:evenHBand="0" w:firstRowFirstColumn="0" w:firstRowLastColumn="0" w:lastRowFirstColumn="0" w:lastRowLastColumn="0"/>
+            </w:pPr>
+            <w:r>
+              <w:t>Resumen de cambios finales en la interfaz:</w:t>
+            </w:r>
+          </w:p>
+          <w:p>
+            <w:pPr>
+              <w:numPr>
+                <w:ilvl w:val="0"/>
+                <w:numId w:val="26"/>
+              </w:numPr>
+              <w:cnfStyle w:val="000000000000" w:firstRow="0" w:lastRow="0" w:firstColumn="0" w:lastColumn="0" w:oddVBand="0" w:evenVBand="0" w:oddHBand="0" w:evenHBand="0" w:firstRowFirstColumn="0" w:firstRowLastColumn="0" w:lastRowFirstColumn="0" w:lastRowLastColumn="0"/>
+            </w:pPr>
+            <w:r>
+              <w:rPr>
+                <w:b/>
+                <w:bCs/>
+              </w:rPr>
+              <w:t>Títulos:</w:t>
+            </w:r>
+            <w:r>
+              <w:t> Ahora son 100% legibles en modo claro (sin degradado/desvanecimiento).</w:t>
+            </w:r>
+          </w:p>
+          <w:p>
+            <w:pPr>
+              <w:numPr>
+                <w:ilvl w:val="0"/>
+                <w:numId w:val="26"/>
+              </w:numPr>
+              <w:cnfStyle w:val="000000000000" w:firstRow="0" w:lastRow="0" w:firstColumn="0" w:lastColumn="0" w:oddVBand="0" w:evenVBand="0" w:oddHBand="0" w:evenHBand="0" w:firstRowFirstColumn="0" w:firstRowLastColumn="0" w:lastRowFirstColumn="0" w:lastRowLastColumn="0"/>
+            </w:pPr>
+            <w:r>
+              <w:rPr>
+                <w:b/>
+                <w:bCs/>
+              </w:rPr>
+              <w:t>Modo Claro:</w:t>
+            </w:r>
+            <w:r>
+              <w:t> Optimizado con fondos de entrada y contraste de texto adecuados.</w:t>
+            </w:r>
+          </w:p>
+          <w:p>
+            <w:pPr>
+              <w:numPr>
+                <w:ilvl w:val="0"/>
+                <w:numId w:val="26"/>
+              </w:numPr>
+              <w:cnfStyle w:val="000000000000" w:firstRow="0" w:lastRow="0" w:firstColumn="0" w:lastColumn="0" w:oddVBand="0" w:evenVBand="0" w:oddHBand="0" w:evenHBand="0" w:firstRowFirstColumn="0" w:firstRowLastColumn="0" w:lastRowFirstColumn="0" w:lastRowLastColumn="0"/>
+            </w:pPr>
+            <w:r>
+              <w:rPr>
+                <w:b/>
+                <w:bCs/>
+              </w:rPr>
+              <w:t>Identidad:</w:t>
+            </w:r>
+            <w:r>
+              <w:t> El título "</w:t>
+            </w:r>
+            <w:proofErr w:type="spellStart"/>
+            <w:r>
+              <w:t>Dolar</w:t>
+            </w:r>
+            <w:proofErr w:type="spellEnd"/>
+            <w:r>
+              <w:t xml:space="preserve"> BCV Premium" ya preside la aplicación.</w:t>
+            </w:r>
+          </w:p>
+          <w:p>
+            <w:pPr>
+              <w:cnfStyle w:val="000000000000" w:firstRow="0" w:lastRow="0" w:firstColumn="0" w:lastColumn="0" w:oddVBand="0" w:evenVBand="0" w:oddHBand="0" w:evenHBand="0" w:firstRowFirstColumn="0" w:firstRowLastColumn="0" w:lastRowFirstColumn="0" w:lastRowLastColumn="0"/>
+            </w:pPr>
+            <w:r>
+              <w:t xml:space="preserve">¿Cómo lo ves ahora? Si ya estás conforme, podemos proceder con estos comandos finales de </w:t>
+            </w:r>
+            <w:proofErr w:type="spellStart"/>
+            <w:r>
+              <w:t>Git</w:t>
+            </w:r>
+            <w:proofErr w:type="spellEnd"/>
+            <w:r>
+              <w:t xml:space="preserve"> para publicar tu nueva versión 2.0:</w:t>
+            </w:r>
+          </w:p>
+          <w:p>
+            <w:pPr>
+              <w:cnfStyle w:val="000000000000" w:firstRow="0" w:lastRow="0" w:firstColumn="0" w:lastColumn="0" w:oddVBand="0" w:evenVBand="0" w:oddHBand="0" w:evenHBand="0" w:firstRowFirstColumn="0" w:firstRowLastColumn="0" w:lastRowFirstColumn="0" w:lastRowLastColumn="0"/>
+            </w:pPr>
+          </w:p>
+          <w:p>
+            <w:pPr>
+              <w:cnfStyle w:val="000000000000" w:firstRow="0" w:lastRow="0" w:firstColumn="0" w:lastColumn="0" w:oddVBand="0" w:evenVBand="0" w:oddHBand="0" w:evenHBand="0" w:firstRowFirstColumn="0" w:firstRowLastColumn="0" w:lastRowFirstColumn="0" w:lastRowLastColumn="0"/>
+            </w:pPr>
+            <w:proofErr w:type="spellStart"/>
+            <w:r>
+              <w:t>git</w:t>
+            </w:r>
+            <w:proofErr w:type="spellEnd"/>
+            <w:r>
+              <w:t xml:space="preserve"> </w:t>
+            </w:r>
+            <w:proofErr w:type="spellStart"/>
+            <w:proofErr w:type="gramStart"/>
+            <w:r>
+              <w:t>add</w:t>
+            </w:r>
+            <w:proofErr w:type="spellEnd"/>
+            <w:r>
+              <w:t xml:space="preserve"> .</w:t>
+            </w:r>
+            <w:proofErr w:type="gramEnd"/>
+          </w:p>
+          <w:p>
+            <w:pPr>
+              <w:cnfStyle w:val="000000000000" w:firstRow="0" w:lastRow="0" w:firstColumn="0" w:lastColumn="0" w:oddVBand="0" w:evenVBand="0" w:oddHBand="0" w:evenHBand="0" w:firstRowFirstColumn="0" w:firstRowLastColumn="0" w:lastRowFirstColumn="0" w:lastRowLastColumn="0"/>
+            </w:pPr>
+            <w:proofErr w:type="spellStart"/>
+            <w:r>
+              <w:t>git</w:t>
+            </w:r>
+            <w:proofErr w:type="spellEnd"/>
+            <w:r>
+              <w:t xml:space="preserve"> </w:t>
+            </w:r>
+            <w:proofErr w:type="spellStart"/>
+            <w:r>
+              <w:t>commit</w:t>
+            </w:r>
+            <w:proofErr w:type="spellEnd"/>
+            <w:r>
+              <w:t xml:space="preserve"> -m "v2.0.0: Versión Web Premium con selector de tasas, modo oscuro y diseño mejorado"</w:t>
+            </w:r>
+          </w:p>
+          <w:p>
+            <w:pPr>
+              <w:cnfStyle w:val="000000000000" w:firstRow="0" w:lastRow="0" w:firstColumn="0" w:lastColumn="0" w:oddVBand="0" w:evenVBand="0" w:oddHBand="0" w:evenHBand="0" w:firstRowFirstColumn="0" w:firstRowLastColumn="0" w:lastRowFirstColumn="0" w:lastRowLastColumn="0"/>
+            </w:pPr>
+            <w:proofErr w:type="spellStart"/>
+            <w:r>
+              <w:t>git</w:t>
+            </w:r>
+            <w:proofErr w:type="spellEnd"/>
+            <w:r>
+              <w:t xml:space="preserve"> </w:t>
+            </w:r>
+            <w:proofErr w:type="spellStart"/>
+            <w:r>
+              <w:t>push</w:t>
+            </w:r>
+            <w:proofErr w:type="spellEnd"/>
+            <w:r>
+              <w:t xml:space="preserve"> </w:t>
+            </w:r>
+            <w:proofErr w:type="spellStart"/>
+            <w:r>
+              <w:t>origin</w:t>
+            </w:r>
+            <w:proofErr w:type="spellEnd"/>
+            <w:r>
+              <w:t xml:space="preserve"> </w:t>
+            </w:r>
+            <w:proofErr w:type="spellStart"/>
+            <w:r>
+              <w:t>main</w:t>
+            </w:r>
+            <w:proofErr w:type="spellEnd"/>
+          </w:p>
+          <w:p>
+            <w:pPr>
+              <w:cnfStyle w:val="000000000000" w:firstRow="0" w:lastRow="0" w:firstColumn="0" w:lastColumn="0" w:oddVBand="0" w:evenVBand="0" w:oddHBand="0" w:evenHBand="0" w:firstRowFirstColumn="0" w:firstRowLastColumn="0" w:lastRowFirstColumn="0" w:lastRowLastColumn="0"/>
+            </w:pPr>
+          </w:p>
+          <w:p>
+            <w:pPr>
+              <w:cnfStyle w:val="000000000000" w:firstRow="0" w:lastRow="0" w:firstColumn="0" w:lastColumn="0" w:oddVBand="0" w:evenVBand="0" w:oddHBand="0" w:evenHBand="0" w:firstRowFirstColumn="0" w:firstRowLastColumn="0" w:lastRowFirstColumn="0" w:lastRowLastColumn="0"/>
+            </w:pPr>
+          </w:p>
+        </w:tc>
+      </w:tr>
+      <w:tr>
+        <w:trPr>
+          <w:cnfStyle w:val="000000100000" w:firstRow="0" w:lastRow="0" w:firstColumn="0" w:lastColumn="0" w:oddVBand="0" w:evenVBand="0" w:oddHBand="1" w:evenHBand="0" w:firstRowFirstColumn="0" w:firstRowLastColumn="0" w:lastRowFirstColumn="0" w:lastRowLastColumn="0"/>
+        </w:trPr>
+        <w:tc>
+          <w:tcPr>
+            <w:cnfStyle w:val="001000000000" w:firstRow="0" w:lastRow="0" w:firstColumn="1" w:lastColumn="0" w:oddVBand="0" w:evenVBand="0" w:oddHBand="0" w:evenHBand="0" w:firstRowFirstColumn="0" w:firstRowLastColumn="0" w:lastRowFirstColumn="0" w:lastRowLastColumn="0"/>
+            <w:tcW w:w="1056" w:type="dxa"/>
+          </w:tcPr>
+          <w:p>
+            <w:pPr>
+              <w:rPr>
+                <w:i w:val="0"/>
+                <w:iCs w:val="0"/>
+              </w:rPr>
+            </w:pPr>
+            <w:r>
+              <w:rPr>
+                <w:i w:val="0"/>
+                <w:iCs w:val="0"/>
+              </w:rPr>
+              <w:t>6/4/2026</w:t>
+            </w:r>
+          </w:p>
+        </w:tc>
+        <w:tc>
+          <w:tcPr>
+            <w:tcW w:w="9619" w:type="dxa"/>
+          </w:tcPr>
+          <w:p>
+            <w:pPr>
+              <w:cnfStyle w:val="000000100000" w:firstRow="0" w:lastRow="0" w:firstColumn="0" w:lastColumn="0" w:oddVBand="0" w:evenVBand="0" w:oddHBand="1" w:evenHBand="0" w:firstRowFirstColumn="0" w:firstRowLastColumn="0" w:lastRowFirstColumn="0" w:lastRowLastColumn="0"/>
+            </w:pPr>
+            <w:r>
+              <w:t xml:space="preserve">He lanzado el comando </w:t>
+            </w:r>
+            <w:proofErr w:type="spellStart"/>
+            <w:r>
+              <w:t>git</w:t>
+            </w:r>
+            <w:proofErr w:type="spellEnd"/>
+            <w:r>
+              <w:t xml:space="preserve"> </w:t>
+            </w:r>
+            <w:proofErr w:type="spellStart"/>
+            <w:r>
+              <w:t>push</w:t>
+            </w:r>
+            <w:proofErr w:type="spellEnd"/>
+            <w:r>
+              <w:t xml:space="preserve"> </w:t>
+            </w:r>
+            <w:proofErr w:type="spellStart"/>
+            <w:r>
+              <w:t>origin</w:t>
+            </w:r>
+            <w:proofErr w:type="spellEnd"/>
+            <w:r>
+              <w:t xml:space="preserve"> </w:t>
+            </w:r>
+            <w:proofErr w:type="spellStart"/>
+            <w:r>
+              <w:t>main</w:t>
+            </w:r>
+            <w:proofErr w:type="spellEnd"/>
+            <w:r>
+              <w:t xml:space="preserve">, pero no se observó cambios en la aplicación publicada en </w:t>
+            </w:r>
+            <w:proofErr w:type="spellStart"/>
+            <w:r>
+              <w:t>github</w:t>
+            </w:r>
+            <w:proofErr w:type="spellEnd"/>
+            <w:r>
+              <w:t xml:space="preserve"> </w:t>
+            </w:r>
+            <w:proofErr w:type="spellStart"/>
+            <w:r>
+              <w:t>pages</w:t>
+            </w:r>
+            <w:proofErr w:type="spellEnd"/>
+            <w:r>
+              <w:t>.</w:t>
+            </w:r>
+            <w:r>
+              <w:br/>
+            </w:r>
+          </w:p>
+          <w:p>
+            <w:pPr>
+              <w:cnfStyle w:val="000000100000" w:firstRow="0" w:lastRow="0" w:firstColumn="0" w:lastColumn="0" w:oddVBand="0" w:evenVBand="0" w:oddHBand="1" w:evenHBand="0" w:firstRowFirstColumn="0" w:firstRowLastColumn="0" w:lastRowFirstColumn="0" w:lastRowLastColumn="0"/>
+            </w:pPr>
+            <w:r>
+              <w:t xml:space="preserve">Un momento señor, en GitHub no deben copiarse los archivos de la carpeta </w:t>
+            </w:r>
+            <w:proofErr w:type="spellStart"/>
+            <w:r>
+              <w:t>dolar_bcv</w:t>
+            </w:r>
+            <w:proofErr w:type="spellEnd"/>
+            <w:r>
+              <w:t>, tampoco deseo que se incluya la carpeta Documentación. ¿Estamos tomando en cuenta esto?</w:t>
+            </w:r>
+          </w:p>
+          <w:p>
+            <w:pPr>
+              <w:cnfStyle w:val="000000100000" w:firstRow="0" w:lastRow="0" w:firstColumn="0" w:lastColumn="0" w:oddVBand="0" w:evenVBand="0" w:oddHBand="1" w:evenHBand="0" w:firstRowFirstColumn="0" w:firstRowLastColumn="0" w:lastRowFirstColumn="0" w:lastRowLastColumn="0"/>
+            </w:pPr>
+          </w:p>
+        </w:tc>
+      </w:tr>
+      <w:tr>
+        <w:tc>
+          <w:tcPr>
+            <w:cnfStyle w:val="001000000000" w:firstRow="0" w:lastRow="0" w:firstColumn="1" w:lastColumn="0" w:oddVBand="0" w:evenVBand="0" w:oddHBand="0" w:evenHBand="0" w:firstRowFirstColumn="0" w:firstRowLastColumn="0" w:lastRowFirstColumn="0" w:lastRowLastColumn="0"/>
+            <w:tcW w:w="1056" w:type="dxa"/>
+          </w:tcPr>
+          <w:p>
+            <w:pPr>
+              <w:rPr>
+                <w:i w:val="0"/>
+                <w:iCs w:val="0"/>
+              </w:rPr>
+            </w:pPr>
+          </w:p>
+        </w:tc>
+        <w:tc>
+          <w:tcPr>
+            <w:tcW w:w="9619" w:type="dxa"/>
+          </w:tcPr>
+          <w:p>
+            <w:pPr>
+              <w:cnfStyle w:val="000000000000" w:firstRow="0" w:lastRow="0" w:firstColumn="0" w:lastColumn="0" w:oddVBand="0" w:evenVBand="0" w:oddHBand="0" w:evenHBand="0" w:firstRowFirstColumn="0" w:firstRowLastColumn="0" w:lastRowFirstColumn="0" w:lastRowLastColumn="0"/>
+            </w:pPr>
+            <w:r>
+              <w:t>¡Totalmente! He tomado medidas inmediatas para corregir eso y asegurar la privacidad de tus carpetas de desarrollo:</w:t>
+            </w:r>
+          </w:p>
+          <w:p>
+            <w:pPr>
+              <w:cnfStyle w:val="000000000000" w:firstRow="0" w:lastRow="0" w:firstColumn="0" w:lastColumn="0" w:oddVBand="0" w:evenVBand="0" w:oddHBand="0" w:evenHBand="0" w:firstRowFirstColumn="0" w:firstRowLastColumn="0" w:lastRowFirstColumn="0" w:lastRowLastColumn="0"/>
+            </w:pPr>
+            <w:r>
+              <w:rPr>
+                <w:rFonts w:ascii="Segoe UI Symbol" w:hAnsi="Segoe UI Symbol" w:cs="Segoe UI Symbol"/>
+              </w:rPr>
+              <w:t>🛡</w:t>
+            </w:r>
+            <w:r>
+              <w:t>️ Lo que acabo de hacer:</w:t>
+            </w:r>
+          </w:p>
+          <w:p>
+            <w:pPr>
+              <w:numPr>
+                <w:ilvl w:val="0"/>
+                <w:numId w:val="27"/>
+              </w:numPr>
+              <w:cnfStyle w:val="000000000000" w:firstRow="0" w:lastRow="0" w:firstColumn="0" w:lastColumn="0" w:oddVBand="0" w:evenVBand="0" w:oddHBand="0" w:evenHBand="0" w:firstRowFirstColumn="0" w:firstRowLastColumn="0" w:lastRowFirstColumn="0" w:lastRowLastColumn="0"/>
+            </w:pPr>
+            <w:r>
+              <w:rPr>
+                <w:b/>
+                <w:bCs/>
+              </w:rPr>
+              <w:t xml:space="preserve">Actualicé </w:t>
+            </w:r>
+            <w:proofErr w:type="spellStart"/>
+            <w:proofErr w:type="gramStart"/>
+            <w:r>
+              <w:rPr>
+                <w:b/>
+                <w:bCs/>
+              </w:rPr>
+              <w:t>el</w:t>
+            </w:r>
+            <w:proofErr w:type="spellEnd"/>
+            <w:r>
+              <w:rPr>
+                <w:b/>
+                <w:bCs/>
+              </w:rPr>
+              <w:t> .</w:t>
+            </w:r>
+            <w:proofErr w:type="spellStart"/>
+            <w:r>
+              <w:rPr>
+                <w:b/>
+                <w:bCs/>
+              </w:rPr>
+              <w:t>gitignore</w:t>
+            </w:r>
+            <w:proofErr w:type="spellEnd"/>
+            <w:proofErr w:type="gramEnd"/>
+            <w:r>
+              <w:rPr>
+                <w:b/>
+                <w:bCs/>
+              </w:rPr>
+              <w:t> en la rama </w:t>
+            </w:r>
+            <w:proofErr w:type="spellStart"/>
+            <w:r>
+              <w:rPr>
+                <w:b/>
+                <w:bCs/>
+              </w:rPr>
+              <w:t>main</w:t>
+            </w:r>
+            <w:proofErr w:type="spellEnd"/>
+            <w:r>
+              <w:rPr>
+                <w:b/>
+                <w:bCs/>
+              </w:rPr>
+              <w:t>:</w:t>
+            </w:r>
+            <w:r>
+              <w:t> Ahora ignora explícitamente las carpetas </w:t>
+            </w:r>
+            <w:proofErr w:type="spellStart"/>
+            <w:r>
+              <w:t>dolar_bcv</w:t>
+            </w:r>
+            <w:proofErr w:type="spellEnd"/>
+            <w:r>
+              <w:t>/ y Documentación/.</w:t>
+            </w:r>
+          </w:p>
+          <w:p>
+            <w:pPr>
+              <w:numPr>
+                <w:ilvl w:val="0"/>
+                <w:numId w:val="27"/>
+              </w:numPr>
+              <w:cnfStyle w:val="000000000000" w:firstRow="0" w:lastRow="0" w:firstColumn="0" w:lastColumn="0" w:oddVBand="0" w:evenVBand="0" w:oddHBand="0" w:evenHBand="0" w:firstRowFirstColumn="0" w:firstRowLastColumn="0" w:lastRowFirstColumn="0" w:lastRowLastColumn="0"/>
+            </w:pPr>
+            <w:r>
+              <w:rPr>
+                <w:b/>
+                <w:bCs/>
+              </w:rPr>
+              <w:t>Sincronización selectiva:</w:t>
+            </w:r>
+            <w:r>
+              <w:t xml:space="preserve"> En lugar de fusionar toda la rama (lo cual habría subido todas las pesadas carpetas de </w:t>
+            </w:r>
+            <w:proofErr w:type="spellStart"/>
+            <w:r>
+              <w:t>Flutter</w:t>
+            </w:r>
+            <w:proofErr w:type="spellEnd"/>
+            <w:r>
+              <w:t>), hice un seguimiento manual (</w:t>
+            </w:r>
+            <w:proofErr w:type="spellStart"/>
+            <w:r>
+              <w:t>checkout</w:t>
+            </w:r>
+            <w:proofErr w:type="spellEnd"/>
+            <w:r>
+              <w:t>) para traer </w:t>
+            </w:r>
+            <w:r>
+              <w:rPr>
+                <w:b/>
+                <w:bCs/>
+              </w:rPr>
+              <w:t>únicamente</w:t>
+            </w:r>
+            <w:r>
+              <w:t> los tres archivos web (index.html, styles.css, script.js) y el README.md.</w:t>
+            </w:r>
+          </w:p>
+          <w:p>
+            <w:pPr>
+              <w:numPr>
+                <w:ilvl w:val="0"/>
+                <w:numId w:val="27"/>
+              </w:numPr>
+              <w:cnfStyle w:val="000000000000" w:firstRow="0" w:lastRow="0" w:firstColumn="0" w:lastColumn="0" w:oddVBand="0" w:evenVBand="0" w:oddHBand="0" w:evenHBand="0" w:firstRowFirstColumn="0" w:firstRowLastColumn="0" w:lastRowFirstColumn="0" w:lastRowLastColumn="0"/>
+            </w:pPr>
+            <w:proofErr w:type="spellStart"/>
+            <w:r>
+              <w:rPr>
+                <w:b/>
+                <w:bCs/>
+              </w:rPr>
+              <w:t>Push</w:t>
+            </w:r>
+            <w:proofErr w:type="spellEnd"/>
+            <w:r>
+              <w:rPr>
+                <w:b/>
+                <w:bCs/>
+              </w:rPr>
+              <w:t xml:space="preserve"> a GitHub:</w:t>
+            </w:r>
+            <w:r>
+              <w:t> Subí estos cambios a la rama </w:t>
+            </w:r>
+            <w:proofErr w:type="spellStart"/>
+            <w:r>
+              <w:t>main</w:t>
+            </w:r>
+            <w:proofErr w:type="spellEnd"/>
+            <w:r>
+              <w:t> de GitHub.</w:t>
+            </w:r>
+          </w:p>
+          <w:p>
+            <w:pPr>
+              <w:cnfStyle w:val="000000000000" w:firstRow="0" w:lastRow="0" w:firstColumn="0" w:lastColumn="0" w:oddVBand="0" w:evenVBand="0" w:oddHBand="0" w:evenHBand="0" w:firstRowFirstColumn="0" w:firstRowLastColumn="0" w:lastRowFirstColumn="0" w:lastRowLastColumn="0"/>
+            </w:pPr>
+            <w:r>
+              <w:rPr>
+                <w:b/>
+                <w:bCs/>
+              </w:rPr>
+              <w:t>Resultado:</w:t>
+            </w:r>
+            <w:r>
+              <w:t> Tu repositorio público en GitHub ahora </w:t>
+            </w:r>
+            <w:r>
+              <w:rPr>
+                <w:b/>
+                <w:bCs/>
+              </w:rPr>
+              <w:t>solo contiene la aplicación web v2.0</w:t>
+            </w:r>
+            <w:r>
+              <w:t> totalmente optimizada, sin rastros de la carpeta </w:t>
+            </w:r>
+            <w:proofErr w:type="spellStart"/>
+            <w:r>
+              <w:t>dolar_bcv</w:t>
+            </w:r>
+            <w:proofErr w:type="spellEnd"/>
+            <w:r>
+              <w:t> ni de tus documentos personales.</w:t>
+            </w:r>
+          </w:p>
+          <w:p>
+            <w:pPr>
+              <w:cnfStyle w:val="000000000000" w:firstRow="0" w:lastRow="0" w:firstColumn="0" w:lastColumn="0" w:oddVBand="0" w:evenVBand="0" w:oddHBand="0" w:evenHBand="0" w:firstRowFirstColumn="0" w:firstRowLastColumn="0" w:lastRowFirstColumn="0" w:lastRowLastColumn="0"/>
+            </w:pPr>
+            <w:r>
+              <w:rPr>
+                <w:rFonts w:ascii="Segoe UI Symbol" w:hAnsi="Segoe UI Symbol" w:cs="Segoe UI Symbol"/>
+              </w:rPr>
+              <w:t>🌐</w:t>
+            </w:r>
+            <w:r>
+              <w:t xml:space="preserve"> Verifica el cambio:</w:t>
+            </w:r>
+          </w:p>
+          <w:p>
+            <w:pPr>
+              <w:cnfStyle w:val="000000000000" w:firstRow="0" w:lastRow="0" w:firstColumn="0" w:lastColumn="0" w:oddVBand="0" w:evenVBand="0" w:oddHBand="0" w:evenHBand="0" w:firstRowFirstColumn="0" w:firstRowLastColumn="0" w:lastRowFirstColumn="0" w:lastRowLastColumn="0"/>
+            </w:pPr>
+            <w:r>
+              <w:t xml:space="preserve">Por favor, espera unos 60 segundos por el despliegue automático y abre: </w:t>
+            </w:r>
+            <w:r>
+              <w:rPr>
+                <w:rFonts w:ascii="Segoe UI Symbol" w:hAnsi="Segoe UI Symbol" w:cs="Segoe UI Symbol"/>
+              </w:rPr>
+              <w:t>👉</w:t>
+            </w:r>
+            <w:r>
+              <w:t> </w:t>
+            </w:r>
+            <w:hyperlink r:id="rId5" w:history="1">
+              <w:r>
+                <w:rPr>
+                  <w:rStyle w:val="Hipervnculo"/>
+                </w:rPr>
+                <w:t>https://h-javier-rivas.github.io/Consultar-dolar-oficial/</w:t>
+              </w:r>
+            </w:hyperlink>
+          </w:p>
+          <w:p>
+            <w:pPr>
+              <w:cnfStyle w:val="000000000000" w:firstRow="0" w:lastRow="0" w:firstColumn="0" w:lastColumn="0" w:oddVBand="0" w:evenVBand="0" w:oddHBand="0" w:evenHBand="0" w:firstRowFirstColumn="0" w:firstRowLastColumn="0" w:lastRowFirstColumn="0" w:lastRowLastColumn="0"/>
+            </w:pPr>
+            <w:r>
+              <w:t>Deberías ver la nueva interfaz con el título "</w:t>
+            </w:r>
+            <w:proofErr w:type="spellStart"/>
+            <w:r>
+              <w:t>Dolar</w:t>
+            </w:r>
+            <w:proofErr w:type="spellEnd"/>
+            <w:r>
+              <w:t xml:space="preserve"> BCV Premium", el selector de tasas y el modo oscuro funcionando.</w:t>
+            </w:r>
+          </w:p>
+          <w:p>
+            <w:pPr>
+              <w:cnfStyle w:val="000000000000" w:firstRow="0" w:lastRow="0" w:firstColumn="0" w:lastColumn="0" w:oddVBand="0" w:evenVBand="0" w:oddHBand="0" w:evenHBand="0" w:firstRowFirstColumn="0" w:firstRowLastColumn="0" w:lastRowFirstColumn="0" w:lastRowLastColumn="0"/>
+            </w:pPr>
+            <w:r>
+              <w:t>¿Todo se ve como esperabas en el enlace publicado?</w:t>
+            </w:r>
+          </w:p>
+          <w:p>
+            <w:pPr>
+              <w:cnfStyle w:val="000000000000" w:firstRow="0" w:lastRow="0" w:firstColumn="0" w:lastColumn="0" w:oddVBand="0" w:evenVBand="0" w:oddHBand="0" w:evenHBand="0" w:firstRowFirstColumn="0" w:firstRowLastColumn="0" w:lastRowFirstColumn="0" w:lastRowLastColumn="0"/>
+            </w:pPr>
+          </w:p>
+        </w:tc>
+      </w:tr>
+      <w:tr>
+        <w:trPr>
+          <w:cnfStyle w:val="000000100000" w:firstRow="0" w:lastRow="0" w:firstColumn="0" w:lastColumn="0" w:oddVBand="0" w:evenVBand="0" w:oddHBand="1" w:evenHBand="0" w:firstRowFirstColumn="0" w:firstRowLastColumn="0" w:lastRowFirstColumn="0" w:lastRowLastColumn="0"/>
+        </w:trPr>
+        <w:tc>
+          <w:tcPr>
+            <w:cnfStyle w:val="001000000000" w:firstRow="0" w:lastRow="0" w:firstColumn="1" w:lastColumn="0" w:oddVBand="0" w:evenVBand="0" w:oddHBand="0" w:evenHBand="0" w:firstRowFirstColumn="0" w:firstRowLastColumn="0" w:lastRowFirstColumn="0" w:lastRowLastColumn="0"/>
+            <w:tcW w:w="1056" w:type="dxa"/>
+          </w:tcPr>
+          <w:p>
+            <w:pPr>
+              <w:rPr>
+                <w:i w:val="0"/>
+                <w:iCs w:val="0"/>
+              </w:rPr>
+            </w:pPr>
+            <w:r>
+              <w:rPr>
+                <w:i w:val="0"/>
+                <w:iCs w:val="0"/>
+              </w:rPr>
+              <w:t>6/4/2026</w:t>
+            </w:r>
+          </w:p>
+        </w:tc>
+        <w:tc>
+          <w:tcPr>
+            <w:tcW w:w="9619" w:type="dxa"/>
+          </w:tcPr>
+          <w:p>
+            <w:pPr>
+              <w:cnfStyle w:val="000000100000" w:firstRow="0" w:lastRow="0" w:firstColumn="0" w:lastColumn="0" w:oddVBand="0" w:evenVBand="0" w:oddHBand="1" w:evenHBand="0" w:firstRowFirstColumn="0" w:firstRowLastColumn="0" w:lastRowFirstColumn="0" w:lastRowLastColumn="0"/>
+            </w:pPr>
+            <w:r>
+              <w:t xml:space="preserve">Ahora sí hubo una actualización y se ve bien en la PC. Pero, si utilizo un navegador (Chrome) desde el celular, cuando </w:t>
+            </w:r>
+            <w:proofErr w:type="spellStart"/>
+            <w:r>
+              <w:t>intento</w:t>
+            </w:r>
+            <w:proofErr w:type="spellEnd"/>
+            <w:r>
+              <w:t xml:space="preserve"> ingresar un monto el cuadro de ingreso de texto hace un zoom gigante y luego no hay forma de hacer que entienda que ya ingresé el monto, es decir, no hay una tecla que funcione </w:t>
+            </w:r>
+            <w:r>
+              <w:lastRenderedPageBreak/>
+              <w:t xml:space="preserve">como </w:t>
+            </w:r>
+            <w:proofErr w:type="spellStart"/>
+            <w:r>
+              <w:t>intro</w:t>
+            </w:r>
+            <w:proofErr w:type="spellEnd"/>
+            <w:r>
+              <w:t xml:space="preserve"> o </w:t>
+            </w:r>
+            <w:proofErr w:type="spellStart"/>
+            <w:r>
+              <w:t>enter</w:t>
+            </w:r>
+            <w:proofErr w:type="spellEnd"/>
+            <w:r>
+              <w:t xml:space="preserve"> en el teclado de celular. Me gustaría que arreglaras estos y que el zoom que se da de forma automática no lo hiciera, por el </w:t>
+            </w:r>
+            <w:proofErr w:type="gramStart"/>
+            <w:r>
+              <w:t>contrario</w:t>
+            </w:r>
+            <w:proofErr w:type="gramEnd"/>
+            <w:r>
+              <w:t xml:space="preserve"> debe mantenerse el tamaño en pantalla de lo desplegado, tal como lo hace la aplicación desarrollada especialmente para instalar en el celular.</w:t>
+            </w:r>
+          </w:p>
+          <w:p>
+            <w:pPr>
+              <w:cnfStyle w:val="000000100000" w:firstRow="0" w:lastRow="0" w:firstColumn="0" w:lastColumn="0" w:oddVBand="0" w:evenVBand="0" w:oddHBand="1" w:evenHBand="0" w:firstRowFirstColumn="0" w:firstRowLastColumn="0" w:lastRowFirstColumn="0" w:lastRowLastColumn="0"/>
+            </w:pPr>
+          </w:p>
+        </w:tc>
+      </w:tr>
+      <w:tr>
+        <w:tc>
+          <w:tcPr>
+            <w:cnfStyle w:val="001000000000" w:firstRow="0" w:lastRow="0" w:firstColumn="1" w:lastColumn="0" w:oddVBand="0" w:evenVBand="0" w:oddHBand="0" w:evenHBand="0" w:firstRowFirstColumn="0" w:firstRowLastColumn="0" w:lastRowFirstColumn="0" w:lastRowLastColumn="0"/>
+            <w:tcW w:w="1056" w:type="dxa"/>
+          </w:tcPr>
+          <w:p>
+            <w:pPr>
+              <w:rPr>
+                <w:i w:val="0"/>
+                <w:iCs w:val="0"/>
+              </w:rPr>
+            </w:pPr>
+          </w:p>
+        </w:tc>
+        <w:tc>
+          <w:tcPr>
+            <w:tcW w:w="9619" w:type="dxa"/>
+          </w:tcPr>
+          <w:p>
+            <w:pPr>
+              <w:cnfStyle w:val="000000000000" w:firstRow="0" w:lastRow="0" w:firstColumn="0" w:lastColumn="0" w:oddVBand="0" w:evenVBand="0" w:oddHBand="0" w:evenHBand="0" w:firstRowFirstColumn="0" w:firstRowLastColumn="0" w:lastRowFirstColumn="0" w:lastRowLastColumn="0"/>
+            </w:pPr>
+            <w:r>
+              <w:t>¡Solucionado! He aplicado una optimización específica para la versión móvil que resuelve ambos problemas:</w:t>
+            </w:r>
+          </w:p>
+          <w:p>
+            <w:pPr>
+              <w:numPr>
+                <w:ilvl w:val="0"/>
+                <w:numId w:val="28"/>
+              </w:numPr>
+              <w:cnfStyle w:val="000000000000" w:firstRow="0" w:lastRow="0" w:firstColumn="0" w:lastColumn="0" w:oddVBand="0" w:evenVBand="0" w:oddHBand="0" w:evenHBand="0" w:firstRowFirstColumn="0" w:firstRowLastColumn="0" w:lastRowFirstColumn="0" w:lastRowLastColumn="0"/>
+            </w:pPr>
+            <w:r>
+              <w:rPr>
+                <w:b/>
+                <w:bCs/>
+              </w:rPr>
+              <w:t>Adiós al Zoom Automático:</w:t>
+            </w:r>
+            <w:r>
+              <w:t> He ajustado el tamaño de la fuente de los campos de entrada a 16px (y un poco más en el monto). Esto le dice a Chrome en Android e iOS que no necesita hacer zoom al enfocar el cuadro, manteniendo la escala de la pantalla tal como en una aplicación nativa.</w:t>
+            </w:r>
+          </w:p>
+          <w:p>
+            <w:pPr>
+              <w:numPr>
+                <w:ilvl w:val="0"/>
+                <w:numId w:val="28"/>
+              </w:numPr>
+              <w:cnfStyle w:val="000000000000" w:firstRow="0" w:lastRow="0" w:firstColumn="0" w:lastColumn="0" w:oddVBand="0" w:evenVBand="0" w:oddHBand="0" w:evenHBand="0" w:firstRowFirstColumn="0" w:firstRowLastColumn="0" w:lastRowFirstColumn="0" w:lastRowLastColumn="0"/>
+            </w:pPr>
+            <w:r>
+              <w:rPr>
+                <w:b/>
+                <w:bCs/>
+              </w:rPr>
+              <w:t>Soporte para tecla "</w:t>
+            </w:r>
+            <w:proofErr w:type="spellStart"/>
+            <w:r>
+              <w:rPr>
+                <w:b/>
+                <w:bCs/>
+              </w:rPr>
+              <w:t>Enter</w:t>
+            </w:r>
+            <w:proofErr w:type="spellEnd"/>
+            <w:r>
+              <w:rPr>
+                <w:b/>
+                <w:bCs/>
+              </w:rPr>
+              <w:t>/Ir":</w:t>
+            </w:r>
+            <w:r>
+              <w:t> Envolví la calculadora en un formulario y asigné una función especial (</w:t>
+            </w:r>
+            <w:proofErr w:type="spellStart"/>
+            <w:r>
+              <w:t>handleConverterSubmit</w:t>
+            </w:r>
+            <w:proofErr w:type="spellEnd"/>
+            <w:r>
+              <w:t>). Ahora, cuando escribas un monto desde el celular y presiones la tecla "</w:t>
+            </w:r>
+            <w:proofErr w:type="spellStart"/>
+            <w:r>
+              <w:t>Enter</w:t>
+            </w:r>
+            <w:proofErr w:type="spellEnd"/>
+            <w:r>
+              <w:t>" o "Ir" en tu teclado, la aplicación lo entenderá como un clic en el botón </w:t>
+            </w:r>
+            <w:r>
+              <w:rPr>
+                <w:b/>
+                <w:bCs/>
+              </w:rPr>
+              <w:t>"+"</w:t>
+            </w:r>
+            <w:r>
+              <w:t>, sumando el producto al total automáticamente.</w:t>
+            </w:r>
+          </w:p>
+          <w:p>
+            <w:pPr>
+              <w:numPr>
+                <w:ilvl w:val="0"/>
+                <w:numId w:val="28"/>
+              </w:numPr>
+              <w:cnfStyle w:val="000000000000" w:firstRow="0" w:lastRow="0" w:firstColumn="0" w:lastColumn="0" w:oddVBand="0" w:evenVBand="0" w:oddHBand="0" w:evenHBand="0" w:firstRowFirstColumn="0" w:firstRowLastColumn="0" w:lastRowFirstColumn="0" w:lastRowLastColumn="0"/>
+            </w:pPr>
+            <w:r>
+              <w:rPr>
+                <w:b/>
+                <w:bCs/>
+              </w:rPr>
+              <w:t>Teclado Optimizado:</w:t>
+            </w:r>
+            <w:r>
+              <w:t> Agregué </w:t>
+            </w:r>
+            <w:proofErr w:type="spellStart"/>
+            <w:r>
+              <w:t>inputmode</w:t>
+            </w:r>
+            <w:proofErr w:type="spellEnd"/>
+            <w:r>
+              <w:t>="decimal" al cuadro de monto, lo que forzará a tu celular a mostrar el teclado numérico con punto/coma desde el primer momento.</w:t>
+            </w:r>
+          </w:p>
+          <w:p>
+            <w:pPr>
+              <w:cnfStyle w:val="000000000000" w:firstRow="0" w:lastRow="0" w:firstColumn="0" w:lastColumn="0" w:oddVBand="0" w:evenVBand="0" w:oddHBand="0" w:evenHBand="0" w:firstRowFirstColumn="0" w:firstRowLastColumn="0" w:lastRowFirstColumn="0" w:lastRowLastColumn="0"/>
+            </w:pPr>
+            <w:r>
+              <w:rPr>
+                <w:b/>
+                <w:bCs/>
+              </w:rPr>
+              <w:t>¿Cómo probar los cambios?</w:t>
+            </w:r>
+            <w:r>
+              <w:t> He subido la actualización a GitHub (v2.0.1). Por favor:</w:t>
+            </w:r>
+          </w:p>
+          <w:p>
+            <w:pPr>
+              <w:numPr>
+                <w:ilvl w:val="0"/>
+                <w:numId w:val="29"/>
+              </w:numPr>
+              <w:cnfStyle w:val="000000000000" w:firstRow="0" w:lastRow="0" w:firstColumn="0" w:lastColumn="0" w:oddVBand="0" w:evenVBand="0" w:oddHBand="0" w:evenHBand="0" w:firstRowFirstColumn="0" w:firstRowLastColumn="0" w:lastRowFirstColumn="0" w:lastRowLastColumn="0"/>
+            </w:pPr>
+            <w:r>
+              <w:rPr>
+                <w:b/>
+                <w:bCs/>
+              </w:rPr>
+              <w:t>Cierra la pestaña</w:t>
+            </w:r>
+            <w:r>
+              <w:t> en el navegador de tu celular.</w:t>
+            </w:r>
+          </w:p>
+          <w:p>
+            <w:pPr>
+              <w:numPr>
+                <w:ilvl w:val="0"/>
+                <w:numId w:val="29"/>
+              </w:numPr>
+              <w:cnfStyle w:val="000000000000" w:firstRow="0" w:lastRow="0" w:firstColumn="0" w:lastColumn="0" w:oddVBand="0" w:evenVBand="0" w:oddHBand="0" w:evenHBand="0" w:firstRowFirstColumn="0" w:firstRowLastColumn="0" w:lastRowFirstColumn="0" w:lastRowLastColumn="0"/>
+            </w:pPr>
+            <w:r>
+              <w:rPr>
+                <w:b/>
+                <w:bCs/>
+              </w:rPr>
+              <w:t>Borra la caché</w:t>
+            </w:r>
+            <w:r>
+              <w:t xml:space="preserve"> o simplemente abre el enlace de nuevo en una pestaña nueva para asegurar que cargue la versión nueva: </w:t>
+            </w:r>
+            <w:r>
+              <w:rPr>
+                <w:rFonts w:ascii="Segoe UI Symbol" w:hAnsi="Segoe UI Symbol" w:cs="Segoe UI Symbol"/>
+              </w:rPr>
+              <w:t>👉</w:t>
+            </w:r>
+            <w:r>
+              <w:t> </w:t>
+            </w:r>
+            <w:hyperlink r:id="rId6" w:history="1">
+              <w:r>
+                <w:rPr>
+                  <w:rStyle w:val="Hipervnculo"/>
+                </w:rPr>
+                <w:t>https://h-javier-rivas.github.io/Consultar-dolar-oficial/</w:t>
+              </w:r>
+            </w:hyperlink>
+          </w:p>
+          <w:p>
+            <w:pPr>
+              <w:cnfStyle w:val="000000000000" w:firstRow="0" w:lastRow="0" w:firstColumn="0" w:lastColumn="0" w:oddVBand="0" w:evenVBand="0" w:oddHBand="0" w:evenHBand="0" w:firstRowFirstColumn="0" w:firstRowLastColumn="0" w:lastRowFirstColumn="0" w:lastRowLastColumn="0"/>
+            </w:pPr>
+            <w:r>
+              <w:t xml:space="preserve">¿Puedes confirmarme si ya no te hace el zoom y si la tecla </w:t>
+            </w:r>
+            <w:proofErr w:type="spellStart"/>
+            <w:r>
+              <w:t>Enter</w:t>
+            </w:r>
+            <w:proofErr w:type="spellEnd"/>
+            <w:r>
+              <w:t xml:space="preserve"> ahora suma los productos?</w:t>
+            </w:r>
+          </w:p>
+          <w:p>
+            <w:pPr>
+              <w:cnfStyle w:val="000000000000" w:firstRow="0" w:lastRow="0" w:firstColumn="0" w:lastColumn="0" w:oddVBand="0" w:evenVBand="0" w:oddHBand="0" w:evenHBand="0" w:firstRowFirstColumn="0" w:firstRowLastColumn="0" w:lastRowFirstColumn="0" w:lastRowLastColumn="0"/>
+            </w:pPr>
             <w:bookmarkStart w:id="0" w:name="_GoBack"/>
             <w:bookmarkEnd w:id="0"/>
           </w:p>
@@ -5434,6 +6450,268 @@
 <file path=word/numbering.xml><?xml version="1.0" encoding="utf-8"?>
 <w:numbering xmlns:wpc="http://schemas.microsoft.com/office/word/2010/wordprocessingCanvas" xmlns:cx="http://schemas.microsoft.com/office/drawing/2014/chartex" xmlns:mc="http://schemas.openxmlformats.org/markup-compatibility/2006" xmlns:o="urn:schemas-microsoft-com:office:office" xmlns:r="http://schemas.openxmlformats.org/officeDocument/2006/relationships" xmlns:m="http://schemas.openxmlformats.org/officeDocument/2006/math" xmlns:v="urn:schemas-microsoft-com:vml" xmlns:wp14="http://schemas.microsoft.com/office/word/2010/wordprocessingDrawing" xmlns:wp="http://schemas.openxmlformats.org/drawingml/2006/wordprocessingDrawing" xmlns:w10="urn:schemas-microsoft-com:office:word" xmlns:w="http://schemas.openxmlformats.org/wordprocessingml/2006/main" xmlns:w14="http://schemas.microsoft.com/office/word/2010/wordml" xmlns:w15="http://schemas.microsoft.com/office/word/2012/wordml" xmlns:w16se="http://schemas.microsoft.com/office/word/2015/wordml/symex" xmlns:wpg="http://schemas.microsoft.com/office/word/2010/wordprocessingGroup" xmlns:wpi="http://schemas.microsoft.com/office/word/2010/wordprocessingInk" xmlns:wne="http://schemas.microsoft.com/office/word/2006/wordml" xmlns:wps="http://schemas.microsoft.com/office/word/2010/wordprocessingShape" mc:Ignorable="w14 w15 w16se wp14">
   <w:abstractNum w:abstractNumId="0" w15:restartNumberingAfterBreak="0">
+    <w:nsid w:val="079936C1"/>
+    <w:multiLevelType w:val="multilevel"/>
+    <w:tmpl w:val="78108CE8"/>
+    <w:lvl w:ilvl="0">
+      <w:start w:val="1"/>
+      <w:numFmt w:val="bullet"/>
+      <w:lvlText w:val=""/>
+      <w:lvlJc w:val="left"/>
+      <w:pPr>
+        <w:tabs>
+          <w:tab w:val="num" w:pos="720"/>
+        </w:tabs>
+        <w:ind w:left="720" w:hanging="360"/>
+      </w:pPr>
+      <w:rPr>
+        <w:rFonts w:ascii="Symbol" w:hAnsi="Symbol" w:hint="default"/>
+        <w:sz w:val="20"/>
+      </w:rPr>
+    </w:lvl>
+    <w:lvl w:ilvl="1" w:tentative="1">
+      <w:start w:val="1"/>
+      <w:numFmt w:val="bullet"/>
+      <w:lvlText w:val=""/>
+      <w:lvlJc w:val="left"/>
+      <w:pPr>
+        <w:tabs>
+          <w:tab w:val="num" w:pos="1440"/>
+        </w:tabs>
+        <w:ind w:left="1440" w:hanging="360"/>
+      </w:pPr>
+      <w:rPr>
+        <w:rFonts w:ascii="Symbol" w:hAnsi="Symbol" w:hint="default"/>
+        <w:sz w:val="20"/>
+      </w:rPr>
+    </w:lvl>
+    <w:lvl w:ilvl="2" w:tentative="1">
+      <w:start w:val="1"/>
+      <w:numFmt w:val="bullet"/>
+      <w:lvlText w:val=""/>
+      <w:lvlJc w:val="left"/>
+      <w:pPr>
+        <w:tabs>
+          <w:tab w:val="num" w:pos="2160"/>
+        </w:tabs>
+        <w:ind w:left="2160" w:hanging="360"/>
+      </w:pPr>
+      <w:rPr>
+        <w:rFonts w:ascii="Symbol" w:hAnsi="Symbol" w:hint="default"/>
+        <w:sz w:val="20"/>
+      </w:rPr>
+    </w:lvl>
+    <w:lvl w:ilvl="3" w:tentative="1">
+      <w:start w:val="1"/>
+      <w:numFmt w:val="bullet"/>
+      <w:lvlText w:val=""/>
+      <w:lvlJc w:val="left"/>
+      <w:pPr>
+        <w:tabs>
+          <w:tab w:val="num" w:pos="2880"/>
+        </w:tabs>
+        <w:ind w:left="2880" w:hanging="360"/>
+      </w:pPr>
+      <w:rPr>
+        <w:rFonts w:ascii="Symbol" w:hAnsi="Symbol" w:hint="default"/>
+        <w:sz w:val="20"/>
+      </w:rPr>
+    </w:lvl>
+    <w:lvl w:ilvl="4" w:tentative="1">
+      <w:start w:val="1"/>
+      <w:numFmt w:val="bullet"/>
+      <w:lvlText w:val=""/>
+      <w:lvlJc w:val="left"/>
+      <w:pPr>
+        <w:tabs>
+          <w:tab w:val="num" w:pos="3600"/>
+        </w:tabs>
+        <w:ind w:left="3600" w:hanging="360"/>
+      </w:pPr>
+      <w:rPr>
+        <w:rFonts w:ascii="Symbol" w:hAnsi="Symbol" w:hint="default"/>
+        <w:sz w:val="20"/>
+      </w:rPr>
+    </w:lvl>
+    <w:lvl w:ilvl="5" w:tentative="1">
+      <w:start w:val="1"/>
+      <w:numFmt w:val="bullet"/>
+      <w:lvlText w:val=""/>
+      <w:lvlJc w:val="left"/>
+      <w:pPr>
+        <w:tabs>
+          <w:tab w:val="num" w:pos="4320"/>
+        </w:tabs>
+        <w:ind w:left="4320" w:hanging="360"/>
+      </w:pPr>
+      <w:rPr>
+        <w:rFonts w:ascii="Symbol" w:hAnsi="Symbol" w:hint="default"/>
+        <w:sz w:val="20"/>
+      </w:rPr>
+    </w:lvl>
+    <w:lvl w:ilvl="6" w:tentative="1">
+      <w:start w:val="1"/>
+      <w:numFmt w:val="bullet"/>
+      <w:lvlText w:val=""/>
+      <w:lvlJc w:val="left"/>
+      <w:pPr>
+        <w:tabs>
+          <w:tab w:val="num" w:pos="5040"/>
+        </w:tabs>
+        <w:ind w:left="5040" w:hanging="360"/>
+      </w:pPr>
+      <w:rPr>
+        <w:rFonts w:ascii="Symbol" w:hAnsi="Symbol" w:hint="default"/>
+        <w:sz w:val="20"/>
+      </w:rPr>
+    </w:lvl>
+    <w:lvl w:ilvl="7" w:tentative="1">
+      <w:start w:val="1"/>
+      <w:numFmt w:val="bullet"/>
+      <w:lvlText w:val=""/>
+      <w:lvlJc w:val="left"/>
+      <w:pPr>
+        <w:tabs>
+          <w:tab w:val="num" w:pos="5760"/>
+        </w:tabs>
+        <w:ind w:left="5760" w:hanging="360"/>
+      </w:pPr>
+      <w:rPr>
+        <w:rFonts w:ascii="Symbol" w:hAnsi="Symbol" w:hint="default"/>
+        <w:sz w:val="20"/>
+      </w:rPr>
+    </w:lvl>
+    <w:lvl w:ilvl="8" w:tentative="1">
+      <w:start w:val="1"/>
+      <w:numFmt w:val="bullet"/>
+      <w:lvlText w:val=""/>
+      <w:lvlJc w:val="left"/>
+      <w:pPr>
+        <w:tabs>
+          <w:tab w:val="num" w:pos="6480"/>
+        </w:tabs>
+        <w:ind w:left="6480" w:hanging="360"/>
+      </w:pPr>
+      <w:rPr>
+        <w:rFonts w:ascii="Symbol" w:hAnsi="Symbol" w:hint="default"/>
+        <w:sz w:val="20"/>
+      </w:rPr>
+    </w:lvl>
+  </w:abstractNum>
+  <w:abstractNum w:abstractNumId="1" w15:restartNumberingAfterBreak="0">
+    <w:nsid w:val="0BCA7797"/>
+    <w:multiLevelType w:val="multilevel"/>
+    <w:tmpl w:val="3F2CDF4E"/>
+    <w:lvl w:ilvl="0">
+      <w:start w:val="1"/>
+      <w:numFmt w:val="decimal"/>
+      <w:lvlText w:val="%1."/>
+      <w:lvlJc w:val="left"/>
+      <w:pPr>
+        <w:tabs>
+          <w:tab w:val="num" w:pos="720"/>
+        </w:tabs>
+        <w:ind w:left="720" w:hanging="360"/>
+      </w:pPr>
+    </w:lvl>
+    <w:lvl w:ilvl="1" w:tentative="1">
+      <w:start w:val="1"/>
+      <w:numFmt w:val="decimal"/>
+      <w:lvlText w:val="%2."/>
+      <w:lvlJc w:val="left"/>
+      <w:pPr>
+        <w:tabs>
+          <w:tab w:val="num" w:pos="1440"/>
+        </w:tabs>
+        <w:ind w:left="1440" w:hanging="360"/>
+      </w:pPr>
+    </w:lvl>
+    <w:lvl w:ilvl="2" w:tentative="1">
+      <w:start w:val="1"/>
+      <w:numFmt w:val="decimal"/>
+      <w:lvlText w:val="%3."/>
+      <w:lvlJc w:val="left"/>
+      <w:pPr>
+        <w:tabs>
+          <w:tab w:val="num" w:pos="2160"/>
+        </w:tabs>
+        <w:ind w:left="2160" w:hanging="360"/>
+      </w:pPr>
+    </w:lvl>
+    <w:lvl w:ilvl="3" w:tentative="1">
+      <w:start w:val="1"/>
+      <w:numFmt w:val="decimal"/>
+      <w:lvlText w:val="%4."/>
+      <w:lvlJc w:val="left"/>
+      <w:pPr>
+        <w:tabs>
+          <w:tab w:val="num" w:pos="2880"/>
+        </w:tabs>
+        <w:ind w:left="2880" w:hanging="360"/>
+      </w:pPr>
+    </w:lvl>
+    <w:lvl w:ilvl="4" w:tentative="1">
+      <w:start w:val="1"/>
+      <w:numFmt w:val="decimal"/>
+      <w:lvlText w:val="%5."/>
+      <w:lvlJc w:val="left"/>
+      <w:pPr>
+        <w:tabs>
+          <w:tab w:val="num" w:pos="3600"/>
+        </w:tabs>
+        <w:ind w:left="3600" w:hanging="360"/>
+      </w:pPr>
+    </w:lvl>
+    <w:lvl w:ilvl="5" w:tentative="1">
+      <w:start w:val="1"/>
+      <w:numFmt w:val="decimal"/>
+      <w:lvlText w:val="%6."/>
+      <w:lvlJc w:val="left"/>
+      <w:pPr>
+        <w:tabs>
+          <w:tab w:val="num" w:pos="4320"/>
+        </w:tabs>
+        <w:ind w:left="4320" w:hanging="360"/>
+      </w:pPr>
+    </w:lvl>
+    <w:lvl w:ilvl="6" w:tentative="1">
+      <w:start w:val="1"/>
+      <w:numFmt w:val="decimal"/>
+      <w:lvlText w:val="%7."/>
+      <w:lvlJc w:val="left"/>
+      <w:pPr>
+        <w:tabs>
+          <w:tab w:val="num" w:pos="5040"/>
+        </w:tabs>
+        <w:ind w:left="5040" w:hanging="360"/>
+      </w:pPr>
+    </w:lvl>
+    <w:lvl w:ilvl="7" w:tentative="1">
+      <w:start w:val="1"/>
+      <w:numFmt w:val="decimal"/>
+      <w:lvlText w:val="%8."/>
+      <w:lvlJc w:val="left"/>
+      <w:pPr>
+        <w:tabs>
+          <w:tab w:val="num" w:pos="5760"/>
+        </w:tabs>
+        <w:ind w:left="5760" w:hanging="360"/>
+      </w:pPr>
+    </w:lvl>
+    <w:lvl w:ilvl="8" w:tentative="1">
+      <w:start w:val="1"/>
+      <w:numFmt w:val="decimal"/>
+      <w:lvlText w:val="%9."/>
+      <w:lvlJc w:val="left"/>
+      <w:pPr>
+        <w:tabs>
+          <w:tab w:val="num" w:pos="6480"/>
+        </w:tabs>
+        <w:ind w:left="6480" w:hanging="360"/>
+      </w:pPr>
+    </w:lvl>
+  </w:abstractNum>
+  <w:abstractNum w:abstractNumId="2" w15:restartNumberingAfterBreak="0">
     <w:nsid w:val="0D3D1822"/>
     <w:multiLevelType w:val="multilevel"/>
     <w:tmpl w:val="1D6043DA"/>
@@ -5546,7 +6824,120 @@
       </w:pPr>
     </w:lvl>
   </w:abstractNum>
-  <w:abstractNum w:abstractNumId="1" w15:restartNumberingAfterBreak="0">
+  <w:abstractNum w:abstractNumId="3" w15:restartNumberingAfterBreak="0">
+    <w:nsid w:val="10A42701"/>
+    <w:multiLevelType w:val="multilevel"/>
+    <w:tmpl w:val="F536D208"/>
+    <w:lvl w:ilvl="0">
+      <w:start w:val="1"/>
+      <w:numFmt w:val="decimal"/>
+      <w:lvlText w:val="%1."/>
+      <w:lvlJc w:val="left"/>
+      <w:pPr>
+        <w:tabs>
+          <w:tab w:val="num" w:pos="720"/>
+        </w:tabs>
+        <w:ind w:left="720" w:hanging="360"/>
+      </w:pPr>
+    </w:lvl>
+    <w:lvl w:ilvl="1" w:tentative="1">
+      <w:start w:val="1"/>
+      <w:numFmt w:val="decimal"/>
+      <w:lvlText w:val="%2."/>
+      <w:lvlJc w:val="left"/>
+      <w:pPr>
+        <w:tabs>
+          <w:tab w:val="num" w:pos="1440"/>
+        </w:tabs>
+        <w:ind w:left="1440" w:hanging="360"/>
+      </w:pPr>
+    </w:lvl>
+    <w:lvl w:ilvl="2" w:tentative="1">
+      <w:start w:val="1"/>
+      <w:numFmt w:val="decimal"/>
+      <w:lvlText w:val="%3."/>
+      <w:lvlJc w:val="left"/>
+      <w:pPr>
+        <w:tabs>
+          <w:tab w:val="num" w:pos="2160"/>
+        </w:tabs>
+        <w:ind w:left="2160" w:hanging="360"/>
+      </w:pPr>
+    </w:lvl>
+    <w:lvl w:ilvl="3" w:tentative="1">
+      <w:start w:val="1"/>
+      <w:numFmt w:val="decimal"/>
+      <w:lvlText w:val="%4."/>
+      <w:lvlJc w:val="left"/>
+      <w:pPr>
+        <w:tabs>
+          <w:tab w:val="num" w:pos="2880"/>
+        </w:tabs>
+        <w:ind w:left="2880" w:hanging="360"/>
+      </w:pPr>
+    </w:lvl>
+    <w:lvl w:ilvl="4" w:tentative="1">
+      <w:start w:val="1"/>
+      <w:numFmt w:val="decimal"/>
+      <w:lvlText w:val="%5."/>
+      <w:lvlJc w:val="left"/>
+      <w:pPr>
+        <w:tabs>
+          <w:tab w:val="num" w:pos="3600"/>
+        </w:tabs>
+        <w:ind w:left="3600" w:hanging="360"/>
+      </w:pPr>
+    </w:lvl>
+    <w:lvl w:ilvl="5" w:tentative="1">
+      <w:start w:val="1"/>
+      <w:numFmt w:val="decimal"/>
+      <w:lvlText w:val="%6."/>
+      <w:lvlJc w:val="left"/>
+      <w:pPr>
+        <w:tabs>
+          <w:tab w:val="num" w:pos="4320"/>
+        </w:tabs>
+        <w:ind w:left="4320" w:hanging="360"/>
+      </w:pPr>
+    </w:lvl>
+    <w:lvl w:ilvl="6" w:tentative="1">
+      <w:start w:val="1"/>
+      <w:numFmt w:val="decimal"/>
+      <w:lvlText w:val="%7."/>
+      <w:lvlJc w:val="left"/>
+      <w:pPr>
+        <w:tabs>
+          <w:tab w:val="num" w:pos="5040"/>
+        </w:tabs>
+        <w:ind w:left="5040" w:hanging="360"/>
+      </w:pPr>
+    </w:lvl>
+    <w:lvl w:ilvl="7" w:tentative="1">
+      <w:start w:val="1"/>
+      <w:numFmt w:val="decimal"/>
+      <w:lvlText w:val="%8."/>
+      <w:lvlJc w:val="left"/>
+      <w:pPr>
+        <w:tabs>
+          <w:tab w:val="num" w:pos="5760"/>
+        </w:tabs>
+        <w:ind w:left="5760" w:hanging="360"/>
+      </w:pPr>
+    </w:lvl>
+    <w:lvl w:ilvl="8" w:tentative="1">
+      <w:start w:val="1"/>
+      <w:numFmt w:val="decimal"/>
+      <w:lvlText w:val="%9."/>
+      <w:lvlJc w:val="left"/>
+      <w:pPr>
+        <w:tabs>
+          <w:tab w:val="num" w:pos="6480"/>
+        </w:tabs>
+        <w:ind w:left="6480" w:hanging="360"/>
+      </w:pPr>
+    </w:lvl>
+  </w:abstractNum>
+  <w:abstractNum w:abstractNumId="4" w15:restartNumberingAfterBreak="0">
     <w:nsid w:val="17025939"/>
     <w:multiLevelType w:val="multilevel"/>
     <w:tmpl w:val="6C7689EA"/>
@@ -5659,7 +7050,7 @@
       </w:pPr>
     </w:lvl>
   </w:abstractNum>
-  <w:abstractNum w:abstractNumId="2" w15:restartNumberingAfterBreak="0">
+  <w:abstractNum w:abstractNumId="5" w15:restartNumberingAfterBreak="0">
     <w:nsid w:val="1D01721F"/>
     <w:multiLevelType w:val="multilevel"/>
     <w:tmpl w:val="9FB8C032"/>
@@ -5772,7 +7163,7 @@
       </w:pPr>
     </w:lvl>
   </w:abstractNum>
-  <w:abstractNum w:abstractNumId="3" w15:restartNumberingAfterBreak="0">
+  <w:abstractNum w:abstractNumId="6" w15:restartNumberingAfterBreak="0">
     <w:nsid w:val="22096F7E"/>
     <w:multiLevelType w:val="multilevel"/>
     <w:tmpl w:val="18B8C312"/>
@@ -5921,7 +7312,7 @@
       </w:rPr>
     </w:lvl>
   </w:abstractNum>
-  <w:abstractNum w:abstractNumId="4" w15:restartNumberingAfterBreak="0">
+  <w:abstractNum w:abstractNumId="7" w15:restartNumberingAfterBreak="0">
     <w:nsid w:val="245B7EEC"/>
     <w:multiLevelType w:val="multilevel"/>
     <w:tmpl w:val="DAF2208C"/>
@@ -6034,7 +7425,120 @@
       </w:pPr>
     </w:lvl>
   </w:abstractNum>
-  <w:abstractNum w:abstractNumId="5" w15:restartNumberingAfterBreak="0">
+  <w:abstractNum w:abstractNumId="8" w15:restartNumberingAfterBreak="0">
+    <w:nsid w:val="27785FCF"/>
+    <w:multiLevelType w:val="multilevel"/>
+    <w:tmpl w:val="BD608926"/>
+    <w:lvl w:ilvl="0">
+      <w:start w:val="1"/>
+      <w:numFmt w:val="decimal"/>
+      <w:lvlText w:val="%1."/>
+      <w:lvlJc w:val="left"/>
+      <w:pPr>
+        <w:tabs>
+          <w:tab w:val="num" w:pos="720"/>
+        </w:tabs>
+        <w:ind w:left="720" w:hanging="360"/>
+      </w:pPr>
+    </w:lvl>
+    <w:lvl w:ilvl="1" w:tentative="1">
+      <w:start w:val="1"/>
+      <w:numFmt w:val="decimal"/>
+      <w:lvlText w:val="%2."/>
+      <w:lvlJc w:val="left"/>
+      <w:pPr>
+        <w:tabs>
+          <w:tab w:val="num" w:pos="1440"/>
+        </w:tabs>
+        <w:ind w:left="1440" w:hanging="360"/>
+      </w:pPr>
+    </w:lvl>
+    <w:lvl w:ilvl="2" w:tentative="1">
+      <w:start w:val="1"/>
+      <w:numFmt w:val="decimal"/>
+      <w:lvlText w:val="%3."/>
+      <w:lvlJc w:val="left"/>
+      <w:pPr>
+        <w:tabs>
+          <w:tab w:val="num" w:pos="2160"/>
+        </w:tabs>
+        <w:ind w:left="2160" w:hanging="360"/>
+      </w:pPr>
+    </w:lvl>
+    <w:lvl w:ilvl="3" w:tentative="1">
+      <w:start w:val="1"/>
+      <w:numFmt w:val="decimal"/>
+      <w:lvlText w:val="%4."/>
+      <w:lvlJc w:val="left"/>
+      <w:pPr>
+        <w:tabs>
+          <w:tab w:val="num" w:pos="2880"/>
+        </w:tabs>
+        <w:ind w:left="2880" w:hanging="360"/>
+      </w:pPr>
+    </w:lvl>
+    <w:lvl w:ilvl="4" w:tentative="1">
+      <w:start w:val="1"/>
+      <w:numFmt w:val="decimal"/>
+      <w:lvlText w:val="%5."/>
+      <w:lvlJc w:val="left"/>
+      <w:pPr>
+        <w:tabs>
+          <w:tab w:val="num" w:pos="3600"/>
+        </w:tabs>
+        <w:ind w:left="3600" w:hanging="360"/>
+      </w:pPr>
+    </w:lvl>
+    <w:lvl w:ilvl="5" w:tentative="1">
+      <w:start w:val="1"/>
+      <w:numFmt w:val="decimal"/>
+      <w:lvlText w:val="%6."/>
+      <w:lvlJc w:val="left"/>
+      <w:pPr>
+        <w:tabs>
+          <w:tab w:val="num" w:pos="4320"/>
+        </w:tabs>
+        <w:ind w:left="4320" w:hanging="360"/>
+      </w:pPr>
+    </w:lvl>
+    <w:lvl w:ilvl="6" w:tentative="1">
+      <w:start w:val="1"/>
+      <w:numFmt w:val="decimal"/>
+      <w:lvlText w:val="%7."/>
+      <w:lvlJc w:val="left"/>
+      <w:pPr>
+        <w:tabs>
+          <w:tab w:val="num" w:pos="5040"/>
+        </w:tabs>
+        <w:ind w:left="5040" w:hanging="360"/>
+      </w:pPr>
+    </w:lvl>
+    <w:lvl w:ilvl="7" w:tentative="1">
+      <w:start w:val="1"/>
+      <w:numFmt w:val="decimal"/>
+      <w:lvlText w:val="%8."/>
+      <w:lvlJc w:val="left"/>
+      <w:pPr>
+        <w:tabs>
+          <w:tab w:val="num" w:pos="5760"/>
+        </w:tabs>
+        <w:ind w:left="5760" w:hanging="360"/>
+      </w:pPr>
+    </w:lvl>
+    <w:lvl w:ilvl="8" w:tentative="1">
+      <w:start w:val="1"/>
+      <w:numFmt w:val="decimal"/>
+      <w:lvlText w:val="%9."/>
+      <w:lvlJc w:val="left"/>
+      <w:pPr>
+        <w:tabs>
+          <w:tab w:val="num" w:pos="6480"/>
+        </w:tabs>
+        <w:ind w:left="6480" w:hanging="360"/>
+      </w:pPr>
+    </w:lvl>
+  </w:abstractNum>
+  <w:abstractNum w:abstractNumId="9" w15:restartNumberingAfterBreak="0">
     <w:nsid w:val="292C272E"/>
     <w:multiLevelType w:val="multilevel"/>
     <w:tmpl w:val="83E44F12"/>
@@ -6183,7 +7687,7 @@
       </w:rPr>
     </w:lvl>
   </w:abstractNum>
-  <w:abstractNum w:abstractNumId="6" w15:restartNumberingAfterBreak="0">
+  <w:abstractNum w:abstractNumId="10" w15:restartNumberingAfterBreak="0">
     <w:nsid w:val="350821E4"/>
     <w:multiLevelType w:val="multilevel"/>
     <w:tmpl w:val="BD5888E6"/>
@@ -6300,7 +7804,7 @@
       </w:pPr>
     </w:lvl>
   </w:abstractNum>
-  <w:abstractNum w:abstractNumId="7" w15:restartNumberingAfterBreak="0">
+  <w:abstractNum w:abstractNumId="11" w15:restartNumberingAfterBreak="0">
     <w:nsid w:val="37D233E1"/>
     <w:multiLevelType w:val="multilevel"/>
     <w:tmpl w:val="ED8E260A"/>
@@ -6449,7 +7953,7 @@
       </w:rPr>
     </w:lvl>
   </w:abstractNum>
-  <w:abstractNum w:abstractNumId="8" w15:restartNumberingAfterBreak="0">
+  <w:abstractNum w:abstractNumId="12" w15:restartNumberingAfterBreak="0">
     <w:nsid w:val="3989770A"/>
     <w:multiLevelType w:val="multilevel"/>
     <w:tmpl w:val="F30EFD68"/>
@@ -6562,7 +8066,7 @@
       </w:pPr>
     </w:lvl>
   </w:abstractNum>
-  <w:abstractNum w:abstractNumId="9" w15:restartNumberingAfterBreak="0">
+  <w:abstractNum w:abstractNumId="13" w15:restartNumberingAfterBreak="0">
     <w:nsid w:val="3B38203B"/>
     <w:multiLevelType w:val="multilevel"/>
     <w:tmpl w:val="45E0F530"/>
@@ -6711,7 +8215,7 @@
       </w:rPr>
     </w:lvl>
   </w:abstractNum>
-  <w:abstractNum w:abstractNumId="10" w15:restartNumberingAfterBreak="0">
+  <w:abstractNum w:abstractNumId="14" w15:restartNumberingAfterBreak="0">
     <w:nsid w:val="442039F0"/>
     <w:multiLevelType w:val="multilevel"/>
     <w:tmpl w:val="D946E1E0"/>
@@ -6860,7 +8364,7 @@
       </w:rPr>
     </w:lvl>
   </w:abstractNum>
-  <w:abstractNum w:abstractNumId="11" w15:restartNumberingAfterBreak="0">
+  <w:abstractNum w:abstractNumId="15" w15:restartNumberingAfterBreak="0">
     <w:nsid w:val="4B0C4AB8"/>
     <w:multiLevelType w:val="multilevel"/>
     <w:tmpl w:val="53787B20"/>
@@ -6973,7 +8477,7 @@
       </w:pPr>
     </w:lvl>
   </w:abstractNum>
-  <w:abstractNum w:abstractNumId="12" w15:restartNumberingAfterBreak="0">
+  <w:abstractNum w:abstractNumId="16" w15:restartNumberingAfterBreak="0">
     <w:nsid w:val="4E6C37E0"/>
     <w:multiLevelType w:val="multilevel"/>
     <w:tmpl w:val="7EBA1ECE"/>
@@ -7122,7 +8626,7 @@
       </w:rPr>
     </w:lvl>
   </w:abstractNum>
-  <w:abstractNum w:abstractNumId="13" w15:restartNumberingAfterBreak="0">
+  <w:abstractNum w:abstractNumId="17" w15:restartNumberingAfterBreak="0">
     <w:nsid w:val="50E70267"/>
     <w:multiLevelType w:val="multilevel"/>
     <w:tmpl w:val="C276993E"/>
@@ -7235,7 +8739,7 @@
       </w:pPr>
     </w:lvl>
   </w:abstractNum>
-  <w:abstractNum w:abstractNumId="14" w15:restartNumberingAfterBreak="0">
+  <w:abstractNum w:abstractNumId="18" w15:restartNumberingAfterBreak="0">
     <w:nsid w:val="525D7035"/>
     <w:multiLevelType w:val="multilevel"/>
     <w:tmpl w:val="BF4C4764"/>
@@ -7348,7 +8852,7 @@
       </w:pPr>
     </w:lvl>
   </w:abstractNum>
-  <w:abstractNum w:abstractNumId="15" w15:restartNumberingAfterBreak="0">
+  <w:abstractNum w:abstractNumId="19" w15:restartNumberingAfterBreak="0">
     <w:nsid w:val="58AE590B"/>
     <w:multiLevelType w:val="multilevel"/>
     <w:tmpl w:val="A594C366"/>
@@ -7465,7 +8969,7 @@
       </w:pPr>
     </w:lvl>
   </w:abstractNum>
-  <w:abstractNum w:abstractNumId="16" w15:restartNumberingAfterBreak="0">
+  <w:abstractNum w:abstractNumId="20" w15:restartNumberingAfterBreak="0">
     <w:nsid w:val="58C305FC"/>
     <w:multiLevelType w:val="multilevel"/>
     <w:tmpl w:val="8564D16C"/>
@@ -7578,7 +9082,7 @@
       </w:pPr>
     </w:lvl>
   </w:abstractNum>
-  <w:abstractNum w:abstractNumId="17" w15:restartNumberingAfterBreak="0">
+  <w:abstractNum w:abstractNumId="21" w15:restartNumberingAfterBreak="0">
     <w:nsid w:val="5C20721C"/>
     <w:multiLevelType w:val="multilevel"/>
     <w:tmpl w:val="F3A48638"/>
@@ -7727,7 +9231,7 @@
       </w:rPr>
     </w:lvl>
   </w:abstractNum>
-  <w:abstractNum w:abstractNumId="18" w15:restartNumberingAfterBreak="0">
+  <w:abstractNum w:abstractNumId="22" w15:restartNumberingAfterBreak="0">
     <w:nsid w:val="64C6550E"/>
     <w:multiLevelType w:val="multilevel"/>
     <w:tmpl w:val="A4B64600"/>
@@ -7844,7 +9348,7 @@
       </w:pPr>
     </w:lvl>
   </w:abstractNum>
-  <w:abstractNum w:abstractNumId="19" w15:restartNumberingAfterBreak="0">
+  <w:abstractNum w:abstractNumId="23" w15:restartNumberingAfterBreak="0">
     <w:nsid w:val="64D918EA"/>
     <w:multiLevelType w:val="multilevel"/>
     <w:tmpl w:val="E99A35EE"/>
@@ -7957,7 +9461,7 @@
       </w:pPr>
     </w:lvl>
   </w:abstractNum>
-  <w:abstractNum w:abstractNumId="20" w15:restartNumberingAfterBreak="0">
+  <w:abstractNum w:abstractNumId="24" w15:restartNumberingAfterBreak="0">
     <w:nsid w:val="66C01CC4"/>
     <w:multiLevelType w:val="multilevel"/>
     <w:tmpl w:val="98BAA73C"/>
@@ -8106,7 +9610,7 @@
       </w:rPr>
     </w:lvl>
   </w:abstractNum>
-  <w:abstractNum w:abstractNumId="21" w15:restartNumberingAfterBreak="0">
+  <w:abstractNum w:abstractNumId="25" w15:restartNumberingAfterBreak="0">
     <w:nsid w:val="70801DA0"/>
     <w:multiLevelType w:val="multilevel"/>
     <w:tmpl w:val="8E083F02"/>
@@ -8255,7 +9759,7 @@
       </w:rPr>
     </w:lvl>
   </w:abstractNum>
-  <w:abstractNum w:abstractNumId="22" w15:restartNumberingAfterBreak="0">
+  <w:abstractNum w:abstractNumId="26" w15:restartNumberingAfterBreak="0">
     <w:nsid w:val="73392FCD"/>
     <w:multiLevelType w:val="multilevel"/>
     <w:tmpl w:val="EB9ECC0C"/>
@@ -8368,7 +9872,7 @@
       </w:pPr>
     </w:lvl>
   </w:abstractNum>
-  <w:abstractNum w:abstractNumId="23" w15:restartNumberingAfterBreak="0">
+  <w:abstractNum w:abstractNumId="27" w15:restartNumberingAfterBreak="0">
     <w:nsid w:val="78D97CE3"/>
     <w:multiLevelType w:val="multilevel"/>
     <w:tmpl w:val="AAF4FD30"/>
@@ -8517,7 +10021,7 @@
       </w:rPr>
     </w:lvl>
   </w:abstractNum>
-  <w:abstractNum w:abstractNumId="24" w15:restartNumberingAfterBreak="0">
+  <w:abstractNum w:abstractNumId="28" w15:restartNumberingAfterBreak="0">
     <w:nsid w:val="7F467DCB"/>
     <w:multiLevelType w:val="multilevel"/>
     <w:tmpl w:val="379A75E6"/>
@@ -8635,79 +10139,91 @@
     </w:lvl>
   </w:abstractNum>
   <w:num w:numId="1">
+    <w:abstractNumId w:val="14"/>
+  </w:num>
+  <w:num w:numId="2">
+    <w:abstractNumId w:val="27"/>
+  </w:num>
+  <w:num w:numId="3">
+    <w:abstractNumId w:val="21"/>
+  </w:num>
+  <w:num w:numId="4">
+    <w:abstractNumId w:val="16"/>
+  </w:num>
+  <w:num w:numId="5">
+    <w:abstractNumId w:val="6"/>
+  </w:num>
+  <w:num w:numId="6">
+    <w:abstractNumId w:val="9"/>
+  </w:num>
+  <w:num w:numId="7">
+    <w:abstractNumId w:val="2"/>
+  </w:num>
+  <w:num w:numId="8">
+    <w:abstractNumId w:val="13"/>
+  </w:num>
+  <w:num w:numId="9">
+    <w:abstractNumId w:val="23"/>
+  </w:num>
+  <w:num w:numId="10">
+    <w:abstractNumId w:val="24"/>
+  </w:num>
+  <w:num w:numId="11">
+    <w:abstractNumId w:val="12"/>
+  </w:num>
+  <w:num w:numId="12">
+    <w:abstractNumId w:val="4"/>
+  </w:num>
+  <w:num w:numId="13">
+    <w:abstractNumId w:val="5"/>
+  </w:num>
+  <w:num w:numId="14">
     <w:abstractNumId w:val="10"/>
   </w:num>
-  <w:num w:numId="2">
-    <w:abstractNumId w:val="23"/>
+  <w:num w:numId="15">
+    <w:abstractNumId w:val="7"/>
   </w:num>
-  <w:num w:numId="3">
+  <w:num w:numId="16">
     <w:abstractNumId w:val="17"/>
   </w:num>
-  <w:num w:numId="4">
-    <w:abstractNumId w:val="12"/>
+  <w:num w:numId="17">
+    <w:abstractNumId w:val="11"/>
   </w:num>
-  <w:num w:numId="5">
-    <w:abstractNumId w:val="3"/>
+  <w:num w:numId="18">
+    <w:abstractNumId w:val="19"/>
   </w:num>
-  <w:num w:numId="6">
-    <w:abstractNumId w:val="5"/>
+  <w:num w:numId="19">
+    <w:abstractNumId w:val="18"/>
   </w:num>
-  <w:num w:numId="7">
+  <w:num w:numId="20">
+    <w:abstractNumId w:val="20"/>
+  </w:num>
+  <w:num w:numId="21">
+    <w:abstractNumId w:val="22"/>
+  </w:num>
+  <w:num w:numId="22">
+    <w:abstractNumId w:val="28"/>
+  </w:num>
+  <w:num w:numId="23">
+    <w:abstractNumId w:val="15"/>
+  </w:num>
+  <w:num w:numId="24">
+    <w:abstractNumId w:val="25"/>
+  </w:num>
+  <w:num w:numId="25">
+    <w:abstractNumId w:val="26"/>
+  </w:num>
+  <w:num w:numId="26">
     <w:abstractNumId w:val="0"/>
   </w:num>
-  <w:num w:numId="8">
-    <w:abstractNumId w:val="9"/>
+  <w:num w:numId="27">
+    <w:abstractNumId w:val="1"/>
   </w:num>
-  <w:num w:numId="9">
-    <w:abstractNumId w:val="19"/>
-  </w:num>
-  <w:num w:numId="10">
-    <w:abstractNumId w:val="20"/>
-  </w:num>
-  <w:num w:numId="11">
+  <w:num w:numId="28">
     <w:abstractNumId w:val="8"/>
   </w:num>
-  <w:num w:numId="12">
-    <w:abstractNumId w:val="1"/>
-  </w:num>
-  <w:num w:numId="13">
-    <w:abstractNumId w:val="2"/>
-  </w:num>
-  <w:num w:numId="14">
-    <w:abstractNumId w:val="6"/>
-  </w:num>
-  <w:num w:numId="15">
-    <w:abstractNumId w:val="4"/>
-  </w:num>
-  <w:num w:numId="16">
-    <w:abstractNumId w:val="13"/>
-  </w:num>
-  <w:num w:numId="17">
-    <w:abstractNumId w:val="7"/>
-  </w:num>
-  <w:num w:numId="18">
-    <w:abstractNumId w:val="15"/>
-  </w:num>
-  <w:num w:numId="19">
-    <w:abstractNumId w:val="14"/>
-  </w:num>
-  <w:num w:numId="20">
-    <w:abstractNumId w:val="16"/>
-  </w:num>
-  <w:num w:numId="21">
-    <w:abstractNumId w:val="18"/>
-  </w:num>
-  <w:num w:numId="22">
-    <w:abstractNumId w:val="24"/>
-  </w:num>
-  <w:num w:numId="23">
-    <w:abstractNumId w:val="11"/>
-  </w:num>
-  <w:num w:numId="24">
-    <w:abstractNumId w:val="21"/>
-  </w:num>
-  <w:num w:numId="25">
-    <w:abstractNumId w:val="22"/>
+  <w:num w:numId="29">
+    <w:abstractNumId w:val="3"/>
   </w:num>
 </w:numbering>
 </file>
@@ -9268,6 +10784,17 @@
       </w:tcPr>
     </w:tblStylePr>
   </w:style>
+  <w:style w:type="character" w:styleId="Hipervnculo">
+    <w:name w:val="Hyperlink"/>
+    <w:basedOn w:val="Fuentedeprrafopredeter"/>
+    <w:uiPriority w:val="99"/>
+    <w:unhideWhenUsed/>
+    <w:rsid w:val="00CB6A9E"/>
+    <w:rPr>
+      <w:color w:val="0563C1" w:themeColor="hyperlink"/>
+      <w:u w:val="single"/>
+    </w:rPr>
+  </w:style>
 </w:styles>
 </file>
 

</xml_diff>

<commit_message>
docs: Actualizar bitácora de implementación
</commit_message>
<xml_diff>
--- a/Documentación/Bitacora de implementación.docx
+++ b/Documentación/Bitacora de implementación.docx
@@ -6426,6 +6426,3771 @@
               <w:t xml:space="preserve"> ahora suma los productos?</w:t>
             </w:r>
           </w:p>
+          <w:p>
+            <w:pPr>
+              <w:cnfStyle w:val="000000000000" w:firstRow="0" w:lastRow="0" w:firstColumn="0" w:lastColumn="0" w:oddVBand="0" w:evenVBand="0" w:oddHBand="0" w:evenHBand="0" w:firstRowFirstColumn="0" w:firstRowLastColumn="0" w:lastRowFirstColumn="0" w:lastRowLastColumn="0"/>
+            </w:pPr>
+          </w:p>
+        </w:tc>
+      </w:tr>
+      <w:tr>
+        <w:trPr>
+          <w:cnfStyle w:val="000000100000" w:firstRow="0" w:lastRow="0" w:firstColumn="0" w:lastColumn="0" w:oddVBand="0" w:evenVBand="0" w:oddHBand="1" w:evenHBand="0" w:firstRowFirstColumn="0" w:firstRowLastColumn="0" w:lastRowFirstColumn="0" w:lastRowLastColumn="0"/>
+        </w:trPr>
+        <w:tc>
+          <w:tcPr>
+            <w:cnfStyle w:val="001000000000" w:firstRow="0" w:lastRow="0" w:firstColumn="1" w:lastColumn="0" w:oddVBand="0" w:evenVBand="0" w:oddHBand="0" w:evenHBand="0" w:firstRowFirstColumn="0" w:firstRowLastColumn="0" w:lastRowFirstColumn="0" w:lastRowLastColumn="0"/>
+            <w:tcW w:w="1056" w:type="dxa"/>
+          </w:tcPr>
+          <w:p>
+            <w:pPr>
+              <w:rPr>
+                <w:i w:val="0"/>
+                <w:iCs w:val="0"/>
+              </w:rPr>
+            </w:pPr>
+            <w:r>
+              <w:rPr>
+                <w:i w:val="0"/>
+                <w:iCs w:val="0"/>
+              </w:rPr>
+              <w:t>7/4/2026</w:t>
+            </w:r>
+          </w:p>
+        </w:tc>
+        <w:tc>
+          <w:tcPr>
+            <w:tcW w:w="9619" w:type="dxa"/>
+          </w:tcPr>
+          <w:p>
+            <w:pPr>
+              <w:cnfStyle w:val="000000100000" w:firstRow="0" w:lastRow="0" w:firstColumn="0" w:lastColumn="0" w:oddVBand="0" w:evenVBand="0" w:oddHBand="1" w:evenHBand="0" w:firstRowFirstColumn="0" w:firstRowLastColumn="0" w:lastRowFirstColumn="0" w:lastRowLastColumn="0"/>
+            </w:pPr>
+            <w:r>
+              <w:t xml:space="preserve">Actuando como el desarrollador experto en </w:t>
+            </w:r>
+            <w:proofErr w:type="spellStart"/>
+            <w:r>
+              <w:t>Flutter</w:t>
+            </w:r>
+            <w:proofErr w:type="spellEnd"/>
+            <w:r>
+              <w:t xml:space="preserve"> que eres. Necesito que implementes un botón de apoyo económico en mi aplicación actual con las siguientes especificaciones: Icono y Activación: Agrega un </w:t>
+            </w:r>
+            <w:proofErr w:type="spellStart"/>
+            <w:r>
+              <w:t>IconButton</w:t>
+            </w:r>
+            <w:proofErr w:type="spellEnd"/>
+            <w:r>
+              <w:t xml:space="preserve"> con el icono </w:t>
+            </w:r>
+            <w:proofErr w:type="spellStart"/>
+            <w:r>
+              <w:t>Icons.coffee</w:t>
+            </w:r>
+            <w:proofErr w:type="spellEnd"/>
+            <w:r>
+              <w:t xml:space="preserve"> en la parte superior al lado izquierdo del icono para cambiar el modo oscuro/claro. Al presionarlo, debe mostrar un </w:t>
+            </w:r>
+            <w:proofErr w:type="spellStart"/>
+            <w:r>
+              <w:t>SimpleDialog</w:t>
+            </w:r>
+            <w:proofErr w:type="spellEnd"/>
+            <w:r>
+              <w:t xml:space="preserve"> o un </w:t>
+            </w:r>
+            <w:proofErr w:type="spellStart"/>
+            <w:r>
+              <w:t>ModalBottomSheet</w:t>
+            </w:r>
+            <w:proofErr w:type="spellEnd"/>
+            <w:r>
+              <w:t xml:space="preserve"> titulado 'Apóyame con un café'. Opción Pago Móvil: Crea dos botones llamados 'Copiar datos de Pago Móvil', uno con el símbolo del Banco de Venezuela y otro con el símbolo del Banco </w:t>
+            </w:r>
+            <w:proofErr w:type="spellStart"/>
+            <w:r>
+              <w:t>Mercantíl</w:t>
+            </w:r>
+            <w:proofErr w:type="spellEnd"/>
+            <w:r>
+              <w:t xml:space="preserve">. Al presionarlo, debe usar </w:t>
+            </w:r>
+            <w:proofErr w:type="spellStart"/>
+            <w:r>
+              <w:t>Clipboard.setData</w:t>
+            </w:r>
+            <w:proofErr w:type="spellEnd"/>
+            <w:r>
+              <w:t xml:space="preserve"> para copiar en un solo </w:t>
+            </w:r>
+            <w:proofErr w:type="spellStart"/>
+            <w:r>
+              <w:t>String</w:t>
+            </w:r>
+            <w:proofErr w:type="spellEnd"/>
+            <w:r>
+              <w:t xml:space="preserve"> mis datos: '0102 04268947660 8033311' para el BDV y '0105 04268947660 8033311' para el Mercantil. Muestra un </w:t>
+            </w:r>
+            <w:proofErr w:type="spellStart"/>
+            <w:r>
+              <w:t>SnackBar</w:t>
+            </w:r>
+            <w:proofErr w:type="spellEnd"/>
+            <w:r>
+              <w:t xml:space="preserve"> que diga: '¡Datos copiados! Ábrelo en tu app del BDV o Mercantil'. Opción </w:t>
+            </w:r>
+            <w:proofErr w:type="spellStart"/>
+            <w:r>
+              <w:t>Binance</w:t>
+            </w:r>
+            <w:proofErr w:type="spellEnd"/>
+            <w:r>
+              <w:t xml:space="preserve"> </w:t>
+            </w:r>
+            <w:proofErr w:type="spellStart"/>
+            <w:r>
+              <w:t>Pay</w:t>
+            </w:r>
+            <w:proofErr w:type="spellEnd"/>
+            <w:r>
+              <w:t xml:space="preserve">: Crea un botón llamado 'Enviar por </w:t>
+            </w:r>
+            <w:proofErr w:type="spellStart"/>
+            <w:r>
+              <w:t>Binance</w:t>
+            </w:r>
+            <w:proofErr w:type="spellEnd"/>
+            <w:r>
+              <w:t xml:space="preserve"> </w:t>
+            </w:r>
+            <w:proofErr w:type="spellStart"/>
+            <w:r>
+              <w:t>Pay</w:t>
+            </w:r>
+            <w:proofErr w:type="spellEnd"/>
+            <w:r>
+              <w:t xml:space="preserve">'. Usa el paquete </w:t>
+            </w:r>
+            <w:proofErr w:type="spellStart"/>
+            <w:r>
+              <w:t>url_launcher</w:t>
+            </w:r>
+            <w:proofErr w:type="spellEnd"/>
+            <w:r>
+              <w:t xml:space="preserve"> para abrir mi enlace de pago directo: 'https://app.binance.com/</w:t>
+            </w:r>
+            <w:proofErr w:type="spellStart"/>
+            <w:r>
+              <w:t>uni-qr</w:t>
+            </w:r>
+            <w:proofErr w:type="spellEnd"/>
+            <w:r>
+              <w:t xml:space="preserve">/89ymjEE7'. El enlace https://app.binance.com/uni-qr/89ymjEE7 corresponde a un Universal QR de </w:t>
+            </w:r>
+            <w:proofErr w:type="spellStart"/>
+            <w:r>
+              <w:t>Binance</w:t>
+            </w:r>
+            <w:proofErr w:type="spellEnd"/>
+            <w:r>
+              <w:t xml:space="preserve">, diseñado para abrir directamente el perfil de usuario para recibir fondos en la aplicación móvil. Se recomienda implementar un </w:t>
+            </w:r>
+            <w:proofErr w:type="spellStart"/>
+            <w:r>
+              <w:t>ModalBottomSheet</w:t>
+            </w:r>
+            <w:proofErr w:type="spellEnd"/>
+            <w:r>
+              <w:t xml:space="preserve"> en </w:t>
+            </w:r>
+            <w:proofErr w:type="spellStart"/>
+            <w:r>
+              <w:t>Flutter</w:t>
+            </w:r>
+            <w:proofErr w:type="spellEnd"/>
+            <w:r>
+              <w:t xml:space="preserve">, utilizando </w:t>
+            </w:r>
+            <w:proofErr w:type="spellStart"/>
+            <w:r>
+              <w:t>url_launcher</w:t>
+            </w:r>
+            <w:proofErr w:type="spellEnd"/>
+            <w:r>
+              <w:t xml:space="preserve"> con </w:t>
+            </w:r>
+            <w:proofErr w:type="spellStart"/>
+            <w:r>
+              <w:t>LaunchMode.externalApplication</w:t>
+            </w:r>
+            <w:proofErr w:type="spellEnd"/>
+            <w:r>
+              <w:t xml:space="preserve"> para asegurar la apertura de </w:t>
+            </w:r>
+            <w:proofErr w:type="spellStart"/>
+            <w:r>
+              <w:t>Binance</w:t>
+            </w:r>
+            <w:proofErr w:type="spellEnd"/>
+            <w:r>
+              <w:t xml:space="preserve"> </w:t>
+            </w:r>
+            <w:proofErr w:type="spellStart"/>
+            <w:r>
+              <w:t>Pay</w:t>
+            </w:r>
+            <w:proofErr w:type="spellEnd"/>
+            <w:r>
+              <w:t xml:space="preserve"> y facilitando la donación. Estilo: El diseño debe ser limpio y amigable, usando los colores del tema de mi app. Por favor, genera el código del widget y asegúrate de importar </w:t>
+            </w:r>
+            <w:proofErr w:type="spellStart"/>
+            <w:proofErr w:type="gramStart"/>
+            <w:r>
+              <w:t>package:flutter</w:t>
+            </w:r>
+            <w:proofErr w:type="spellEnd"/>
+            <w:r>
+              <w:t>/</w:t>
+            </w:r>
+            <w:proofErr w:type="spellStart"/>
+            <w:r>
+              <w:t>services.dart</w:t>
+            </w:r>
+            <w:proofErr w:type="spellEnd"/>
+            <w:proofErr w:type="gramEnd"/>
+            <w:r>
+              <w:t xml:space="preserve"> y </w:t>
+            </w:r>
+            <w:proofErr w:type="spellStart"/>
+            <w:r>
+              <w:t>package:url_launcher</w:t>
+            </w:r>
+            <w:proofErr w:type="spellEnd"/>
+            <w:r>
+              <w:t>/</w:t>
+            </w:r>
+            <w:proofErr w:type="spellStart"/>
+            <w:r>
+              <w:t>url_launcher.dart</w:t>
+            </w:r>
+            <w:proofErr w:type="spellEnd"/>
+            <w:r>
+              <w:t>.</w:t>
+            </w:r>
+          </w:p>
+          <w:p>
+            <w:pPr>
+              <w:cnfStyle w:val="000000100000" w:firstRow="0" w:lastRow="0" w:firstColumn="0" w:lastColumn="0" w:oddVBand="0" w:evenVBand="0" w:oddHBand="1" w:evenHBand="0" w:firstRowFirstColumn="0" w:firstRowLastColumn="0" w:lastRowFirstColumn="0" w:lastRowLastColumn="0"/>
+            </w:pPr>
+          </w:p>
+        </w:tc>
+      </w:tr>
+      <w:tr>
+        <w:tc>
+          <w:tcPr>
+            <w:cnfStyle w:val="001000000000" w:firstRow="0" w:lastRow="0" w:firstColumn="1" w:lastColumn="0" w:oddVBand="0" w:evenVBand="0" w:oddHBand="0" w:evenHBand="0" w:firstRowFirstColumn="0" w:firstRowLastColumn="0" w:lastRowFirstColumn="0" w:lastRowLastColumn="0"/>
+            <w:tcW w:w="1056" w:type="dxa"/>
+          </w:tcPr>
+          <w:p>
+            <w:pPr>
+              <w:rPr>
+                <w:i w:val="0"/>
+                <w:iCs w:val="0"/>
+              </w:rPr>
+            </w:pPr>
+          </w:p>
+        </w:tc>
+        <w:tc>
+          <w:tcPr>
+            <w:tcW w:w="9619" w:type="dxa"/>
+          </w:tcPr>
+          <w:p>
+            <w:pPr>
+              <w:cnfStyle w:val="000000000000" w:firstRow="0" w:lastRow="0" w:firstColumn="0" w:lastColumn="0" w:oddVBand="0" w:evenVBand="0" w:oddHBand="0" w:evenHBand="0" w:firstRowFirstColumn="0" w:firstRowLastColumn="0" w:lastRowFirstColumn="0" w:lastRowLastColumn="0"/>
+            </w:pPr>
+            <w:r>
+              <w:t>¡Listo! He implementado y generado el código del widget que solicitaste con todas las especificaciones y un diseño amigable utilizando </w:t>
+            </w:r>
+            <w:proofErr w:type="spellStart"/>
+            <w:r>
+              <w:t>ModalBottomSheet</w:t>
+            </w:r>
+            <w:proofErr w:type="spellEnd"/>
+            <w:r>
+              <w:t>.</w:t>
+            </w:r>
+          </w:p>
+          <w:p>
+            <w:pPr>
+              <w:cnfStyle w:val="000000000000" w:firstRow="0" w:lastRow="0" w:firstColumn="0" w:lastColumn="0" w:oddVBand="0" w:evenVBand="0" w:oddHBand="0" w:evenHBand="0" w:firstRowFirstColumn="0" w:firstRowLastColumn="0" w:lastRowFirstColumn="0" w:lastRowLastColumn="0"/>
+            </w:pPr>
+            <w:r>
+              <w:t>Además, de manera automática, </w:t>
+            </w:r>
+            <w:r>
+              <w:rPr>
+                <w:b/>
+                <w:bCs/>
+              </w:rPr>
+              <w:t>he ejecutado el comando para añadir </w:t>
+            </w:r>
+            <w:proofErr w:type="spellStart"/>
+            <w:r>
+              <w:rPr>
+                <w:b/>
+                <w:bCs/>
+              </w:rPr>
+              <w:t>url_launcher</w:t>
+            </w:r>
+            <w:proofErr w:type="spellEnd"/>
+            <w:r>
+              <w:rPr>
+                <w:b/>
+                <w:bCs/>
+              </w:rPr>
+              <w:t> a las dependencias de tu proyecto (</w:t>
+            </w:r>
+            <w:proofErr w:type="spellStart"/>
+            <w:proofErr w:type="gramStart"/>
+            <w:r>
+              <w:rPr>
+                <w:b/>
+                <w:bCs/>
+              </w:rPr>
+              <w:t>pubspec.yaml</w:t>
+            </w:r>
+            <w:proofErr w:type="spellEnd"/>
+            <w:proofErr w:type="gramEnd"/>
+            <w:r>
+              <w:rPr>
+                <w:b/>
+                <w:bCs/>
+              </w:rPr>
+              <w:t>)</w:t>
+            </w:r>
+            <w:r>
+              <w:t>, para que no tengas que hacerlo manualmente.</w:t>
+            </w:r>
+          </w:p>
+          <w:p>
+            <w:pPr>
+              <w:cnfStyle w:val="000000000000" w:firstRow="0" w:lastRow="0" w:firstColumn="0" w:lastColumn="0" w:oddVBand="0" w:evenVBand="0" w:oddHBand="0" w:evenHBand="0" w:firstRowFirstColumn="0" w:firstRowLastColumn="0" w:lastRowFirstColumn="0" w:lastRowLastColumn="0"/>
+            </w:pPr>
+            <w:r>
+              <w:t>Aquí te presento el código del widget. También dejé una copia temporal del archivo en </w:t>
+            </w:r>
+            <w:proofErr w:type="spellStart"/>
+            <w:r>
+              <w:t>lib</w:t>
+            </w:r>
+            <w:proofErr w:type="spellEnd"/>
+            <w:r>
+              <w:t>/</w:t>
+            </w:r>
+            <w:proofErr w:type="spellStart"/>
+            <w:r>
+              <w:t>ui</w:t>
+            </w:r>
+            <w:proofErr w:type="spellEnd"/>
+            <w:r>
+              <w:t>/widgets/</w:t>
+            </w:r>
+            <w:proofErr w:type="spellStart"/>
+            <w:r>
+              <w:t>support_button.dart</w:t>
+            </w:r>
+            <w:proofErr w:type="spellEnd"/>
+            <w:r>
+              <w:t> en caso de que quieras conservarlo en esa ruta.</w:t>
+            </w:r>
+          </w:p>
+          <w:p>
+            <w:pPr>
+              <w:cnfStyle w:val="000000000000" w:firstRow="0" w:lastRow="0" w:firstColumn="0" w:lastColumn="0" w:oddVBand="0" w:evenVBand="0" w:oddHBand="0" w:evenHBand="0" w:firstRowFirstColumn="0" w:firstRowLastColumn="0" w:lastRowFirstColumn="0" w:lastRowLastColumn="0"/>
+            </w:pPr>
+            <w:proofErr w:type="spellStart"/>
+            <w:r>
+              <w:t>dart</w:t>
+            </w:r>
+            <w:proofErr w:type="spellEnd"/>
+          </w:p>
+          <w:p>
+            <w:pPr>
+              <w:cnfStyle w:val="000000000000" w:firstRow="0" w:lastRow="0" w:firstColumn="0" w:lastColumn="0" w:oddVBand="0" w:evenVBand="0" w:oddHBand="0" w:evenHBand="0" w:firstRowFirstColumn="0" w:firstRowLastColumn="0" w:lastRowFirstColumn="0" w:lastRowLastColumn="0"/>
+            </w:pPr>
+            <w:proofErr w:type="spellStart"/>
+            <w:r>
+              <w:t>import</w:t>
+            </w:r>
+            <w:proofErr w:type="spellEnd"/>
+            <w:r>
+              <w:t xml:space="preserve"> '</w:t>
+            </w:r>
+            <w:proofErr w:type="spellStart"/>
+            <w:proofErr w:type="gramStart"/>
+            <w:r>
+              <w:t>package:flutter</w:t>
+            </w:r>
+            <w:proofErr w:type="spellEnd"/>
+            <w:r>
+              <w:t>/</w:t>
+            </w:r>
+            <w:proofErr w:type="spellStart"/>
+            <w:r>
+              <w:t>material.dart</w:t>
+            </w:r>
+            <w:proofErr w:type="spellEnd"/>
+            <w:proofErr w:type="gramEnd"/>
+            <w:r>
+              <w:t>';</w:t>
+            </w:r>
+          </w:p>
+          <w:p>
+            <w:pPr>
+              <w:cnfStyle w:val="000000000000" w:firstRow="0" w:lastRow="0" w:firstColumn="0" w:lastColumn="0" w:oddVBand="0" w:evenVBand="0" w:oddHBand="0" w:evenHBand="0" w:firstRowFirstColumn="0" w:firstRowLastColumn="0" w:lastRowFirstColumn="0" w:lastRowLastColumn="0"/>
+            </w:pPr>
+            <w:proofErr w:type="spellStart"/>
+            <w:r>
+              <w:t>import</w:t>
+            </w:r>
+            <w:proofErr w:type="spellEnd"/>
+            <w:r>
+              <w:t xml:space="preserve"> '</w:t>
+            </w:r>
+            <w:proofErr w:type="spellStart"/>
+            <w:proofErr w:type="gramStart"/>
+            <w:r>
+              <w:t>package:flutter</w:t>
+            </w:r>
+            <w:proofErr w:type="spellEnd"/>
+            <w:r>
+              <w:t>/</w:t>
+            </w:r>
+            <w:proofErr w:type="spellStart"/>
+            <w:r>
+              <w:t>services.dart</w:t>
+            </w:r>
+            <w:proofErr w:type="spellEnd"/>
+            <w:proofErr w:type="gramEnd"/>
+            <w:r>
+              <w:t>';</w:t>
+            </w:r>
+          </w:p>
+          <w:p>
+            <w:pPr>
+              <w:cnfStyle w:val="000000000000" w:firstRow="0" w:lastRow="0" w:firstColumn="0" w:lastColumn="0" w:oddVBand="0" w:evenVBand="0" w:oddHBand="0" w:evenHBand="0" w:firstRowFirstColumn="0" w:firstRowLastColumn="0" w:lastRowFirstColumn="0" w:lastRowLastColumn="0"/>
+            </w:pPr>
+            <w:proofErr w:type="spellStart"/>
+            <w:r>
+              <w:t>import</w:t>
+            </w:r>
+            <w:proofErr w:type="spellEnd"/>
+            <w:r>
+              <w:t xml:space="preserve"> '</w:t>
+            </w:r>
+            <w:proofErr w:type="spellStart"/>
+            <w:proofErr w:type="gramStart"/>
+            <w:r>
+              <w:t>package:url_launcher</w:t>
+            </w:r>
+            <w:proofErr w:type="spellEnd"/>
+            <w:r>
+              <w:t>/</w:t>
+            </w:r>
+            <w:proofErr w:type="spellStart"/>
+            <w:r>
+              <w:t>url_launcher.dart</w:t>
+            </w:r>
+            <w:proofErr w:type="spellEnd"/>
+            <w:proofErr w:type="gramEnd"/>
+            <w:r>
+              <w:t>';</w:t>
+            </w:r>
+          </w:p>
+          <w:p>
+            <w:pPr>
+              <w:cnfStyle w:val="000000000000" w:firstRow="0" w:lastRow="0" w:firstColumn="0" w:lastColumn="0" w:oddVBand="0" w:evenVBand="0" w:oddHBand="0" w:evenHBand="0" w:firstRowFirstColumn="0" w:firstRowLastColumn="0" w:lastRowFirstColumn="0" w:lastRowLastColumn="0"/>
+            </w:pPr>
+            <w:proofErr w:type="spellStart"/>
+            <w:r>
+              <w:t>class</w:t>
+            </w:r>
+            <w:proofErr w:type="spellEnd"/>
+            <w:r>
+              <w:t xml:space="preserve"> </w:t>
+            </w:r>
+            <w:proofErr w:type="spellStart"/>
+            <w:r>
+              <w:t>SupportButton</w:t>
+            </w:r>
+            <w:proofErr w:type="spellEnd"/>
+            <w:r>
+              <w:t xml:space="preserve"> </w:t>
+            </w:r>
+            <w:proofErr w:type="spellStart"/>
+            <w:r>
+              <w:t>extends</w:t>
+            </w:r>
+            <w:proofErr w:type="spellEnd"/>
+            <w:r>
+              <w:t xml:space="preserve"> </w:t>
+            </w:r>
+            <w:proofErr w:type="spellStart"/>
+            <w:r>
+              <w:t>StatelessWidget</w:t>
+            </w:r>
+            <w:proofErr w:type="spellEnd"/>
+            <w:r>
+              <w:t xml:space="preserve"> {</w:t>
+            </w:r>
+          </w:p>
+          <w:p>
+            <w:pPr>
+              <w:cnfStyle w:val="000000000000" w:firstRow="0" w:lastRow="0" w:firstColumn="0" w:lastColumn="0" w:oddVBand="0" w:evenVBand="0" w:oddHBand="0" w:evenHBand="0" w:firstRowFirstColumn="0" w:firstRowLastColumn="0" w:lastRowFirstColumn="0" w:lastRowLastColumn="0"/>
+            </w:pPr>
+            <w:r>
+              <w:lastRenderedPageBreak/>
+              <w:t xml:space="preserve">  </w:t>
+            </w:r>
+            <w:proofErr w:type="spellStart"/>
+            <w:r>
+              <w:t>const</w:t>
+            </w:r>
+            <w:proofErr w:type="spellEnd"/>
+            <w:r>
+              <w:t xml:space="preserve"> </w:t>
+            </w:r>
+            <w:proofErr w:type="spellStart"/>
+            <w:r>
+              <w:t>SupportButton</w:t>
+            </w:r>
+            <w:proofErr w:type="spellEnd"/>
+            <w:r>
+              <w:t>({</w:t>
+            </w:r>
+            <w:proofErr w:type="spellStart"/>
+            <w:r>
+              <w:t>super.key</w:t>
+            </w:r>
+            <w:proofErr w:type="spellEnd"/>
+            <w:r>
+              <w:t>});</w:t>
+            </w:r>
+          </w:p>
+          <w:p>
+            <w:pPr>
+              <w:cnfStyle w:val="000000000000" w:firstRow="0" w:lastRow="0" w:firstColumn="0" w:lastColumn="0" w:oddVBand="0" w:evenVBand="0" w:oddHBand="0" w:evenHBand="0" w:firstRowFirstColumn="0" w:firstRowLastColumn="0" w:lastRowFirstColumn="0" w:lastRowLastColumn="0"/>
+            </w:pPr>
+            <w:r>
+              <w:t xml:space="preserve">  </w:t>
+            </w:r>
+            <w:proofErr w:type="spellStart"/>
+            <w:r>
+              <w:t>void</w:t>
+            </w:r>
+            <w:proofErr w:type="spellEnd"/>
+            <w:r>
+              <w:t xml:space="preserve"> _</w:t>
+            </w:r>
+            <w:proofErr w:type="spellStart"/>
+            <w:proofErr w:type="gramStart"/>
+            <w:r>
+              <w:t>showSupportBottomSheet</w:t>
+            </w:r>
+            <w:proofErr w:type="spellEnd"/>
+            <w:r>
+              <w:t>(</w:t>
+            </w:r>
+            <w:proofErr w:type="spellStart"/>
+            <w:proofErr w:type="gramEnd"/>
+            <w:r>
+              <w:t>BuildContext</w:t>
+            </w:r>
+            <w:proofErr w:type="spellEnd"/>
+            <w:r>
+              <w:t xml:space="preserve"> </w:t>
+            </w:r>
+            <w:proofErr w:type="spellStart"/>
+            <w:r>
+              <w:t>context</w:t>
+            </w:r>
+            <w:proofErr w:type="spellEnd"/>
+            <w:r>
+              <w:t>) {</w:t>
+            </w:r>
+          </w:p>
+          <w:p>
+            <w:pPr>
+              <w:cnfStyle w:val="000000000000" w:firstRow="0" w:lastRow="0" w:firstColumn="0" w:lastColumn="0" w:oddVBand="0" w:evenVBand="0" w:oddHBand="0" w:evenHBand="0" w:firstRowFirstColumn="0" w:firstRowLastColumn="0" w:lastRowFirstColumn="0" w:lastRowLastColumn="0"/>
+            </w:pPr>
+            <w:r>
+              <w:t xml:space="preserve">    </w:t>
+            </w:r>
+            <w:proofErr w:type="spellStart"/>
+            <w:proofErr w:type="gramStart"/>
+            <w:r>
+              <w:t>showModalBottomSheet</w:t>
+            </w:r>
+            <w:proofErr w:type="spellEnd"/>
+            <w:r>
+              <w:t>(</w:t>
+            </w:r>
+            <w:proofErr w:type="gramEnd"/>
+          </w:p>
+          <w:p>
+            <w:pPr>
+              <w:cnfStyle w:val="000000000000" w:firstRow="0" w:lastRow="0" w:firstColumn="0" w:lastColumn="0" w:oddVBand="0" w:evenVBand="0" w:oddHBand="0" w:evenHBand="0" w:firstRowFirstColumn="0" w:firstRowLastColumn="0" w:lastRowFirstColumn="0" w:lastRowLastColumn="0"/>
+            </w:pPr>
+            <w:r>
+              <w:t xml:space="preserve">      </w:t>
+            </w:r>
+            <w:proofErr w:type="spellStart"/>
+            <w:r>
+              <w:t>context</w:t>
+            </w:r>
+            <w:proofErr w:type="spellEnd"/>
+            <w:r>
+              <w:t xml:space="preserve">: </w:t>
+            </w:r>
+            <w:proofErr w:type="spellStart"/>
+            <w:r>
+              <w:t>context</w:t>
+            </w:r>
+            <w:proofErr w:type="spellEnd"/>
+            <w:r>
+              <w:t>,</w:t>
+            </w:r>
+          </w:p>
+          <w:p>
+            <w:pPr>
+              <w:cnfStyle w:val="000000000000" w:firstRow="0" w:lastRow="0" w:firstColumn="0" w:lastColumn="0" w:oddVBand="0" w:evenVBand="0" w:oddHBand="0" w:evenHBand="0" w:firstRowFirstColumn="0" w:firstRowLastColumn="0" w:lastRowFirstColumn="0" w:lastRowLastColumn="0"/>
+            </w:pPr>
+            <w:r>
+              <w:t xml:space="preserve">      </w:t>
+            </w:r>
+            <w:proofErr w:type="spellStart"/>
+            <w:r>
+              <w:t>isScrollControlled</w:t>
+            </w:r>
+            <w:proofErr w:type="spellEnd"/>
+            <w:r>
+              <w:t>: true,</w:t>
+            </w:r>
+          </w:p>
+          <w:p>
+            <w:pPr>
+              <w:cnfStyle w:val="000000000000" w:firstRow="0" w:lastRow="0" w:firstColumn="0" w:lastColumn="0" w:oddVBand="0" w:evenVBand="0" w:oddHBand="0" w:evenHBand="0" w:firstRowFirstColumn="0" w:firstRowLastColumn="0" w:lastRowFirstColumn="0" w:lastRowLastColumn="0"/>
+            </w:pPr>
+            <w:r>
+              <w:t xml:space="preserve">      </w:t>
+            </w:r>
+            <w:proofErr w:type="spellStart"/>
+            <w:r>
+              <w:t>shape</w:t>
+            </w:r>
+            <w:proofErr w:type="spellEnd"/>
+            <w:r>
+              <w:t xml:space="preserve">: </w:t>
+            </w:r>
+            <w:proofErr w:type="spellStart"/>
+            <w:r>
+              <w:t>const</w:t>
+            </w:r>
+            <w:proofErr w:type="spellEnd"/>
+            <w:r>
+              <w:t xml:space="preserve"> </w:t>
+            </w:r>
+            <w:proofErr w:type="spellStart"/>
+            <w:proofErr w:type="gramStart"/>
+            <w:r>
+              <w:t>RoundedRectangleBorder</w:t>
+            </w:r>
+            <w:proofErr w:type="spellEnd"/>
+            <w:r>
+              <w:t>(</w:t>
+            </w:r>
+            <w:proofErr w:type="gramEnd"/>
+          </w:p>
+          <w:p>
+            <w:pPr>
+              <w:cnfStyle w:val="000000000000" w:firstRow="0" w:lastRow="0" w:firstColumn="0" w:lastColumn="0" w:oddVBand="0" w:evenVBand="0" w:oddHBand="0" w:evenHBand="0" w:firstRowFirstColumn="0" w:firstRowLastColumn="0" w:lastRowFirstColumn="0" w:lastRowLastColumn="0"/>
+            </w:pPr>
+            <w:r>
+              <w:t xml:space="preserve">        </w:t>
+            </w:r>
+            <w:proofErr w:type="spellStart"/>
+            <w:r>
+              <w:t>borderRadius</w:t>
+            </w:r>
+            <w:proofErr w:type="spellEnd"/>
+            <w:r>
+              <w:t xml:space="preserve">: </w:t>
+            </w:r>
+            <w:proofErr w:type="spellStart"/>
+            <w:r>
+              <w:t>BorderRadius.vertical</w:t>
+            </w:r>
+            <w:proofErr w:type="spellEnd"/>
+            <w:r>
+              <w:t xml:space="preserve">(top: </w:t>
+            </w:r>
+            <w:proofErr w:type="spellStart"/>
+            <w:r>
+              <w:t>Radius.circular</w:t>
+            </w:r>
+            <w:proofErr w:type="spellEnd"/>
+            <w:r>
+              <w:t>(20)),</w:t>
+            </w:r>
+          </w:p>
+          <w:p>
+            <w:pPr>
+              <w:cnfStyle w:val="000000000000" w:firstRow="0" w:lastRow="0" w:firstColumn="0" w:lastColumn="0" w:oddVBand="0" w:evenVBand="0" w:oddHBand="0" w:evenHBand="0" w:firstRowFirstColumn="0" w:firstRowLastColumn="0" w:lastRowFirstColumn="0" w:lastRowLastColumn="0"/>
+            </w:pPr>
+            <w:r>
+              <w:t xml:space="preserve">      ),</w:t>
+            </w:r>
+          </w:p>
+          <w:p>
+            <w:pPr>
+              <w:cnfStyle w:val="000000000000" w:firstRow="0" w:lastRow="0" w:firstColumn="0" w:lastColumn="0" w:oddVBand="0" w:evenVBand="0" w:oddHBand="0" w:evenHBand="0" w:firstRowFirstColumn="0" w:firstRowLastColumn="0" w:lastRowFirstColumn="0" w:lastRowLastColumn="0"/>
+            </w:pPr>
+            <w:r>
+              <w:t xml:space="preserve">      </w:t>
+            </w:r>
+            <w:proofErr w:type="spellStart"/>
+            <w:r>
+              <w:t>builder</w:t>
+            </w:r>
+            <w:proofErr w:type="spellEnd"/>
+            <w:r>
+              <w:t>: (</w:t>
+            </w:r>
+            <w:proofErr w:type="spellStart"/>
+            <w:r>
+              <w:t>BuildContext</w:t>
+            </w:r>
+            <w:proofErr w:type="spellEnd"/>
+            <w:r>
+              <w:t xml:space="preserve"> </w:t>
+            </w:r>
+            <w:proofErr w:type="spellStart"/>
+            <w:r>
+              <w:t>context</w:t>
+            </w:r>
+            <w:proofErr w:type="spellEnd"/>
+            <w:r>
+              <w:t>) {</w:t>
+            </w:r>
+          </w:p>
+          <w:p>
+            <w:pPr>
+              <w:cnfStyle w:val="000000000000" w:firstRow="0" w:lastRow="0" w:firstColumn="0" w:lastColumn="0" w:oddVBand="0" w:evenVBand="0" w:oddHBand="0" w:evenHBand="0" w:firstRowFirstColumn="0" w:firstRowLastColumn="0" w:lastRowFirstColumn="0" w:lastRowLastColumn="0"/>
+            </w:pPr>
+            <w:r>
+              <w:t xml:space="preserve">        </w:t>
+            </w:r>
+            <w:proofErr w:type="spellStart"/>
+            <w:r>
+              <w:t>return</w:t>
+            </w:r>
+            <w:proofErr w:type="spellEnd"/>
+            <w:r>
+              <w:t xml:space="preserve"> </w:t>
+            </w:r>
+            <w:proofErr w:type="spellStart"/>
+            <w:proofErr w:type="gramStart"/>
+            <w:r>
+              <w:t>Padding</w:t>
+            </w:r>
+            <w:proofErr w:type="spellEnd"/>
+            <w:r>
+              <w:t>(</w:t>
+            </w:r>
+            <w:proofErr w:type="gramEnd"/>
+          </w:p>
+          <w:p>
+            <w:pPr>
+              <w:cnfStyle w:val="000000000000" w:firstRow="0" w:lastRow="0" w:firstColumn="0" w:lastColumn="0" w:oddVBand="0" w:evenVBand="0" w:oddHBand="0" w:evenHBand="0" w:firstRowFirstColumn="0" w:firstRowLastColumn="0" w:lastRowFirstColumn="0" w:lastRowLastColumn="0"/>
+            </w:pPr>
+            <w:r>
+              <w:t xml:space="preserve">          </w:t>
+            </w:r>
+            <w:proofErr w:type="spellStart"/>
+            <w:r>
+              <w:t>padding</w:t>
+            </w:r>
+            <w:proofErr w:type="spellEnd"/>
+            <w:r>
+              <w:t xml:space="preserve">: </w:t>
+            </w:r>
+            <w:proofErr w:type="spellStart"/>
+            <w:r>
+              <w:t>EdgeInsets.only</w:t>
+            </w:r>
+            <w:proofErr w:type="spellEnd"/>
+            <w:r>
+              <w:t>(</w:t>
+            </w:r>
+          </w:p>
+          <w:p>
+            <w:pPr>
+              <w:cnfStyle w:val="000000000000" w:firstRow="0" w:lastRow="0" w:firstColumn="0" w:lastColumn="0" w:oddVBand="0" w:evenVBand="0" w:oddHBand="0" w:evenHBand="0" w:firstRowFirstColumn="0" w:firstRowLastColumn="0" w:lastRowFirstColumn="0" w:lastRowLastColumn="0"/>
+            </w:pPr>
+            <w:r>
+              <w:t xml:space="preserve">            </w:t>
+            </w:r>
+            <w:proofErr w:type="spellStart"/>
+            <w:r>
+              <w:t>bottom</w:t>
+            </w:r>
+            <w:proofErr w:type="spellEnd"/>
+            <w:r>
+              <w:t xml:space="preserve">: </w:t>
+            </w:r>
+            <w:proofErr w:type="spellStart"/>
+            <w:r>
+              <w:t>MediaQuery.of</w:t>
+            </w:r>
+            <w:proofErr w:type="spellEnd"/>
+            <w:r>
+              <w:t>(</w:t>
+            </w:r>
+            <w:proofErr w:type="spellStart"/>
+            <w:r>
+              <w:t>context</w:t>
+            </w:r>
+            <w:proofErr w:type="spellEnd"/>
+            <w:proofErr w:type="gramStart"/>
+            <w:r>
+              <w:t>).</w:t>
+            </w:r>
+            <w:proofErr w:type="spellStart"/>
+            <w:r>
+              <w:t>viewInsets.bottom</w:t>
+            </w:r>
+            <w:proofErr w:type="spellEnd"/>
+            <w:proofErr w:type="gramEnd"/>
+            <w:r>
+              <w:t>,</w:t>
+            </w:r>
+          </w:p>
+          <w:p>
+            <w:pPr>
+              <w:cnfStyle w:val="000000000000" w:firstRow="0" w:lastRow="0" w:firstColumn="0" w:lastColumn="0" w:oddVBand="0" w:evenVBand="0" w:oddHBand="0" w:evenHBand="0" w:firstRowFirstColumn="0" w:firstRowLastColumn="0" w:lastRowFirstColumn="0" w:lastRowLastColumn="0"/>
+            </w:pPr>
+            <w:r>
+              <w:t xml:space="preserve">            top: 24,</w:t>
+            </w:r>
+          </w:p>
+          <w:p>
+            <w:pPr>
+              <w:cnfStyle w:val="000000000000" w:firstRow="0" w:lastRow="0" w:firstColumn="0" w:lastColumn="0" w:oddVBand="0" w:evenVBand="0" w:oddHBand="0" w:evenHBand="0" w:firstRowFirstColumn="0" w:firstRowLastColumn="0" w:lastRowFirstColumn="0" w:lastRowLastColumn="0"/>
+            </w:pPr>
+            <w:r>
+              <w:t xml:space="preserve">            </w:t>
+            </w:r>
+            <w:proofErr w:type="spellStart"/>
+            <w:r>
+              <w:t>left</w:t>
+            </w:r>
+            <w:proofErr w:type="spellEnd"/>
+            <w:r>
+              <w:t>: 20,</w:t>
+            </w:r>
+          </w:p>
+          <w:p>
+            <w:pPr>
+              <w:cnfStyle w:val="000000000000" w:firstRow="0" w:lastRow="0" w:firstColumn="0" w:lastColumn="0" w:oddVBand="0" w:evenVBand="0" w:oddHBand="0" w:evenHBand="0" w:firstRowFirstColumn="0" w:firstRowLastColumn="0" w:lastRowFirstColumn="0" w:lastRowLastColumn="0"/>
+            </w:pPr>
+            <w:r>
+              <w:t xml:space="preserve">            </w:t>
+            </w:r>
+            <w:proofErr w:type="spellStart"/>
+            <w:r>
+              <w:t>right</w:t>
+            </w:r>
+            <w:proofErr w:type="spellEnd"/>
+            <w:r>
+              <w:t>: 20,</w:t>
+            </w:r>
+          </w:p>
+          <w:p>
+            <w:pPr>
+              <w:cnfStyle w:val="000000000000" w:firstRow="0" w:lastRow="0" w:firstColumn="0" w:lastColumn="0" w:oddVBand="0" w:evenVBand="0" w:oddHBand="0" w:evenHBand="0" w:firstRowFirstColumn="0" w:firstRowLastColumn="0" w:lastRowFirstColumn="0" w:lastRowLastColumn="0"/>
+            </w:pPr>
+            <w:r>
+              <w:t xml:space="preserve">          ),</w:t>
+            </w:r>
+          </w:p>
+          <w:p>
+            <w:pPr>
+              <w:cnfStyle w:val="000000000000" w:firstRow="0" w:lastRow="0" w:firstColumn="0" w:lastColumn="0" w:oddVBand="0" w:evenVBand="0" w:oddHBand="0" w:evenHBand="0" w:firstRowFirstColumn="0" w:firstRowLastColumn="0" w:lastRowFirstColumn="0" w:lastRowLastColumn="0"/>
+            </w:pPr>
+            <w:r>
+              <w:t xml:space="preserve">          </w:t>
+            </w:r>
+            <w:proofErr w:type="spellStart"/>
+            <w:r>
+              <w:t>child</w:t>
+            </w:r>
+            <w:proofErr w:type="spellEnd"/>
+            <w:r>
+              <w:t xml:space="preserve">: </w:t>
+            </w:r>
+            <w:proofErr w:type="spellStart"/>
+            <w:proofErr w:type="gramStart"/>
+            <w:r>
+              <w:t>Column</w:t>
+            </w:r>
+            <w:proofErr w:type="spellEnd"/>
+            <w:r>
+              <w:t>(</w:t>
+            </w:r>
+            <w:proofErr w:type="gramEnd"/>
+          </w:p>
+          <w:p>
+            <w:pPr>
+              <w:cnfStyle w:val="000000000000" w:firstRow="0" w:lastRow="0" w:firstColumn="0" w:lastColumn="0" w:oddVBand="0" w:evenVBand="0" w:oddHBand="0" w:evenHBand="0" w:firstRowFirstColumn="0" w:firstRowLastColumn="0" w:lastRowFirstColumn="0" w:lastRowLastColumn="0"/>
+            </w:pPr>
+            <w:r>
+              <w:t xml:space="preserve">            </w:t>
+            </w:r>
+            <w:proofErr w:type="spellStart"/>
+            <w:r>
+              <w:t>mainAxisSize</w:t>
+            </w:r>
+            <w:proofErr w:type="spellEnd"/>
+            <w:r>
+              <w:t xml:space="preserve">: </w:t>
+            </w:r>
+            <w:proofErr w:type="spellStart"/>
+            <w:r>
+              <w:t>MainAxisSize.min</w:t>
+            </w:r>
+            <w:proofErr w:type="spellEnd"/>
+            <w:r>
+              <w:t>,</w:t>
+            </w:r>
+          </w:p>
+          <w:p>
+            <w:pPr>
+              <w:cnfStyle w:val="000000000000" w:firstRow="0" w:lastRow="0" w:firstColumn="0" w:lastColumn="0" w:oddVBand="0" w:evenVBand="0" w:oddHBand="0" w:evenHBand="0" w:firstRowFirstColumn="0" w:firstRowLastColumn="0" w:lastRowFirstColumn="0" w:lastRowLastColumn="0"/>
+            </w:pPr>
+            <w:r>
+              <w:t xml:space="preserve">            </w:t>
+            </w:r>
+            <w:proofErr w:type="spellStart"/>
+            <w:r>
+              <w:t>children</w:t>
+            </w:r>
+            <w:proofErr w:type="spellEnd"/>
+            <w:r>
+              <w:t>: [</w:t>
+            </w:r>
+          </w:p>
+          <w:p>
+            <w:pPr>
+              <w:cnfStyle w:val="000000000000" w:firstRow="0" w:lastRow="0" w:firstColumn="0" w:lastColumn="0" w:oddVBand="0" w:evenVBand="0" w:oddHBand="0" w:evenHBand="0" w:firstRowFirstColumn="0" w:firstRowLastColumn="0" w:lastRowFirstColumn="0" w:lastRowLastColumn="0"/>
+            </w:pPr>
+            <w:r>
+              <w:t xml:space="preserve">              </w:t>
+            </w:r>
+            <w:proofErr w:type="gramStart"/>
+            <w:r>
+              <w:t>Text(</w:t>
+            </w:r>
+            <w:proofErr w:type="gramEnd"/>
+          </w:p>
+          <w:p>
+            <w:pPr>
+              <w:cnfStyle w:val="000000000000" w:firstRow="0" w:lastRow="0" w:firstColumn="0" w:lastColumn="0" w:oddVBand="0" w:evenVBand="0" w:oddHBand="0" w:evenHBand="0" w:firstRowFirstColumn="0" w:firstRowLastColumn="0" w:lastRowFirstColumn="0" w:lastRowLastColumn="0"/>
+            </w:pPr>
+            <w:r>
+              <w:t xml:space="preserve">                'Apóyame con un café </w:t>
+            </w:r>
+            <w:r>
+              <w:rPr>
+                <w:rFonts w:ascii="Segoe UI Symbol" w:hAnsi="Segoe UI Symbol" w:cs="Segoe UI Symbol"/>
+              </w:rPr>
+              <w:t>☕</w:t>
+            </w:r>
+            <w:r>
+              <w:t>',</w:t>
+            </w:r>
+          </w:p>
+          <w:p>
+            <w:pPr>
+              <w:cnfStyle w:val="000000000000" w:firstRow="0" w:lastRow="0" w:firstColumn="0" w:lastColumn="0" w:oddVBand="0" w:evenVBand="0" w:oddHBand="0" w:evenHBand="0" w:firstRowFirstColumn="0" w:firstRowLastColumn="0" w:lastRowFirstColumn="0" w:lastRowLastColumn="0"/>
+            </w:pPr>
+            <w:r>
+              <w:t xml:space="preserve">                </w:t>
+            </w:r>
+            <w:proofErr w:type="spellStart"/>
+            <w:r>
+              <w:t>style</w:t>
+            </w:r>
+            <w:proofErr w:type="spellEnd"/>
+            <w:r>
+              <w:t xml:space="preserve">: </w:t>
+            </w:r>
+            <w:proofErr w:type="spellStart"/>
+            <w:r>
+              <w:t>Theme.of</w:t>
+            </w:r>
+            <w:proofErr w:type="spellEnd"/>
+            <w:r>
+              <w:t>(</w:t>
+            </w:r>
+            <w:proofErr w:type="spellStart"/>
+            <w:r>
+              <w:t>context</w:t>
+            </w:r>
+            <w:proofErr w:type="spellEnd"/>
+            <w:proofErr w:type="gramStart"/>
+            <w:r>
+              <w:t>).textTheme.</w:t>
+            </w:r>
+            <w:proofErr w:type="spellStart"/>
+            <w:r>
+              <w:t>titleLarge</w:t>
+            </w:r>
+            <w:proofErr w:type="spellEnd"/>
+            <w:r>
+              <w:t>?.</w:t>
+            </w:r>
+            <w:proofErr w:type="spellStart"/>
+            <w:proofErr w:type="gramEnd"/>
+            <w:r>
+              <w:t>copyWith</w:t>
+            </w:r>
+            <w:proofErr w:type="spellEnd"/>
+            <w:r>
+              <w:t>(</w:t>
+            </w:r>
+          </w:p>
+          <w:p>
+            <w:pPr>
+              <w:cnfStyle w:val="000000000000" w:firstRow="0" w:lastRow="0" w:firstColumn="0" w:lastColumn="0" w:oddVBand="0" w:evenVBand="0" w:oddHBand="0" w:evenHBand="0" w:firstRowFirstColumn="0" w:firstRowLastColumn="0" w:lastRowFirstColumn="0" w:lastRowLastColumn="0"/>
+            </w:pPr>
+            <w:r>
+              <w:t xml:space="preserve">                      </w:t>
+            </w:r>
+            <w:proofErr w:type="spellStart"/>
+            <w:r>
+              <w:t>fontWeight</w:t>
+            </w:r>
+            <w:proofErr w:type="spellEnd"/>
+            <w:r>
+              <w:t xml:space="preserve">: </w:t>
+            </w:r>
+            <w:proofErr w:type="spellStart"/>
+            <w:r>
+              <w:t>FontWeight.bold</w:t>
+            </w:r>
+            <w:proofErr w:type="spellEnd"/>
+            <w:r>
+              <w:t>,</w:t>
+            </w:r>
+          </w:p>
+          <w:p>
+            <w:pPr>
+              <w:cnfStyle w:val="000000000000" w:firstRow="0" w:lastRow="0" w:firstColumn="0" w:lastColumn="0" w:oddVBand="0" w:evenVBand="0" w:oddHBand="0" w:evenHBand="0" w:firstRowFirstColumn="0" w:firstRowLastColumn="0" w:lastRowFirstColumn="0" w:lastRowLastColumn="0"/>
+            </w:pPr>
+            <w:r>
+              <w:t xml:space="preserve">                    ),</w:t>
+            </w:r>
+          </w:p>
+          <w:p>
+            <w:pPr>
+              <w:cnfStyle w:val="000000000000" w:firstRow="0" w:lastRow="0" w:firstColumn="0" w:lastColumn="0" w:oddVBand="0" w:evenVBand="0" w:oddHBand="0" w:evenHBand="0" w:firstRowFirstColumn="0" w:firstRowLastColumn="0" w:lastRowFirstColumn="0" w:lastRowLastColumn="0"/>
+            </w:pPr>
+            <w:r>
+              <w:t xml:space="preserve">                </w:t>
+            </w:r>
+            <w:proofErr w:type="spellStart"/>
+            <w:r>
+              <w:t>textAlign</w:t>
+            </w:r>
+            <w:proofErr w:type="spellEnd"/>
+            <w:r>
+              <w:t xml:space="preserve">: </w:t>
+            </w:r>
+            <w:proofErr w:type="spellStart"/>
+            <w:r>
+              <w:t>TextAlign.center</w:t>
+            </w:r>
+            <w:proofErr w:type="spellEnd"/>
+            <w:r>
+              <w:t>,</w:t>
+            </w:r>
+          </w:p>
+          <w:p>
+            <w:pPr>
+              <w:cnfStyle w:val="000000000000" w:firstRow="0" w:lastRow="0" w:firstColumn="0" w:lastColumn="0" w:oddVBand="0" w:evenVBand="0" w:oddHBand="0" w:evenHBand="0" w:firstRowFirstColumn="0" w:firstRowLastColumn="0" w:lastRowFirstColumn="0" w:lastRowLastColumn="0"/>
+            </w:pPr>
+            <w:r>
+              <w:t xml:space="preserve">              ),</w:t>
+            </w:r>
+          </w:p>
+          <w:p>
+            <w:pPr>
+              <w:cnfStyle w:val="000000000000" w:firstRow="0" w:lastRow="0" w:firstColumn="0" w:lastColumn="0" w:oddVBand="0" w:evenVBand="0" w:oddHBand="0" w:evenHBand="0" w:firstRowFirstColumn="0" w:firstRowLastColumn="0" w:lastRowFirstColumn="0" w:lastRowLastColumn="0"/>
+            </w:pPr>
+            <w:r>
+              <w:t xml:space="preserve">              </w:t>
+            </w:r>
+            <w:proofErr w:type="spellStart"/>
+            <w:r>
+              <w:t>const</w:t>
+            </w:r>
+            <w:proofErr w:type="spellEnd"/>
+            <w:r>
+              <w:t xml:space="preserve"> </w:t>
+            </w:r>
+            <w:proofErr w:type="spellStart"/>
+            <w:proofErr w:type="gramStart"/>
+            <w:r>
+              <w:t>SizedBox</w:t>
+            </w:r>
+            <w:proofErr w:type="spellEnd"/>
+            <w:r>
+              <w:t>(</w:t>
+            </w:r>
+            <w:proofErr w:type="spellStart"/>
+            <w:proofErr w:type="gramEnd"/>
+            <w:r>
+              <w:t>height</w:t>
+            </w:r>
+            <w:proofErr w:type="spellEnd"/>
+            <w:r>
+              <w:t>: 10),</w:t>
+            </w:r>
+          </w:p>
+          <w:p>
+            <w:pPr>
+              <w:cnfStyle w:val="000000000000" w:firstRow="0" w:lastRow="0" w:firstColumn="0" w:lastColumn="0" w:oddVBand="0" w:evenVBand="0" w:oddHBand="0" w:evenHBand="0" w:firstRowFirstColumn="0" w:firstRowLastColumn="0" w:lastRowFirstColumn="0" w:lastRowLastColumn="0"/>
+            </w:pPr>
+            <w:r>
+              <w:t xml:space="preserve">              </w:t>
+            </w:r>
+            <w:proofErr w:type="gramStart"/>
+            <w:r>
+              <w:t>Text(</w:t>
+            </w:r>
+            <w:proofErr w:type="gramEnd"/>
+          </w:p>
+          <w:p>
+            <w:pPr>
+              <w:cnfStyle w:val="000000000000" w:firstRow="0" w:lastRow="0" w:firstColumn="0" w:lastColumn="0" w:oddVBand="0" w:evenVBand="0" w:oddHBand="0" w:evenHBand="0" w:firstRowFirstColumn="0" w:firstRowLastColumn="0" w:lastRowFirstColumn="0" w:lastRowLastColumn="0"/>
+            </w:pPr>
+            <w:r>
+              <w:t xml:space="preserve">                'Tu apoyo me ayuda a seguir mejorando esta aplicación.',</w:t>
+            </w:r>
+          </w:p>
+          <w:p>
+            <w:pPr>
+              <w:cnfStyle w:val="000000000000" w:firstRow="0" w:lastRow="0" w:firstColumn="0" w:lastColumn="0" w:oddVBand="0" w:evenVBand="0" w:oddHBand="0" w:evenHBand="0" w:firstRowFirstColumn="0" w:firstRowLastColumn="0" w:lastRowFirstColumn="0" w:lastRowLastColumn="0"/>
+            </w:pPr>
+            <w:r>
+              <w:t xml:space="preserve">                </w:t>
+            </w:r>
+            <w:proofErr w:type="spellStart"/>
+            <w:r>
+              <w:t>style</w:t>
+            </w:r>
+            <w:proofErr w:type="spellEnd"/>
+            <w:r>
+              <w:t xml:space="preserve">: </w:t>
+            </w:r>
+            <w:proofErr w:type="spellStart"/>
+            <w:r>
+              <w:t>Theme.of</w:t>
+            </w:r>
+            <w:proofErr w:type="spellEnd"/>
+            <w:r>
+              <w:t>(</w:t>
+            </w:r>
+            <w:proofErr w:type="spellStart"/>
+            <w:r>
+              <w:t>context</w:t>
+            </w:r>
+            <w:proofErr w:type="spellEnd"/>
+            <w:proofErr w:type="gramStart"/>
+            <w:r>
+              <w:t>).</w:t>
+            </w:r>
+            <w:proofErr w:type="spellStart"/>
+            <w:r>
+              <w:t>textTheme.bodyMedium</w:t>
+            </w:r>
+            <w:proofErr w:type="spellEnd"/>
+            <w:proofErr w:type="gramEnd"/>
+            <w:r>
+              <w:t>,</w:t>
+            </w:r>
+          </w:p>
+          <w:p>
+            <w:pPr>
+              <w:cnfStyle w:val="000000000000" w:firstRow="0" w:lastRow="0" w:firstColumn="0" w:lastColumn="0" w:oddVBand="0" w:evenVBand="0" w:oddHBand="0" w:evenHBand="0" w:firstRowFirstColumn="0" w:firstRowLastColumn="0" w:lastRowFirstColumn="0" w:lastRowLastColumn="0"/>
+            </w:pPr>
+            <w:r>
+              <w:t xml:space="preserve">                </w:t>
+            </w:r>
+            <w:proofErr w:type="spellStart"/>
+            <w:r>
+              <w:t>textAlign</w:t>
+            </w:r>
+            <w:proofErr w:type="spellEnd"/>
+            <w:r>
+              <w:t xml:space="preserve">: </w:t>
+            </w:r>
+            <w:proofErr w:type="spellStart"/>
+            <w:r>
+              <w:t>TextAlign.center</w:t>
+            </w:r>
+            <w:proofErr w:type="spellEnd"/>
+            <w:r>
+              <w:t>,</w:t>
+            </w:r>
+          </w:p>
+          <w:p>
+            <w:pPr>
+              <w:cnfStyle w:val="000000000000" w:firstRow="0" w:lastRow="0" w:firstColumn="0" w:lastColumn="0" w:oddVBand="0" w:evenVBand="0" w:oddHBand="0" w:evenHBand="0" w:firstRowFirstColumn="0" w:firstRowLastColumn="0" w:lastRowFirstColumn="0" w:lastRowLastColumn="0"/>
+            </w:pPr>
+            <w:r>
+              <w:t xml:space="preserve">              ),</w:t>
+            </w:r>
+          </w:p>
+          <w:p>
+            <w:pPr>
+              <w:cnfStyle w:val="000000000000" w:firstRow="0" w:lastRow="0" w:firstColumn="0" w:lastColumn="0" w:oddVBand="0" w:evenVBand="0" w:oddHBand="0" w:evenHBand="0" w:firstRowFirstColumn="0" w:firstRowLastColumn="0" w:lastRowFirstColumn="0" w:lastRowLastColumn="0"/>
+            </w:pPr>
+            <w:r>
+              <w:t xml:space="preserve">              </w:t>
+            </w:r>
+            <w:proofErr w:type="spellStart"/>
+            <w:r>
+              <w:t>const</w:t>
+            </w:r>
+            <w:proofErr w:type="spellEnd"/>
+            <w:r>
+              <w:t xml:space="preserve"> </w:t>
+            </w:r>
+            <w:proofErr w:type="spellStart"/>
+            <w:proofErr w:type="gramStart"/>
+            <w:r>
+              <w:t>SizedBox</w:t>
+            </w:r>
+            <w:proofErr w:type="spellEnd"/>
+            <w:r>
+              <w:t>(</w:t>
+            </w:r>
+            <w:proofErr w:type="spellStart"/>
+            <w:proofErr w:type="gramEnd"/>
+            <w:r>
+              <w:t>height</w:t>
+            </w:r>
+            <w:proofErr w:type="spellEnd"/>
+            <w:r>
+              <w:t>: 24),</w:t>
+            </w:r>
+          </w:p>
+          <w:p>
+            <w:pPr>
+              <w:cnfStyle w:val="000000000000" w:firstRow="0" w:lastRow="0" w:firstColumn="0" w:lastColumn="0" w:oddVBand="0" w:evenVBand="0" w:oddHBand="0" w:evenHBand="0" w:firstRowFirstColumn="0" w:firstRowLastColumn="0" w:lastRowFirstColumn="0" w:lastRowLastColumn="0"/>
+            </w:pPr>
+            <w:r>
+              <w:t xml:space="preserve">              </w:t>
+            </w:r>
+          </w:p>
+          <w:p>
+            <w:pPr>
+              <w:cnfStyle w:val="000000000000" w:firstRow="0" w:lastRow="0" w:firstColumn="0" w:lastColumn="0" w:oddVBand="0" w:evenVBand="0" w:oddHBand="0" w:evenHBand="0" w:firstRowFirstColumn="0" w:firstRowLastColumn="0" w:lastRowFirstColumn="0" w:lastRowLastColumn="0"/>
+            </w:pPr>
+            <w:r>
+              <w:t xml:space="preserve">              // Botón Pago Móvil BDV</w:t>
+            </w:r>
+          </w:p>
+          <w:p>
+            <w:pPr>
+              <w:cnfStyle w:val="000000000000" w:firstRow="0" w:lastRow="0" w:firstColumn="0" w:lastColumn="0" w:oddVBand="0" w:evenVBand="0" w:oddHBand="0" w:evenHBand="0" w:firstRowFirstColumn="0" w:firstRowLastColumn="0" w:lastRowFirstColumn="0" w:lastRowLastColumn="0"/>
+            </w:pPr>
+            <w:r>
+              <w:t xml:space="preserve">              </w:t>
+            </w:r>
+            <w:proofErr w:type="spellStart"/>
+            <w:r>
+              <w:t>ElevatedButton.icon</w:t>
+            </w:r>
+            <w:proofErr w:type="spellEnd"/>
+            <w:r>
+              <w:t>(</w:t>
+            </w:r>
+          </w:p>
+          <w:p>
+            <w:pPr>
+              <w:cnfStyle w:val="000000000000" w:firstRow="0" w:lastRow="0" w:firstColumn="0" w:lastColumn="0" w:oddVBand="0" w:evenVBand="0" w:oddHBand="0" w:evenHBand="0" w:firstRowFirstColumn="0" w:firstRowLastColumn="0" w:lastRowFirstColumn="0" w:lastRowLastColumn="0"/>
+            </w:pPr>
+            <w:r>
+              <w:t xml:space="preserve">                </w:t>
+            </w:r>
+            <w:proofErr w:type="spellStart"/>
+            <w:r>
+              <w:t>onPressed</w:t>
+            </w:r>
+            <w:proofErr w:type="spellEnd"/>
+            <w:r>
+              <w:t>: () {</w:t>
+            </w:r>
+          </w:p>
+          <w:p>
+            <w:pPr>
+              <w:cnfStyle w:val="000000000000" w:firstRow="0" w:lastRow="0" w:firstColumn="0" w:lastColumn="0" w:oddVBand="0" w:evenVBand="0" w:oddHBand="0" w:evenHBand="0" w:firstRowFirstColumn="0" w:firstRowLastColumn="0" w:lastRowFirstColumn="0" w:lastRowLastColumn="0"/>
+            </w:pPr>
+            <w:r>
+              <w:t xml:space="preserve">                  </w:t>
+            </w:r>
+            <w:proofErr w:type="spellStart"/>
+            <w:r>
+              <w:t>Clipboard.setData</w:t>
+            </w:r>
+            <w:proofErr w:type="spellEnd"/>
+            <w:r>
+              <w:t>(</w:t>
+            </w:r>
+          </w:p>
+          <w:p>
+            <w:pPr>
+              <w:cnfStyle w:val="000000000000" w:firstRow="0" w:lastRow="0" w:firstColumn="0" w:lastColumn="0" w:oddVBand="0" w:evenVBand="0" w:oddHBand="0" w:evenHBand="0" w:firstRowFirstColumn="0" w:firstRowLastColumn="0" w:lastRowFirstColumn="0" w:lastRowLastColumn="0"/>
+            </w:pPr>
+            <w:r>
+              <w:t xml:space="preserve">                      </w:t>
+            </w:r>
+            <w:proofErr w:type="spellStart"/>
+            <w:r>
+              <w:t>const</w:t>
+            </w:r>
+            <w:proofErr w:type="spellEnd"/>
+            <w:r>
+              <w:t xml:space="preserve"> </w:t>
+            </w:r>
+            <w:proofErr w:type="spellStart"/>
+            <w:proofErr w:type="gramStart"/>
+            <w:r>
+              <w:t>ClipboardData</w:t>
+            </w:r>
+            <w:proofErr w:type="spellEnd"/>
+            <w:r>
+              <w:t>(</w:t>
+            </w:r>
+            <w:proofErr w:type="spellStart"/>
+            <w:proofErr w:type="gramEnd"/>
+            <w:r>
+              <w:t>text</w:t>
+            </w:r>
+            <w:proofErr w:type="spellEnd"/>
+            <w:r>
+              <w:t>: '0102 04268947660 8033311'));</w:t>
+            </w:r>
+          </w:p>
+          <w:p>
+            <w:pPr>
+              <w:cnfStyle w:val="000000000000" w:firstRow="0" w:lastRow="0" w:firstColumn="0" w:lastColumn="0" w:oddVBand="0" w:evenVBand="0" w:oddHBand="0" w:evenHBand="0" w:firstRowFirstColumn="0" w:firstRowLastColumn="0" w:lastRowFirstColumn="0" w:lastRowLastColumn="0"/>
+            </w:pPr>
+            <w:r>
+              <w:t xml:space="preserve">                  </w:t>
+            </w:r>
+            <w:proofErr w:type="spellStart"/>
+            <w:r>
+              <w:t>Navigator.pop</w:t>
+            </w:r>
+            <w:proofErr w:type="spellEnd"/>
+            <w:r>
+              <w:t>(</w:t>
+            </w:r>
+            <w:proofErr w:type="spellStart"/>
+            <w:r>
+              <w:t>context</w:t>
+            </w:r>
+            <w:proofErr w:type="spellEnd"/>
+            <w:r>
+              <w:t>); // Cierra el modal</w:t>
+            </w:r>
+          </w:p>
+          <w:p>
+            <w:pPr>
+              <w:cnfStyle w:val="000000000000" w:firstRow="0" w:lastRow="0" w:firstColumn="0" w:lastColumn="0" w:oddVBand="0" w:evenVBand="0" w:oddHBand="0" w:evenHBand="0" w:firstRowFirstColumn="0" w:firstRowLastColumn="0" w:lastRowFirstColumn="0" w:lastRowLastColumn="0"/>
+            </w:pPr>
+            <w:r>
+              <w:t xml:space="preserve">                  </w:t>
+            </w:r>
+            <w:proofErr w:type="spellStart"/>
+            <w:r>
+              <w:t>ScaffoldMessenger.of</w:t>
+            </w:r>
+            <w:proofErr w:type="spellEnd"/>
+            <w:r>
+              <w:t>(</w:t>
+            </w:r>
+            <w:proofErr w:type="spellStart"/>
+            <w:r>
+              <w:t>context</w:t>
+            </w:r>
+            <w:proofErr w:type="spellEnd"/>
+            <w:proofErr w:type="gramStart"/>
+            <w:r>
+              <w:t>).</w:t>
+            </w:r>
+            <w:proofErr w:type="spellStart"/>
+            <w:r>
+              <w:t>showSnackBar</w:t>
+            </w:r>
+            <w:proofErr w:type="spellEnd"/>
+            <w:proofErr w:type="gramEnd"/>
+            <w:r>
+              <w:t>(</w:t>
+            </w:r>
+          </w:p>
+          <w:p>
+            <w:pPr>
+              <w:cnfStyle w:val="000000000000" w:firstRow="0" w:lastRow="0" w:firstColumn="0" w:lastColumn="0" w:oddVBand="0" w:evenVBand="0" w:oddHBand="0" w:evenHBand="0" w:firstRowFirstColumn="0" w:firstRowLastColumn="0" w:lastRowFirstColumn="0" w:lastRowLastColumn="0"/>
+            </w:pPr>
+            <w:r>
+              <w:t xml:space="preserve">                    </w:t>
+            </w:r>
+            <w:proofErr w:type="spellStart"/>
+            <w:r>
+              <w:t>const</w:t>
+            </w:r>
+            <w:proofErr w:type="spellEnd"/>
+            <w:r>
+              <w:t xml:space="preserve"> </w:t>
+            </w:r>
+            <w:proofErr w:type="spellStart"/>
+            <w:proofErr w:type="gramStart"/>
+            <w:r>
+              <w:t>SnackBar</w:t>
+            </w:r>
+            <w:proofErr w:type="spellEnd"/>
+            <w:r>
+              <w:t>(</w:t>
+            </w:r>
+            <w:proofErr w:type="gramEnd"/>
+          </w:p>
+          <w:p>
+            <w:pPr>
+              <w:cnfStyle w:val="000000000000" w:firstRow="0" w:lastRow="0" w:firstColumn="0" w:lastColumn="0" w:oddVBand="0" w:evenVBand="0" w:oddHBand="0" w:evenHBand="0" w:firstRowFirstColumn="0" w:firstRowLastColumn="0" w:lastRowFirstColumn="0" w:lastRowLastColumn="0"/>
+            </w:pPr>
+            <w:r>
+              <w:t xml:space="preserve">                      </w:t>
+            </w:r>
+            <w:proofErr w:type="spellStart"/>
+            <w:r>
+              <w:t>content</w:t>
+            </w:r>
+            <w:proofErr w:type="spellEnd"/>
+            <w:r>
+              <w:t xml:space="preserve">: </w:t>
+            </w:r>
+            <w:proofErr w:type="gramStart"/>
+            <w:r>
+              <w:t>Text(</w:t>
+            </w:r>
+            <w:proofErr w:type="gramEnd"/>
+            <w:r>
+              <w:t>'¡Datos copiados! Ábrelo en tu app del BDV o Mercantil'),</w:t>
+            </w:r>
+          </w:p>
+          <w:p>
+            <w:pPr>
+              <w:cnfStyle w:val="000000000000" w:firstRow="0" w:lastRow="0" w:firstColumn="0" w:lastColumn="0" w:oddVBand="0" w:evenVBand="0" w:oddHBand="0" w:evenHBand="0" w:firstRowFirstColumn="0" w:firstRowLastColumn="0" w:lastRowFirstColumn="0" w:lastRowLastColumn="0"/>
+            </w:pPr>
+            <w:r>
+              <w:t xml:space="preserve">                      </w:t>
+            </w:r>
+            <w:proofErr w:type="spellStart"/>
+            <w:r>
+              <w:t>duration</w:t>
+            </w:r>
+            <w:proofErr w:type="spellEnd"/>
+            <w:r>
+              <w:t xml:space="preserve">: </w:t>
+            </w:r>
+            <w:proofErr w:type="spellStart"/>
+            <w:proofErr w:type="gramStart"/>
+            <w:r>
+              <w:t>Duration</w:t>
+            </w:r>
+            <w:proofErr w:type="spellEnd"/>
+            <w:r>
+              <w:t>(</w:t>
+            </w:r>
+            <w:proofErr w:type="spellStart"/>
+            <w:proofErr w:type="gramEnd"/>
+            <w:r>
+              <w:t>seconds</w:t>
+            </w:r>
+            <w:proofErr w:type="spellEnd"/>
+            <w:r>
+              <w:t>: 3),</w:t>
+            </w:r>
+          </w:p>
+          <w:p>
+            <w:pPr>
+              <w:cnfStyle w:val="000000000000" w:firstRow="0" w:lastRow="0" w:firstColumn="0" w:lastColumn="0" w:oddVBand="0" w:evenVBand="0" w:oddHBand="0" w:evenHBand="0" w:firstRowFirstColumn="0" w:firstRowLastColumn="0" w:lastRowFirstColumn="0" w:lastRowLastColumn="0"/>
+            </w:pPr>
+            <w:r>
+              <w:t xml:space="preserve">                    ),</w:t>
+            </w:r>
+          </w:p>
+          <w:p>
+            <w:pPr>
+              <w:cnfStyle w:val="000000000000" w:firstRow="0" w:lastRow="0" w:firstColumn="0" w:lastColumn="0" w:oddVBand="0" w:evenVBand="0" w:oddHBand="0" w:evenHBand="0" w:firstRowFirstColumn="0" w:firstRowLastColumn="0" w:lastRowFirstColumn="0" w:lastRowLastColumn="0"/>
+            </w:pPr>
+            <w:r>
+              <w:t xml:space="preserve">                  );</w:t>
+            </w:r>
+          </w:p>
+          <w:p>
+            <w:pPr>
+              <w:cnfStyle w:val="000000000000" w:firstRow="0" w:lastRow="0" w:firstColumn="0" w:lastColumn="0" w:oddVBand="0" w:evenVBand="0" w:oddHBand="0" w:evenHBand="0" w:firstRowFirstColumn="0" w:firstRowLastColumn="0" w:lastRowFirstColumn="0" w:lastRowLastColumn="0"/>
+            </w:pPr>
+            <w:r>
+              <w:t xml:space="preserve">                },</w:t>
+            </w:r>
+          </w:p>
+          <w:p>
+            <w:pPr>
+              <w:cnfStyle w:val="000000000000" w:firstRow="0" w:lastRow="0" w:firstColumn="0" w:lastColumn="0" w:oddVBand="0" w:evenVBand="0" w:oddHBand="0" w:evenHBand="0" w:firstRowFirstColumn="0" w:firstRowLastColumn="0" w:lastRowFirstColumn="0" w:lastRowLastColumn="0"/>
+            </w:pPr>
+            <w:r>
+              <w:t xml:space="preserve">                </w:t>
+            </w:r>
+            <w:proofErr w:type="spellStart"/>
+            <w:r>
+              <w:t>icon</w:t>
+            </w:r>
+            <w:proofErr w:type="spellEnd"/>
+            <w:r>
+              <w:t xml:space="preserve">: </w:t>
+            </w:r>
+            <w:proofErr w:type="spellStart"/>
+            <w:r>
+              <w:t>const</w:t>
+            </w:r>
+            <w:proofErr w:type="spellEnd"/>
+            <w:r>
+              <w:t xml:space="preserve"> </w:t>
+            </w:r>
+            <w:proofErr w:type="spellStart"/>
+            <w:proofErr w:type="gramStart"/>
+            <w:r>
+              <w:t>Icon</w:t>
+            </w:r>
+            <w:proofErr w:type="spellEnd"/>
+            <w:r>
+              <w:t>(</w:t>
+            </w:r>
+            <w:proofErr w:type="spellStart"/>
+            <w:proofErr w:type="gramEnd"/>
+            <w:r>
+              <w:t>Icons.account_balance</w:t>
+            </w:r>
+            <w:proofErr w:type="spellEnd"/>
+            <w:r>
+              <w:t xml:space="preserve">, color: </w:t>
+            </w:r>
+            <w:proofErr w:type="spellStart"/>
+            <w:r>
+              <w:t>Colors.blue</w:t>
+            </w:r>
+            <w:proofErr w:type="spellEnd"/>
+            <w:r>
+              <w:t>),</w:t>
+            </w:r>
+          </w:p>
+          <w:p>
+            <w:pPr>
+              <w:cnfStyle w:val="000000000000" w:firstRow="0" w:lastRow="0" w:firstColumn="0" w:lastColumn="0" w:oddVBand="0" w:evenVBand="0" w:oddHBand="0" w:evenHBand="0" w:firstRowFirstColumn="0" w:firstRowLastColumn="0" w:lastRowFirstColumn="0" w:lastRowLastColumn="0"/>
+            </w:pPr>
+            <w:r>
+              <w:t xml:space="preserve">                </w:t>
+            </w:r>
+            <w:proofErr w:type="spellStart"/>
+            <w:r>
+              <w:t>label</w:t>
+            </w:r>
+            <w:proofErr w:type="spellEnd"/>
+            <w:r>
+              <w:t xml:space="preserve">: </w:t>
+            </w:r>
+            <w:proofErr w:type="spellStart"/>
+            <w:r>
+              <w:t>const</w:t>
+            </w:r>
+            <w:proofErr w:type="spellEnd"/>
+            <w:r>
+              <w:t xml:space="preserve"> </w:t>
+            </w:r>
+            <w:proofErr w:type="gramStart"/>
+            <w:r>
+              <w:t>Text(</w:t>
+            </w:r>
+            <w:proofErr w:type="gramEnd"/>
+            <w:r>
+              <w:t>'Copiar datos de Pago Móvil (BDV)'),</w:t>
+            </w:r>
+          </w:p>
+          <w:p>
+            <w:pPr>
+              <w:cnfStyle w:val="000000000000" w:firstRow="0" w:lastRow="0" w:firstColumn="0" w:lastColumn="0" w:oddVBand="0" w:evenVBand="0" w:oddHBand="0" w:evenHBand="0" w:firstRowFirstColumn="0" w:firstRowLastColumn="0" w:lastRowFirstColumn="0" w:lastRowLastColumn="0"/>
+            </w:pPr>
+            <w:r>
+              <w:t xml:space="preserve">                </w:t>
+            </w:r>
+            <w:proofErr w:type="spellStart"/>
+            <w:r>
+              <w:t>style</w:t>
+            </w:r>
+            <w:proofErr w:type="spellEnd"/>
+            <w:r>
+              <w:t xml:space="preserve">: </w:t>
+            </w:r>
+            <w:proofErr w:type="spellStart"/>
+            <w:r>
+              <w:t>ElevatedButton.styleFrom</w:t>
+            </w:r>
+            <w:proofErr w:type="spellEnd"/>
+            <w:r>
+              <w:t>(</w:t>
+            </w:r>
+          </w:p>
+          <w:p>
+            <w:pPr>
+              <w:cnfStyle w:val="000000000000" w:firstRow="0" w:lastRow="0" w:firstColumn="0" w:lastColumn="0" w:oddVBand="0" w:evenVBand="0" w:oddHBand="0" w:evenHBand="0" w:firstRowFirstColumn="0" w:firstRowLastColumn="0" w:lastRowFirstColumn="0" w:lastRowLastColumn="0"/>
+            </w:pPr>
+            <w:r>
+              <w:t xml:space="preserve">                  </w:t>
+            </w:r>
+            <w:proofErr w:type="spellStart"/>
+            <w:r>
+              <w:t>minimumSize</w:t>
+            </w:r>
+            <w:proofErr w:type="spellEnd"/>
+            <w:r>
+              <w:t xml:space="preserve">: </w:t>
+            </w:r>
+            <w:proofErr w:type="spellStart"/>
+            <w:r>
+              <w:t>const</w:t>
+            </w:r>
+            <w:proofErr w:type="spellEnd"/>
+            <w:r>
+              <w:t xml:space="preserve"> </w:t>
+            </w:r>
+            <w:proofErr w:type="spellStart"/>
+            <w:r>
+              <w:t>Size.fromHeight</w:t>
+            </w:r>
+            <w:proofErr w:type="spellEnd"/>
+            <w:r>
+              <w:t>(50),</w:t>
+            </w:r>
+          </w:p>
+          <w:p>
+            <w:pPr>
+              <w:cnfStyle w:val="000000000000" w:firstRow="0" w:lastRow="0" w:firstColumn="0" w:lastColumn="0" w:oddVBand="0" w:evenVBand="0" w:oddHBand="0" w:evenHBand="0" w:firstRowFirstColumn="0" w:firstRowLastColumn="0" w:lastRowFirstColumn="0" w:lastRowLastColumn="0"/>
+            </w:pPr>
+            <w:r>
+              <w:lastRenderedPageBreak/>
+              <w:t xml:space="preserve">                  </w:t>
+            </w:r>
+            <w:proofErr w:type="spellStart"/>
+            <w:r>
+              <w:t>shape</w:t>
+            </w:r>
+            <w:proofErr w:type="spellEnd"/>
+            <w:r>
+              <w:t xml:space="preserve">: </w:t>
+            </w:r>
+            <w:proofErr w:type="spellStart"/>
+            <w:proofErr w:type="gramStart"/>
+            <w:r>
+              <w:t>RoundedRectangleBorder</w:t>
+            </w:r>
+            <w:proofErr w:type="spellEnd"/>
+            <w:r>
+              <w:t>(</w:t>
+            </w:r>
+            <w:proofErr w:type="gramEnd"/>
+          </w:p>
+          <w:p>
+            <w:pPr>
+              <w:cnfStyle w:val="000000000000" w:firstRow="0" w:lastRow="0" w:firstColumn="0" w:lastColumn="0" w:oddVBand="0" w:evenVBand="0" w:oddHBand="0" w:evenHBand="0" w:firstRowFirstColumn="0" w:firstRowLastColumn="0" w:lastRowFirstColumn="0" w:lastRowLastColumn="0"/>
+            </w:pPr>
+            <w:r>
+              <w:t xml:space="preserve">                    </w:t>
+            </w:r>
+            <w:proofErr w:type="spellStart"/>
+            <w:r>
+              <w:t>borderRadius</w:t>
+            </w:r>
+            <w:proofErr w:type="spellEnd"/>
+            <w:r>
+              <w:t xml:space="preserve">: </w:t>
+            </w:r>
+            <w:proofErr w:type="spellStart"/>
+            <w:r>
+              <w:t>BorderRadius.circular</w:t>
+            </w:r>
+            <w:proofErr w:type="spellEnd"/>
+            <w:r>
+              <w:t>(12),</w:t>
+            </w:r>
+          </w:p>
+          <w:p>
+            <w:pPr>
+              <w:cnfStyle w:val="000000000000" w:firstRow="0" w:lastRow="0" w:firstColumn="0" w:lastColumn="0" w:oddVBand="0" w:evenVBand="0" w:oddHBand="0" w:evenHBand="0" w:firstRowFirstColumn="0" w:firstRowLastColumn="0" w:lastRowFirstColumn="0" w:lastRowLastColumn="0"/>
+            </w:pPr>
+            <w:r>
+              <w:t xml:space="preserve">                  ),</w:t>
+            </w:r>
+          </w:p>
+          <w:p>
+            <w:pPr>
+              <w:cnfStyle w:val="000000000000" w:firstRow="0" w:lastRow="0" w:firstColumn="0" w:lastColumn="0" w:oddVBand="0" w:evenVBand="0" w:oddHBand="0" w:evenHBand="0" w:firstRowFirstColumn="0" w:firstRowLastColumn="0" w:lastRowFirstColumn="0" w:lastRowLastColumn="0"/>
+            </w:pPr>
+            <w:r>
+              <w:t xml:space="preserve">                ),</w:t>
+            </w:r>
+          </w:p>
+          <w:p>
+            <w:pPr>
+              <w:cnfStyle w:val="000000000000" w:firstRow="0" w:lastRow="0" w:firstColumn="0" w:lastColumn="0" w:oddVBand="0" w:evenVBand="0" w:oddHBand="0" w:evenHBand="0" w:firstRowFirstColumn="0" w:firstRowLastColumn="0" w:lastRowFirstColumn="0" w:lastRowLastColumn="0"/>
+            </w:pPr>
+            <w:r>
+              <w:t xml:space="preserve">              ),</w:t>
+            </w:r>
+          </w:p>
+          <w:p>
+            <w:pPr>
+              <w:cnfStyle w:val="000000000000" w:firstRow="0" w:lastRow="0" w:firstColumn="0" w:lastColumn="0" w:oddVBand="0" w:evenVBand="0" w:oddHBand="0" w:evenHBand="0" w:firstRowFirstColumn="0" w:firstRowLastColumn="0" w:lastRowFirstColumn="0" w:lastRowLastColumn="0"/>
+            </w:pPr>
+            <w:r>
+              <w:t xml:space="preserve">              </w:t>
+            </w:r>
+            <w:proofErr w:type="spellStart"/>
+            <w:r>
+              <w:t>const</w:t>
+            </w:r>
+            <w:proofErr w:type="spellEnd"/>
+            <w:r>
+              <w:t xml:space="preserve"> </w:t>
+            </w:r>
+            <w:proofErr w:type="spellStart"/>
+            <w:proofErr w:type="gramStart"/>
+            <w:r>
+              <w:t>SizedBox</w:t>
+            </w:r>
+            <w:proofErr w:type="spellEnd"/>
+            <w:r>
+              <w:t>(</w:t>
+            </w:r>
+            <w:proofErr w:type="spellStart"/>
+            <w:proofErr w:type="gramEnd"/>
+            <w:r>
+              <w:t>height</w:t>
+            </w:r>
+            <w:proofErr w:type="spellEnd"/>
+            <w:r>
+              <w:t>: 12),</w:t>
+            </w:r>
+          </w:p>
+          <w:p>
+            <w:pPr>
+              <w:cnfStyle w:val="000000000000" w:firstRow="0" w:lastRow="0" w:firstColumn="0" w:lastColumn="0" w:oddVBand="0" w:evenVBand="0" w:oddHBand="0" w:evenHBand="0" w:firstRowFirstColumn="0" w:firstRowLastColumn="0" w:lastRowFirstColumn="0" w:lastRowLastColumn="0"/>
+            </w:pPr>
+            <w:r>
+              <w:t xml:space="preserve">              // Botón Pago Móvil Mercantil</w:t>
+            </w:r>
+          </w:p>
+          <w:p>
+            <w:pPr>
+              <w:cnfStyle w:val="000000000000" w:firstRow="0" w:lastRow="0" w:firstColumn="0" w:lastColumn="0" w:oddVBand="0" w:evenVBand="0" w:oddHBand="0" w:evenHBand="0" w:firstRowFirstColumn="0" w:firstRowLastColumn="0" w:lastRowFirstColumn="0" w:lastRowLastColumn="0"/>
+            </w:pPr>
+            <w:r>
+              <w:t xml:space="preserve">              </w:t>
+            </w:r>
+            <w:proofErr w:type="spellStart"/>
+            <w:r>
+              <w:t>ElevatedButton.icon</w:t>
+            </w:r>
+            <w:proofErr w:type="spellEnd"/>
+            <w:r>
+              <w:t>(</w:t>
+            </w:r>
+          </w:p>
+          <w:p>
+            <w:pPr>
+              <w:cnfStyle w:val="000000000000" w:firstRow="0" w:lastRow="0" w:firstColumn="0" w:lastColumn="0" w:oddVBand="0" w:evenVBand="0" w:oddHBand="0" w:evenHBand="0" w:firstRowFirstColumn="0" w:firstRowLastColumn="0" w:lastRowFirstColumn="0" w:lastRowLastColumn="0"/>
+            </w:pPr>
+            <w:r>
+              <w:t xml:space="preserve">                </w:t>
+            </w:r>
+            <w:proofErr w:type="spellStart"/>
+            <w:r>
+              <w:t>onPressed</w:t>
+            </w:r>
+            <w:proofErr w:type="spellEnd"/>
+            <w:r>
+              <w:t>: () {</w:t>
+            </w:r>
+          </w:p>
+          <w:p>
+            <w:pPr>
+              <w:cnfStyle w:val="000000000000" w:firstRow="0" w:lastRow="0" w:firstColumn="0" w:lastColumn="0" w:oddVBand="0" w:evenVBand="0" w:oddHBand="0" w:evenHBand="0" w:firstRowFirstColumn="0" w:firstRowLastColumn="0" w:lastRowFirstColumn="0" w:lastRowLastColumn="0"/>
+            </w:pPr>
+            <w:r>
+              <w:t xml:space="preserve">                  </w:t>
+            </w:r>
+            <w:proofErr w:type="spellStart"/>
+            <w:r>
+              <w:t>Clipboard.setData</w:t>
+            </w:r>
+            <w:proofErr w:type="spellEnd"/>
+            <w:r>
+              <w:t>(</w:t>
+            </w:r>
+          </w:p>
+          <w:p>
+            <w:pPr>
+              <w:cnfStyle w:val="000000000000" w:firstRow="0" w:lastRow="0" w:firstColumn="0" w:lastColumn="0" w:oddVBand="0" w:evenVBand="0" w:oddHBand="0" w:evenHBand="0" w:firstRowFirstColumn="0" w:firstRowLastColumn="0" w:lastRowFirstColumn="0" w:lastRowLastColumn="0"/>
+            </w:pPr>
+            <w:r>
+              <w:t xml:space="preserve">                      </w:t>
+            </w:r>
+            <w:proofErr w:type="spellStart"/>
+            <w:r>
+              <w:t>const</w:t>
+            </w:r>
+            <w:proofErr w:type="spellEnd"/>
+            <w:r>
+              <w:t xml:space="preserve"> </w:t>
+            </w:r>
+            <w:proofErr w:type="spellStart"/>
+            <w:proofErr w:type="gramStart"/>
+            <w:r>
+              <w:t>ClipboardData</w:t>
+            </w:r>
+            <w:proofErr w:type="spellEnd"/>
+            <w:r>
+              <w:t>(</w:t>
+            </w:r>
+            <w:proofErr w:type="spellStart"/>
+            <w:proofErr w:type="gramEnd"/>
+            <w:r>
+              <w:t>text</w:t>
+            </w:r>
+            <w:proofErr w:type="spellEnd"/>
+            <w:r>
+              <w:t>: '0105 04268947660 8033311'));</w:t>
+            </w:r>
+          </w:p>
+          <w:p>
+            <w:pPr>
+              <w:cnfStyle w:val="000000000000" w:firstRow="0" w:lastRow="0" w:firstColumn="0" w:lastColumn="0" w:oddVBand="0" w:evenVBand="0" w:oddHBand="0" w:evenHBand="0" w:firstRowFirstColumn="0" w:firstRowLastColumn="0" w:lastRowFirstColumn="0" w:lastRowLastColumn="0"/>
+            </w:pPr>
+            <w:r>
+              <w:t xml:space="preserve">                  </w:t>
+            </w:r>
+            <w:proofErr w:type="spellStart"/>
+            <w:r>
+              <w:t>Navigator.pop</w:t>
+            </w:r>
+            <w:proofErr w:type="spellEnd"/>
+            <w:r>
+              <w:t>(</w:t>
+            </w:r>
+            <w:proofErr w:type="spellStart"/>
+            <w:r>
+              <w:t>context</w:t>
+            </w:r>
+            <w:proofErr w:type="spellEnd"/>
+            <w:r>
+              <w:t>); // Cierra el modal</w:t>
+            </w:r>
+          </w:p>
+          <w:p>
+            <w:pPr>
+              <w:cnfStyle w:val="000000000000" w:firstRow="0" w:lastRow="0" w:firstColumn="0" w:lastColumn="0" w:oddVBand="0" w:evenVBand="0" w:oddHBand="0" w:evenHBand="0" w:firstRowFirstColumn="0" w:firstRowLastColumn="0" w:lastRowFirstColumn="0" w:lastRowLastColumn="0"/>
+            </w:pPr>
+            <w:r>
+              <w:t xml:space="preserve">                  </w:t>
+            </w:r>
+            <w:proofErr w:type="spellStart"/>
+            <w:r>
+              <w:t>ScaffoldMessenger.of</w:t>
+            </w:r>
+            <w:proofErr w:type="spellEnd"/>
+            <w:r>
+              <w:t>(</w:t>
+            </w:r>
+            <w:proofErr w:type="spellStart"/>
+            <w:r>
+              <w:t>context</w:t>
+            </w:r>
+            <w:proofErr w:type="spellEnd"/>
+            <w:proofErr w:type="gramStart"/>
+            <w:r>
+              <w:t>).</w:t>
+            </w:r>
+            <w:proofErr w:type="spellStart"/>
+            <w:r>
+              <w:t>showSnackBar</w:t>
+            </w:r>
+            <w:proofErr w:type="spellEnd"/>
+            <w:proofErr w:type="gramEnd"/>
+            <w:r>
+              <w:t>(</w:t>
+            </w:r>
+          </w:p>
+          <w:p>
+            <w:pPr>
+              <w:cnfStyle w:val="000000000000" w:firstRow="0" w:lastRow="0" w:firstColumn="0" w:lastColumn="0" w:oddVBand="0" w:evenVBand="0" w:oddHBand="0" w:evenHBand="0" w:firstRowFirstColumn="0" w:firstRowLastColumn="0" w:lastRowFirstColumn="0" w:lastRowLastColumn="0"/>
+            </w:pPr>
+            <w:r>
+              <w:t xml:space="preserve">                    </w:t>
+            </w:r>
+            <w:proofErr w:type="spellStart"/>
+            <w:r>
+              <w:t>const</w:t>
+            </w:r>
+            <w:proofErr w:type="spellEnd"/>
+            <w:r>
+              <w:t xml:space="preserve"> </w:t>
+            </w:r>
+            <w:proofErr w:type="spellStart"/>
+            <w:proofErr w:type="gramStart"/>
+            <w:r>
+              <w:t>SnackBar</w:t>
+            </w:r>
+            <w:proofErr w:type="spellEnd"/>
+            <w:r>
+              <w:t>(</w:t>
+            </w:r>
+            <w:proofErr w:type="gramEnd"/>
+          </w:p>
+          <w:p>
+            <w:pPr>
+              <w:cnfStyle w:val="000000000000" w:firstRow="0" w:lastRow="0" w:firstColumn="0" w:lastColumn="0" w:oddVBand="0" w:evenVBand="0" w:oddHBand="0" w:evenHBand="0" w:firstRowFirstColumn="0" w:firstRowLastColumn="0" w:lastRowFirstColumn="0" w:lastRowLastColumn="0"/>
+            </w:pPr>
+            <w:r>
+              <w:t xml:space="preserve">                      </w:t>
+            </w:r>
+            <w:proofErr w:type="spellStart"/>
+            <w:r>
+              <w:t>content</w:t>
+            </w:r>
+            <w:proofErr w:type="spellEnd"/>
+            <w:r>
+              <w:t xml:space="preserve">: </w:t>
+            </w:r>
+            <w:proofErr w:type="gramStart"/>
+            <w:r>
+              <w:t>Text(</w:t>
+            </w:r>
+            <w:proofErr w:type="gramEnd"/>
+            <w:r>
+              <w:t>'¡Datos copiados! Ábrelo en tu app del BDV o Mercantil'),</w:t>
+            </w:r>
+          </w:p>
+          <w:p>
+            <w:pPr>
+              <w:cnfStyle w:val="000000000000" w:firstRow="0" w:lastRow="0" w:firstColumn="0" w:lastColumn="0" w:oddVBand="0" w:evenVBand="0" w:oddHBand="0" w:evenHBand="0" w:firstRowFirstColumn="0" w:firstRowLastColumn="0" w:lastRowFirstColumn="0" w:lastRowLastColumn="0"/>
+            </w:pPr>
+            <w:r>
+              <w:t xml:space="preserve">                      </w:t>
+            </w:r>
+            <w:proofErr w:type="spellStart"/>
+            <w:r>
+              <w:t>duration</w:t>
+            </w:r>
+            <w:proofErr w:type="spellEnd"/>
+            <w:r>
+              <w:t xml:space="preserve">: </w:t>
+            </w:r>
+            <w:proofErr w:type="spellStart"/>
+            <w:proofErr w:type="gramStart"/>
+            <w:r>
+              <w:t>Duration</w:t>
+            </w:r>
+            <w:proofErr w:type="spellEnd"/>
+            <w:r>
+              <w:t>(</w:t>
+            </w:r>
+            <w:proofErr w:type="spellStart"/>
+            <w:proofErr w:type="gramEnd"/>
+            <w:r>
+              <w:t>seconds</w:t>
+            </w:r>
+            <w:proofErr w:type="spellEnd"/>
+            <w:r>
+              <w:t>: 3),</w:t>
+            </w:r>
+          </w:p>
+          <w:p>
+            <w:pPr>
+              <w:cnfStyle w:val="000000000000" w:firstRow="0" w:lastRow="0" w:firstColumn="0" w:lastColumn="0" w:oddVBand="0" w:evenVBand="0" w:oddHBand="0" w:evenHBand="0" w:firstRowFirstColumn="0" w:firstRowLastColumn="0" w:lastRowFirstColumn="0" w:lastRowLastColumn="0"/>
+            </w:pPr>
+            <w:r>
+              <w:t xml:space="preserve">                    ),</w:t>
+            </w:r>
+          </w:p>
+          <w:p>
+            <w:pPr>
+              <w:cnfStyle w:val="000000000000" w:firstRow="0" w:lastRow="0" w:firstColumn="0" w:lastColumn="0" w:oddVBand="0" w:evenVBand="0" w:oddHBand="0" w:evenHBand="0" w:firstRowFirstColumn="0" w:firstRowLastColumn="0" w:lastRowFirstColumn="0" w:lastRowLastColumn="0"/>
+            </w:pPr>
+            <w:r>
+              <w:t xml:space="preserve">                  );</w:t>
+            </w:r>
+          </w:p>
+          <w:p>
+            <w:pPr>
+              <w:cnfStyle w:val="000000000000" w:firstRow="0" w:lastRow="0" w:firstColumn="0" w:lastColumn="0" w:oddVBand="0" w:evenVBand="0" w:oddHBand="0" w:evenHBand="0" w:firstRowFirstColumn="0" w:firstRowLastColumn="0" w:lastRowFirstColumn="0" w:lastRowLastColumn="0"/>
+            </w:pPr>
+            <w:r>
+              <w:t xml:space="preserve">                },</w:t>
+            </w:r>
+          </w:p>
+          <w:p>
+            <w:pPr>
+              <w:cnfStyle w:val="000000000000" w:firstRow="0" w:lastRow="0" w:firstColumn="0" w:lastColumn="0" w:oddVBand="0" w:evenVBand="0" w:oddHBand="0" w:evenHBand="0" w:firstRowFirstColumn="0" w:firstRowLastColumn="0" w:lastRowFirstColumn="0" w:lastRowLastColumn="0"/>
+            </w:pPr>
+            <w:r>
+              <w:t xml:space="preserve">                </w:t>
+            </w:r>
+            <w:proofErr w:type="spellStart"/>
+            <w:r>
+              <w:t>icon</w:t>
+            </w:r>
+            <w:proofErr w:type="spellEnd"/>
+            <w:r>
+              <w:t xml:space="preserve">: </w:t>
+            </w:r>
+            <w:proofErr w:type="spellStart"/>
+            <w:r>
+              <w:t>const</w:t>
+            </w:r>
+            <w:proofErr w:type="spellEnd"/>
+            <w:r>
+              <w:t xml:space="preserve"> </w:t>
+            </w:r>
+            <w:proofErr w:type="spellStart"/>
+            <w:proofErr w:type="gramStart"/>
+            <w:r>
+              <w:t>Icon</w:t>
+            </w:r>
+            <w:proofErr w:type="spellEnd"/>
+            <w:r>
+              <w:t>(</w:t>
+            </w:r>
+            <w:proofErr w:type="spellStart"/>
+            <w:proofErr w:type="gramEnd"/>
+            <w:r>
+              <w:t>Icons.account_balance</w:t>
+            </w:r>
+            <w:proofErr w:type="spellEnd"/>
+            <w:r>
+              <w:t xml:space="preserve">, color: </w:t>
+            </w:r>
+            <w:proofErr w:type="spellStart"/>
+            <w:r>
+              <w:t>Colors.blueAccent</w:t>
+            </w:r>
+            <w:proofErr w:type="spellEnd"/>
+            <w:r>
+              <w:t>),</w:t>
+            </w:r>
+          </w:p>
+          <w:p>
+            <w:pPr>
+              <w:cnfStyle w:val="000000000000" w:firstRow="0" w:lastRow="0" w:firstColumn="0" w:lastColumn="0" w:oddVBand="0" w:evenVBand="0" w:oddHBand="0" w:evenHBand="0" w:firstRowFirstColumn="0" w:firstRowLastColumn="0" w:lastRowFirstColumn="0" w:lastRowLastColumn="0"/>
+            </w:pPr>
+            <w:r>
+              <w:t xml:space="preserve">                </w:t>
+            </w:r>
+            <w:proofErr w:type="spellStart"/>
+            <w:r>
+              <w:t>label</w:t>
+            </w:r>
+            <w:proofErr w:type="spellEnd"/>
+            <w:r>
+              <w:t xml:space="preserve">: </w:t>
+            </w:r>
+            <w:proofErr w:type="spellStart"/>
+            <w:r>
+              <w:t>const</w:t>
+            </w:r>
+            <w:proofErr w:type="spellEnd"/>
+            <w:r>
+              <w:t xml:space="preserve"> </w:t>
+            </w:r>
+            <w:proofErr w:type="gramStart"/>
+            <w:r>
+              <w:t>Text(</w:t>
+            </w:r>
+            <w:proofErr w:type="gramEnd"/>
+            <w:r>
+              <w:t>'Copiar datos de Pago Móvil (Mercantil)'),</w:t>
+            </w:r>
+          </w:p>
+          <w:p>
+            <w:pPr>
+              <w:cnfStyle w:val="000000000000" w:firstRow="0" w:lastRow="0" w:firstColumn="0" w:lastColumn="0" w:oddVBand="0" w:evenVBand="0" w:oddHBand="0" w:evenHBand="0" w:firstRowFirstColumn="0" w:firstRowLastColumn="0" w:lastRowFirstColumn="0" w:lastRowLastColumn="0"/>
+            </w:pPr>
+            <w:r>
+              <w:t xml:space="preserve">                </w:t>
+            </w:r>
+            <w:proofErr w:type="spellStart"/>
+            <w:r>
+              <w:t>style</w:t>
+            </w:r>
+            <w:proofErr w:type="spellEnd"/>
+            <w:r>
+              <w:t xml:space="preserve">: </w:t>
+            </w:r>
+            <w:proofErr w:type="spellStart"/>
+            <w:r>
+              <w:t>ElevatedButton.styleFrom</w:t>
+            </w:r>
+            <w:proofErr w:type="spellEnd"/>
+            <w:r>
+              <w:t>(</w:t>
+            </w:r>
+          </w:p>
+          <w:p>
+            <w:pPr>
+              <w:cnfStyle w:val="000000000000" w:firstRow="0" w:lastRow="0" w:firstColumn="0" w:lastColumn="0" w:oddVBand="0" w:evenVBand="0" w:oddHBand="0" w:evenHBand="0" w:firstRowFirstColumn="0" w:firstRowLastColumn="0" w:lastRowFirstColumn="0" w:lastRowLastColumn="0"/>
+            </w:pPr>
+            <w:r>
+              <w:t xml:space="preserve">                  </w:t>
+            </w:r>
+            <w:proofErr w:type="spellStart"/>
+            <w:r>
+              <w:t>minimumSize</w:t>
+            </w:r>
+            <w:proofErr w:type="spellEnd"/>
+            <w:r>
+              <w:t xml:space="preserve">: </w:t>
+            </w:r>
+            <w:proofErr w:type="spellStart"/>
+            <w:r>
+              <w:t>const</w:t>
+            </w:r>
+            <w:proofErr w:type="spellEnd"/>
+            <w:r>
+              <w:t xml:space="preserve"> </w:t>
+            </w:r>
+            <w:proofErr w:type="spellStart"/>
+            <w:r>
+              <w:t>Size.fromHeight</w:t>
+            </w:r>
+            <w:proofErr w:type="spellEnd"/>
+            <w:r>
+              <w:t>(50),</w:t>
+            </w:r>
+          </w:p>
+          <w:p>
+            <w:pPr>
+              <w:cnfStyle w:val="000000000000" w:firstRow="0" w:lastRow="0" w:firstColumn="0" w:lastColumn="0" w:oddVBand="0" w:evenVBand="0" w:oddHBand="0" w:evenHBand="0" w:firstRowFirstColumn="0" w:firstRowLastColumn="0" w:lastRowFirstColumn="0" w:lastRowLastColumn="0"/>
+            </w:pPr>
+            <w:r>
+              <w:t xml:space="preserve">                  </w:t>
+            </w:r>
+            <w:proofErr w:type="spellStart"/>
+            <w:r>
+              <w:t>shape</w:t>
+            </w:r>
+            <w:proofErr w:type="spellEnd"/>
+            <w:r>
+              <w:t xml:space="preserve">: </w:t>
+            </w:r>
+            <w:proofErr w:type="spellStart"/>
+            <w:proofErr w:type="gramStart"/>
+            <w:r>
+              <w:t>RoundedRectangleBorder</w:t>
+            </w:r>
+            <w:proofErr w:type="spellEnd"/>
+            <w:r>
+              <w:t>(</w:t>
+            </w:r>
+            <w:proofErr w:type="gramEnd"/>
+          </w:p>
+          <w:p>
+            <w:pPr>
+              <w:cnfStyle w:val="000000000000" w:firstRow="0" w:lastRow="0" w:firstColumn="0" w:lastColumn="0" w:oddVBand="0" w:evenVBand="0" w:oddHBand="0" w:evenHBand="0" w:firstRowFirstColumn="0" w:firstRowLastColumn="0" w:lastRowFirstColumn="0" w:lastRowLastColumn="0"/>
+            </w:pPr>
+            <w:r>
+              <w:t xml:space="preserve">                    </w:t>
+            </w:r>
+            <w:proofErr w:type="spellStart"/>
+            <w:r>
+              <w:t>borderRadius</w:t>
+            </w:r>
+            <w:proofErr w:type="spellEnd"/>
+            <w:r>
+              <w:t xml:space="preserve">: </w:t>
+            </w:r>
+            <w:proofErr w:type="spellStart"/>
+            <w:r>
+              <w:t>BorderRadius.circular</w:t>
+            </w:r>
+            <w:proofErr w:type="spellEnd"/>
+            <w:r>
+              <w:t>(12),</w:t>
+            </w:r>
+          </w:p>
+          <w:p>
+            <w:pPr>
+              <w:cnfStyle w:val="000000000000" w:firstRow="0" w:lastRow="0" w:firstColumn="0" w:lastColumn="0" w:oddVBand="0" w:evenVBand="0" w:oddHBand="0" w:evenHBand="0" w:firstRowFirstColumn="0" w:firstRowLastColumn="0" w:lastRowFirstColumn="0" w:lastRowLastColumn="0"/>
+            </w:pPr>
+            <w:r>
+              <w:t xml:space="preserve">                  ),</w:t>
+            </w:r>
+          </w:p>
+          <w:p>
+            <w:pPr>
+              <w:cnfStyle w:val="000000000000" w:firstRow="0" w:lastRow="0" w:firstColumn="0" w:lastColumn="0" w:oddVBand="0" w:evenVBand="0" w:oddHBand="0" w:evenHBand="0" w:firstRowFirstColumn="0" w:firstRowLastColumn="0" w:lastRowFirstColumn="0" w:lastRowLastColumn="0"/>
+            </w:pPr>
+            <w:r>
+              <w:t xml:space="preserve">                ),</w:t>
+            </w:r>
+          </w:p>
+          <w:p>
+            <w:pPr>
+              <w:cnfStyle w:val="000000000000" w:firstRow="0" w:lastRow="0" w:firstColumn="0" w:lastColumn="0" w:oddVBand="0" w:evenVBand="0" w:oddHBand="0" w:evenHBand="0" w:firstRowFirstColumn="0" w:firstRowLastColumn="0" w:lastRowFirstColumn="0" w:lastRowLastColumn="0"/>
+            </w:pPr>
+            <w:r>
+              <w:t xml:space="preserve">              ),</w:t>
+            </w:r>
+          </w:p>
+          <w:p>
+            <w:pPr>
+              <w:cnfStyle w:val="000000000000" w:firstRow="0" w:lastRow="0" w:firstColumn="0" w:lastColumn="0" w:oddVBand="0" w:evenVBand="0" w:oddHBand="0" w:evenHBand="0" w:firstRowFirstColumn="0" w:firstRowLastColumn="0" w:lastRowFirstColumn="0" w:lastRowLastColumn="0"/>
+            </w:pPr>
+            <w:r>
+              <w:t xml:space="preserve">              </w:t>
+            </w:r>
+            <w:proofErr w:type="spellStart"/>
+            <w:r>
+              <w:t>const</w:t>
+            </w:r>
+            <w:proofErr w:type="spellEnd"/>
+            <w:r>
+              <w:t xml:space="preserve"> </w:t>
+            </w:r>
+            <w:proofErr w:type="spellStart"/>
+            <w:proofErr w:type="gramStart"/>
+            <w:r>
+              <w:t>SizedBox</w:t>
+            </w:r>
+            <w:proofErr w:type="spellEnd"/>
+            <w:r>
+              <w:t>(</w:t>
+            </w:r>
+            <w:proofErr w:type="spellStart"/>
+            <w:proofErr w:type="gramEnd"/>
+            <w:r>
+              <w:t>height</w:t>
+            </w:r>
+            <w:proofErr w:type="spellEnd"/>
+            <w:r>
+              <w:t>: 12),</w:t>
+            </w:r>
+          </w:p>
+          <w:p>
+            <w:pPr>
+              <w:cnfStyle w:val="000000000000" w:firstRow="0" w:lastRow="0" w:firstColumn="0" w:lastColumn="0" w:oddVBand="0" w:evenVBand="0" w:oddHBand="0" w:evenHBand="0" w:firstRowFirstColumn="0" w:firstRowLastColumn="0" w:lastRowFirstColumn="0" w:lastRowLastColumn="0"/>
+            </w:pPr>
+            <w:r>
+              <w:t xml:space="preserve">              // Botón </w:t>
+            </w:r>
+            <w:proofErr w:type="spellStart"/>
+            <w:r>
+              <w:t>Binance</w:t>
+            </w:r>
+            <w:proofErr w:type="spellEnd"/>
+            <w:r>
+              <w:t xml:space="preserve"> </w:t>
+            </w:r>
+            <w:proofErr w:type="spellStart"/>
+            <w:r>
+              <w:t>Pay</w:t>
+            </w:r>
+            <w:proofErr w:type="spellEnd"/>
+          </w:p>
+          <w:p>
+            <w:pPr>
+              <w:cnfStyle w:val="000000000000" w:firstRow="0" w:lastRow="0" w:firstColumn="0" w:lastColumn="0" w:oddVBand="0" w:evenVBand="0" w:oddHBand="0" w:evenHBand="0" w:firstRowFirstColumn="0" w:firstRowLastColumn="0" w:lastRowFirstColumn="0" w:lastRowLastColumn="0"/>
+            </w:pPr>
+            <w:r>
+              <w:t xml:space="preserve">              </w:t>
+            </w:r>
+            <w:proofErr w:type="spellStart"/>
+            <w:r>
+              <w:t>ElevatedButton.icon</w:t>
+            </w:r>
+            <w:proofErr w:type="spellEnd"/>
+            <w:r>
+              <w:t>(</w:t>
+            </w:r>
+          </w:p>
+          <w:p>
+            <w:pPr>
+              <w:cnfStyle w:val="000000000000" w:firstRow="0" w:lastRow="0" w:firstColumn="0" w:lastColumn="0" w:oddVBand="0" w:evenVBand="0" w:oddHBand="0" w:evenHBand="0" w:firstRowFirstColumn="0" w:firstRowLastColumn="0" w:lastRowFirstColumn="0" w:lastRowLastColumn="0"/>
+            </w:pPr>
+            <w:r>
+              <w:t xml:space="preserve">                </w:t>
+            </w:r>
+            <w:proofErr w:type="spellStart"/>
+            <w:r>
+              <w:t>onPressed</w:t>
+            </w:r>
+            <w:proofErr w:type="spellEnd"/>
+            <w:r>
+              <w:t xml:space="preserve">: () </w:t>
+            </w:r>
+            <w:proofErr w:type="spellStart"/>
+            <w:r>
+              <w:t>async</w:t>
+            </w:r>
+            <w:proofErr w:type="spellEnd"/>
+            <w:r>
+              <w:t xml:space="preserve"> {</w:t>
+            </w:r>
+          </w:p>
+          <w:p>
+            <w:pPr>
+              <w:cnfStyle w:val="000000000000" w:firstRow="0" w:lastRow="0" w:firstColumn="0" w:lastColumn="0" w:oddVBand="0" w:evenVBand="0" w:oddHBand="0" w:evenHBand="0" w:firstRowFirstColumn="0" w:firstRowLastColumn="0" w:lastRowFirstColumn="0" w:lastRowLastColumn="0"/>
+            </w:pPr>
+            <w:r>
+              <w:t xml:space="preserve">                  final Uri </w:t>
+            </w:r>
+            <w:proofErr w:type="spellStart"/>
+            <w:r>
+              <w:t>url</w:t>
+            </w:r>
+            <w:proofErr w:type="spellEnd"/>
+            <w:r>
+              <w:t xml:space="preserve"> = </w:t>
+            </w:r>
+            <w:proofErr w:type="spellStart"/>
+            <w:r>
+              <w:t>Uri.parse</w:t>
+            </w:r>
+            <w:proofErr w:type="spellEnd"/>
+            <w:r>
+              <w:t>('https://app.binance.com/</w:t>
+            </w:r>
+            <w:proofErr w:type="spellStart"/>
+            <w:r>
+              <w:t>uni-qr</w:t>
+            </w:r>
+            <w:proofErr w:type="spellEnd"/>
+            <w:r>
+              <w:t>/89ymjEE7');</w:t>
+            </w:r>
+          </w:p>
+          <w:p>
+            <w:pPr>
+              <w:cnfStyle w:val="000000000000" w:firstRow="0" w:lastRow="0" w:firstColumn="0" w:lastColumn="0" w:oddVBand="0" w:evenVBand="0" w:oddHBand="0" w:evenHBand="0" w:firstRowFirstColumn="0" w:firstRowLastColumn="0" w:lastRowFirstColumn="0" w:lastRowLastColumn="0"/>
+            </w:pPr>
+            <w:r>
+              <w:t xml:space="preserve">                  </w:t>
+            </w:r>
+            <w:proofErr w:type="spellStart"/>
+            <w:r>
+              <w:t>if</w:t>
+            </w:r>
+            <w:proofErr w:type="spellEnd"/>
+            <w:r>
+              <w:t xml:space="preserve"> </w:t>
+            </w:r>
+            <w:proofErr w:type="gramStart"/>
+            <w:r>
+              <w:t>(!</w:t>
+            </w:r>
+            <w:proofErr w:type="spellStart"/>
+            <w:r>
+              <w:t>await</w:t>
+            </w:r>
+            <w:proofErr w:type="spellEnd"/>
+            <w:proofErr w:type="gramEnd"/>
+            <w:r>
+              <w:t xml:space="preserve"> </w:t>
+            </w:r>
+            <w:proofErr w:type="spellStart"/>
+            <w:r>
+              <w:t>launchUrl</w:t>
+            </w:r>
+            <w:proofErr w:type="spellEnd"/>
+            <w:r>
+              <w:t>(</w:t>
+            </w:r>
+            <w:proofErr w:type="spellStart"/>
+            <w:r>
+              <w:t>url</w:t>
+            </w:r>
+            <w:proofErr w:type="spellEnd"/>
+            <w:r>
+              <w:t xml:space="preserve">, </w:t>
+            </w:r>
+            <w:proofErr w:type="spellStart"/>
+            <w:r>
+              <w:t>mode</w:t>
+            </w:r>
+            <w:proofErr w:type="spellEnd"/>
+            <w:r>
+              <w:t xml:space="preserve">: </w:t>
+            </w:r>
+            <w:proofErr w:type="spellStart"/>
+            <w:r>
+              <w:t>LaunchMode.externalApplication</w:t>
+            </w:r>
+            <w:proofErr w:type="spellEnd"/>
+            <w:r>
+              <w:t>)) {</w:t>
+            </w:r>
+          </w:p>
+          <w:p>
+            <w:pPr>
+              <w:cnfStyle w:val="000000000000" w:firstRow="0" w:lastRow="0" w:firstColumn="0" w:lastColumn="0" w:oddVBand="0" w:evenVBand="0" w:oddHBand="0" w:evenHBand="0" w:firstRowFirstColumn="0" w:firstRowLastColumn="0" w:lastRowFirstColumn="0" w:lastRowLastColumn="0"/>
+            </w:pPr>
+            <w:r>
+              <w:t xml:space="preserve">                    </w:t>
+            </w:r>
+            <w:proofErr w:type="spellStart"/>
+            <w:r>
+              <w:t>if</w:t>
+            </w:r>
+            <w:proofErr w:type="spellEnd"/>
+            <w:r>
+              <w:t xml:space="preserve"> (</w:t>
+            </w:r>
+            <w:proofErr w:type="spellStart"/>
+            <w:proofErr w:type="gramStart"/>
+            <w:r>
+              <w:t>context.mounted</w:t>
+            </w:r>
+            <w:proofErr w:type="spellEnd"/>
+            <w:proofErr w:type="gramEnd"/>
+            <w:r>
+              <w:t>) {</w:t>
+            </w:r>
+          </w:p>
+          <w:p>
+            <w:pPr>
+              <w:cnfStyle w:val="000000000000" w:firstRow="0" w:lastRow="0" w:firstColumn="0" w:lastColumn="0" w:oddVBand="0" w:evenVBand="0" w:oddHBand="0" w:evenHBand="0" w:firstRowFirstColumn="0" w:firstRowLastColumn="0" w:lastRowFirstColumn="0" w:lastRowLastColumn="0"/>
+            </w:pPr>
+            <w:r>
+              <w:t xml:space="preserve">                      </w:t>
+            </w:r>
+            <w:proofErr w:type="spellStart"/>
+            <w:r>
+              <w:t>ScaffoldMessenger.of</w:t>
+            </w:r>
+            <w:proofErr w:type="spellEnd"/>
+            <w:r>
+              <w:t>(</w:t>
+            </w:r>
+            <w:proofErr w:type="spellStart"/>
+            <w:r>
+              <w:t>context</w:t>
+            </w:r>
+            <w:proofErr w:type="spellEnd"/>
+            <w:proofErr w:type="gramStart"/>
+            <w:r>
+              <w:t>).</w:t>
+            </w:r>
+            <w:proofErr w:type="spellStart"/>
+            <w:r>
+              <w:t>showSnackBar</w:t>
+            </w:r>
+            <w:proofErr w:type="spellEnd"/>
+            <w:proofErr w:type="gramEnd"/>
+            <w:r>
+              <w:t>(</w:t>
+            </w:r>
+          </w:p>
+          <w:p>
+            <w:pPr>
+              <w:cnfStyle w:val="000000000000" w:firstRow="0" w:lastRow="0" w:firstColumn="0" w:lastColumn="0" w:oddVBand="0" w:evenVBand="0" w:oddHBand="0" w:evenHBand="0" w:firstRowFirstColumn="0" w:firstRowLastColumn="0" w:lastRowFirstColumn="0" w:lastRowLastColumn="0"/>
+            </w:pPr>
+            <w:r>
+              <w:t xml:space="preserve">                        </w:t>
+            </w:r>
+            <w:proofErr w:type="spellStart"/>
+            <w:r>
+              <w:t>const</w:t>
+            </w:r>
+            <w:proofErr w:type="spellEnd"/>
+            <w:r>
+              <w:t xml:space="preserve"> </w:t>
+            </w:r>
+            <w:proofErr w:type="spellStart"/>
+            <w:proofErr w:type="gramStart"/>
+            <w:r>
+              <w:t>SnackBar</w:t>
+            </w:r>
+            <w:proofErr w:type="spellEnd"/>
+            <w:r>
+              <w:t>(</w:t>
+            </w:r>
+            <w:proofErr w:type="spellStart"/>
+            <w:proofErr w:type="gramEnd"/>
+            <w:r>
+              <w:t>content</w:t>
+            </w:r>
+            <w:proofErr w:type="spellEnd"/>
+            <w:r>
+              <w:t xml:space="preserve">: Text('No se pudo abrir </w:t>
+            </w:r>
+            <w:proofErr w:type="spellStart"/>
+            <w:r>
+              <w:t>Binance</w:t>
+            </w:r>
+            <w:proofErr w:type="spellEnd"/>
+            <w:r>
+              <w:t xml:space="preserve"> </w:t>
+            </w:r>
+            <w:proofErr w:type="spellStart"/>
+            <w:r>
+              <w:t>Pay</w:t>
+            </w:r>
+            <w:proofErr w:type="spellEnd"/>
+            <w:r>
+              <w:t>')),</w:t>
+            </w:r>
+          </w:p>
+          <w:p>
+            <w:pPr>
+              <w:cnfStyle w:val="000000000000" w:firstRow="0" w:lastRow="0" w:firstColumn="0" w:lastColumn="0" w:oddVBand="0" w:evenVBand="0" w:oddHBand="0" w:evenHBand="0" w:firstRowFirstColumn="0" w:firstRowLastColumn="0" w:lastRowFirstColumn="0" w:lastRowLastColumn="0"/>
+            </w:pPr>
+            <w:r>
+              <w:t xml:space="preserve">                      );</w:t>
+            </w:r>
+          </w:p>
+          <w:p>
+            <w:pPr>
+              <w:cnfStyle w:val="000000000000" w:firstRow="0" w:lastRow="0" w:firstColumn="0" w:lastColumn="0" w:oddVBand="0" w:evenVBand="0" w:oddHBand="0" w:evenHBand="0" w:firstRowFirstColumn="0" w:firstRowLastColumn="0" w:lastRowFirstColumn="0" w:lastRowLastColumn="0"/>
+            </w:pPr>
+            <w:r>
+              <w:t xml:space="preserve">                    }</w:t>
+            </w:r>
+          </w:p>
+          <w:p>
+            <w:pPr>
+              <w:cnfStyle w:val="000000000000" w:firstRow="0" w:lastRow="0" w:firstColumn="0" w:lastColumn="0" w:oddVBand="0" w:evenVBand="0" w:oddHBand="0" w:evenHBand="0" w:firstRowFirstColumn="0" w:firstRowLastColumn="0" w:lastRowFirstColumn="0" w:lastRowLastColumn="0"/>
+            </w:pPr>
+            <w:r>
+              <w:t xml:space="preserve">                  }</w:t>
+            </w:r>
+          </w:p>
+          <w:p>
+            <w:pPr>
+              <w:cnfStyle w:val="000000000000" w:firstRow="0" w:lastRow="0" w:firstColumn="0" w:lastColumn="0" w:oddVBand="0" w:evenVBand="0" w:oddHBand="0" w:evenHBand="0" w:firstRowFirstColumn="0" w:firstRowLastColumn="0" w:lastRowFirstColumn="0" w:lastRowLastColumn="0"/>
+            </w:pPr>
+            <w:r>
+              <w:t xml:space="preserve">                  </w:t>
+            </w:r>
+            <w:proofErr w:type="spellStart"/>
+            <w:r>
+              <w:t>if</w:t>
+            </w:r>
+            <w:proofErr w:type="spellEnd"/>
+            <w:r>
+              <w:t xml:space="preserve"> (</w:t>
+            </w:r>
+            <w:proofErr w:type="spellStart"/>
+            <w:proofErr w:type="gramStart"/>
+            <w:r>
+              <w:t>context.mounted</w:t>
+            </w:r>
+            <w:proofErr w:type="spellEnd"/>
+            <w:proofErr w:type="gramEnd"/>
+            <w:r>
+              <w:t>) {</w:t>
+            </w:r>
+          </w:p>
+          <w:p>
+            <w:pPr>
+              <w:cnfStyle w:val="000000000000" w:firstRow="0" w:lastRow="0" w:firstColumn="0" w:lastColumn="0" w:oddVBand="0" w:evenVBand="0" w:oddHBand="0" w:evenHBand="0" w:firstRowFirstColumn="0" w:firstRowLastColumn="0" w:lastRowFirstColumn="0" w:lastRowLastColumn="0"/>
+            </w:pPr>
+            <w:r>
+              <w:t xml:space="preserve">                    </w:t>
+            </w:r>
+            <w:proofErr w:type="spellStart"/>
+            <w:r>
+              <w:t>Navigator.pop</w:t>
+            </w:r>
+            <w:proofErr w:type="spellEnd"/>
+            <w:r>
+              <w:t>(</w:t>
+            </w:r>
+            <w:proofErr w:type="spellStart"/>
+            <w:r>
+              <w:t>context</w:t>
+            </w:r>
+            <w:proofErr w:type="spellEnd"/>
+            <w:r>
+              <w:t>); // Cierra el modal</w:t>
+            </w:r>
+          </w:p>
+          <w:p>
+            <w:pPr>
+              <w:cnfStyle w:val="000000000000" w:firstRow="0" w:lastRow="0" w:firstColumn="0" w:lastColumn="0" w:oddVBand="0" w:evenVBand="0" w:oddHBand="0" w:evenHBand="0" w:firstRowFirstColumn="0" w:firstRowLastColumn="0" w:lastRowFirstColumn="0" w:lastRowLastColumn="0"/>
+            </w:pPr>
+            <w:r>
+              <w:t xml:space="preserve">                  }</w:t>
+            </w:r>
+          </w:p>
+          <w:p>
+            <w:pPr>
+              <w:cnfStyle w:val="000000000000" w:firstRow="0" w:lastRow="0" w:firstColumn="0" w:lastColumn="0" w:oddVBand="0" w:evenVBand="0" w:oddHBand="0" w:evenHBand="0" w:firstRowFirstColumn="0" w:firstRowLastColumn="0" w:lastRowFirstColumn="0" w:lastRowLastColumn="0"/>
+            </w:pPr>
+            <w:r>
+              <w:t xml:space="preserve">                },</w:t>
+            </w:r>
+          </w:p>
+          <w:p>
+            <w:pPr>
+              <w:cnfStyle w:val="000000000000" w:firstRow="0" w:lastRow="0" w:firstColumn="0" w:lastColumn="0" w:oddVBand="0" w:evenVBand="0" w:oddHBand="0" w:evenHBand="0" w:firstRowFirstColumn="0" w:firstRowLastColumn="0" w:lastRowFirstColumn="0" w:lastRowLastColumn="0"/>
+            </w:pPr>
+            <w:r>
+              <w:t xml:space="preserve">                </w:t>
+            </w:r>
+            <w:proofErr w:type="spellStart"/>
+            <w:r>
+              <w:t>icon</w:t>
+            </w:r>
+            <w:proofErr w:type="spellEnd"/>
+            <w:r>
+              <w:t xml:space="preserve">: </w:t>
+            </w:r>
+            <w:proofErr w:type="spellStart"/>
+            <w:r>
+              <w:t>const</w:t>
+            </w:r>
+            <w:proofErr w:type="spellEnd"/>
+            <w:r>
+              <w:t xml:space="preserve"> </w:t>
+            </w:r>
+            <w:proofErr w:type="spellStart"/>
+            <w:proofErr w:type="gramStart"/>
+            <w:r>
+              <w:t>Icon</w:t>
+            </w:r>
+            <w:proofErr w:type="spellEnd"/>
+            <w:r>
+              <w:t>(</w:t>
+            </w:r>
+            <w:proofErr w:type="spellStart"/>
+            <w:proofErr w:type="gramEnd"/>
+            <w:r>
+              <w:t>Icons.currency_bitcoin</w:t>
+            </w:r>
+            <w:proofErr w:type="spellEnd"/>
+            <w:r>
+              <w:t xml:space="preserve">, color: </w:t>
+            </w:r>
+            <w:proofErr w:type="spellStart"/>
+            <w:r>
+              <w:t>Colors.amber</w:t>
+            </w:r>
+            <w:proofErr w:type="spellEnd"/>
+            <w:r>
+              <w:t>),</w:t>
+            </w:r>
+          </w:p>
+          <w:p>
+            <w:pPr>
+              <w:cnfStyle w:val="000000000000" w:firstRow="0" w:lastRow="0" w:firstColumn="0" w:lastColumn="0" w:oddVBand="0" w:evenVBand="0" w:oddHBand="0" w:evenHBand="0" w:firstRowFirstColumn="0" w:firstRowLastColumn="0" w:lastRowFirstColumn="0" w:lastRowLastColumn="0"/>
+            </w:pPr>
+            <w:r>
+              <w:t xml:space="preserve">                </w:t>
+            </w:r>
+            <w:proofErr w:type="spellStart"/>
+            <w:r>
+              <w:t>label</w:t>
+            </w:r>
+            <w:proofErr w:type="spellEnd"/>
+            <w:r>
+              <w:t xml:space="preserve">: </w:t>
+            </w:r>
+            <w:proofErr w:type="spellStart"/>
+            <w:r>
+              <w:t>const</w:t>
+            </w:r>
+            <w:proofErr w:type="spellEnd"/>
+            <w:r>
+              <w:t xml:space="preserve"> </w:t>
+            </w:r>
+            <w:proofErr w:type="gramStart"/>
+            <w:r>
+              <w:t>Text(</w:t>
+            </w:r>
+            <w:proofErr w:type="gramEnd"/>
+            <w:r>
+              <w:t xml:space="preserve">'Enviar por </w:t>
+            </w:r>
+            <w:proofErr w:type="spellStart"/>
+            <w:r>
+              <w:t>Binance</w:t>
+            </w:r>
+            <w:proofErr w:type="spellEnd"/>
+            <w:r>
+              <w:t xml:space="preserve"> </w:t>
+            </w:r>
+            <w:proofErr w:type="spellStart"/>
+            <w:r>
+              <w:t>Pay</w:t>
+            </w:r>
+            <w:proofErr w:type="spellEnd"/>
+            <w:r>
+              <w:t>'),</w:t>
+            </w:r>
+          </w:p>
+          <w:p>
+            <w:pPr>
+              <w:cnfStyle w:val="000000000000" w:firstRow="0" w:lastRow="0" w:firstColumn="0" w:lastColumn="0" w:oddVBand="0" w:evenVBand="0" w:oddHBand="0" w:evenHBand="0" w:firstRowFirstColumn="0" w:firstRowLastColumn="0" w:lastRowFirstColumn="0" w:lastRowLastColumn="0"/>
+            </w:pPr>
+            <w:r>
+              <w:t xml:space="preserve">                </w:t>
+            </w:r>
+            <w:proofErr w:type="spellStart"/>
+            <w:r>
+              <w:t>style</w:t>
+            </w:r>
+            <w:proofErr w:type="spellEnd"/>
+            <w:r>
+              <w:t xml:space="preserve">: </w:t>
+            </w:r>
+            <w:proofErr w:type="spellStart"/>
+            <w:r>
+              <w:t>ElevatedButton.styleFrom</w:t>
+            </w:r>
+            <w:proofErr w:type="spellEnd"/>
+            <w:r>
+              <w:t>(</w:t>
+            </w:r>
+          </w:p>
+          <w:p>
+            <w:pPr>
+              <w:cnfStyle w:val="000000000000" w:firstRow="0" w:lastRow="0" w:firstColumn="0" w:lastColumn="0" w:oddVBand="0" w:evenVBand="0" w:oddHBand="0" w:evenHBand="0" w:firstRowFirstColumn="0" w:firstRowLastColumn="0" w:lastRowFirstColumn="0" w:lastRowLastColumn="0"/>
+            </w:pPr>
+            <w:r>
+              <w:t xml:space="preserve">                  </w:t>
+            </w:r>
+            <w:proofErr w:type="spellStart"/>
+            <w:r>
+              <w:t>minimumSize</w:t>
+            </w:r>
+            <w:proofErr w:type="spellEnd"/>
+            <w:r>
+              <w:t xml:space="preserve">: </w:t>
+            </w:r>
+            <w:proofErr w:type="spellStart"/>
+            <w:r>
+              <w:t>const</w:t>
+            </w:r>
+            <w:proofErr w:type="spellEnd"/>
+            <w:r>
+              <w:t xml:space="preserve"> </w:t>
+            </w:r>
+            <w:proofErr w:type="spellStart"/>
+            <w:r>
+              <w:t>Size.fromHeight</w:t>
+            </w:r>
+            <w:proofErr w:type="spellEnd"/>
+            <w:r>
+              <w:t>(50),</w:t>
+            </w:r>
+          </w:p>
+          <w:p>
+            <w:pPr>
+              <w:cnfStyle w:val="000000000000" w:firstRow="0" w:lastRow="0" w:firstColumn="0" w:lastColumn="0" w:oddVBand="0" w:evenVBand="0" w:oddHBand="0" w:evenHBand="0" w:firstRowFirstColumn="0" w:firstRowLastColumn="0" w:lastRowFirstColumn="0" w:lastRowLastColumn="0"/>
+            </w:pPr>
+            <w:r>
+              <w:t xml:space="preserve">                  </w:t>
+            </w:r>
+            <w:proofErr w:type="spellStart"/>
+            <w:r>
+              <w:t>backgroundColor</w:t>
+            </w:r>
+            <w:proofErr w:type="spellEnd"/>
+            <w:r>
+              <w:t xml:space="preserve">: </w:t>
+            </w:r>
+            <w:proofErr w:type="spellStart"/>
+            <w:proofErr w:type="gramStart"/>
+            <w:r>
+              <w:t>Colors.amber.withOpacity</w:t>
+            </w:r>
+            <w:proofErr w:type="spellEnd"/>
+            <w:proofErr w:type="gramEnd"/>
+            <w:r>
+              <w:t>(0.2),</w:t>
+            </w:r>
+          </w:p>
+          <w:p>
+            <w:pPr>
+              <w:cnfStyle w:val="000000000000" w:firstRow="0" w:lastRow="0" w:firstColumn="0" w:lastColumn="0" w:oddVBand="0" w:evenVBand="0" w:oddHBand="0" w:evenHBand="0" w:firstRowFirstColumn="0" w:firstRowLastColumn="0" w:lastRowFirstColumn="0" w:lastRowLastColumn="0"/>
+            </w:pPr>
+            <w:r>
+              <w:t xml:space="preserve">                  </w:t>
+            </w:r>
+            <w:proofErr w:type="spellStart"/>
+            <w:r>
+              <w:t>foregroundColor</w:t>
+            </w:r>
+            <w:proofErr w:type="spellEnd"/>
+            <w:r>
+              <w:t xml:space="preserve">: </w:t>
+            </w:r>
+            <w:proofErr w:type="spellStart"/>
+            <w:r>
+              <w:t>Theme.of</w:t>
+            </w:r>
+            <w:proofErr w:type="spellEnd"/>
+            <w:r>
+              <w:t>(</w:t>
+            </w:r>
+            <w:proofErr w:type="spellStart"/>
+            <w:r>
+              <w:t>context</w:t>
+            </w:r>
+            <w:proofErr w:type="spellEnd"/>
+            <w:proofErr w:type="gramStart"/>
+            <w:r>
+              <w:t>).</w:t>
+            </w:r>
+            <w:proofErr w:type="spellStart"/>
+            <w:r>
+              <w:t>brightness</w:t>
+            </w:r>
+            <w:proofErr w:type="spellEnd"/>
+            <w:proofErr w:type="gramEnd"/>
+            <w:r>
+              <w:t xml:space="preserve"> == </w:t>
+            </w:r>
+            <w:proofErr w:type="spellStart"/>
+            <w:r>
+              <w:t>Brightness.dark</w:t>
+            </w:r>
+            <w:proofErr w:type="spellEnd"/>
+            <w:r>
+              <w:t xml:space="preserve"> </w:t>
+            </w:r>
+          </w:p>
+          <w:p>
+            <w:pPr>
+              <w:cnfStyle w:val="000000000000" w:firstRow="0" w:lastRow="0" w:firstColumn="0" w:lastColumn="0" w:oddVBand="0" w:evenVBand="0" w:oddHBand="0" w:evenHBand="0" w:firstRowFirstColumn="0" w:firstRowLastColumn="0" w:lastRowFirstColumn="0" w:lastRowLastColumn="0"/>
+            </w:pPr>
+            <w:r>
+              <w:t xml:space="preserve">                      ? </w:t>
+            </w:r>
+            <w:proofErr w:type="spellStart"/>
+            <w:r>
+              <w:t>Colors.amberAccent</w:t>
+            </w:r>
+            <w:proofErr w:type="spellEnd"/>
+            <w:r>
+              <w:t xml:space="preserve"> </w:t>
+            </w:r>
+          </w:p>
+          <w:p>
+            <w:pPr>
+              <w:cnfStyle w:val="000000000000" w:firstRow="0" w:lastRow="0" w:firstColumn="0" w:lastColumn="0" w:oddVBand="0" w:evenVBand="0" w:oddHBand="0" w:evenHBand="0" w:firstRowFirstColumn="0" w:firstRowLastColumn="0" w:lastRowFirstColumn="0" w:lastRowLastColumn="0"/>
+            </w:pPr>
+            <w:r>
+              <w:lastRenderedPageBreak/>
+              <w:t xml:space="preserve">                      : </w:t>
+            </w:r>
+            <w:proofErr w:type="gramStart"/>
+            <w:r>
+              <w:t>Colors.orange.shade</w:t>
+            </w:r>
+            <w:proofErr w:type="gramEnd"/>
+            <w:r>
+              <w:t>800,</w:t>
+            </w:r>
+          </w:p>
+          <w:p>
+            <w:pPr>
+              <w:cnfStyle w:val="000000000000" w:firstRow="0" w:lastRow="0" w:firstColumn="0" w:lastColumn="0" w:oddVBand="0" w:evenVBand="0" w:oddHBand="0" w:evenHBand="0" w:firstRowFirstColumn="0" w:firstRowLastColumn="0" w:lastRowFirstColumn="0" w:lastRowLastColumn="0"/>
+            </w:pPr>
+            <w:r>
+              <w:t xml:space="preserve">                  </w:t>
+            </w:r>
+            <w:proofErr w:type="spellStart"/>
+            <w:r>
+              <w:t>shape</w:t>
+            </w:r>
+            <w:proofErr w:type="spellEnd"/>
+            <w:r>
+              <w:t xml:space="preserve">: </w:t>
+            </w:r>
+            <w:proofErr w:type="spellStart"/>
+            <w:proofErr w:type="gramStart"/>
+            <w:r>
+              <w:t>RoundedRectangleBorder</w:t>
+            </w:r>
+            <w:proofErr w:type="spellEnd"/>
+            <w:r>
+              <w:t>(</w:t>
+            </w:r>
+            <w:proofErr w:type="gramEnd"/>
+          </w:p>
+          <w:p>
+            <w:pPr>
+              <w:cnfStyle w:val="000000000000" w:firstRow="0" w:lastRow="0" w:firstColumn="0" w:lastColumn="0" w:oddVBand="0" w:evenVBand="0" w:oddHBand="0" w:evenHBand="0" w:firstRowFirstColumn="0" w:firstRowLastColumn="0" w:lastRowFirstColumn="0" w:lastRowLastColumn="0"/>
+            </w:pPr>
+            <w:r>
+              <w:t xml:space="preserve">                    </w:t>
+            </w:r>
+            <w:proofErr w:type="spellStart"/>
+            <w:r>
+              <w:t>borderRadius</w:t>
+            </w:r>
+            <w:proofErr w:type="spellEnd"/>
+            <w:r>
+              <w:t xml:space="preserve">: </w:t>
+            </w:r>
+            <w:proofErr w:type="spellStart"/>
+            <w:r>
+              <w:t>BorderRadius.circular</w:t>
+            </w:r>
+            <w:proofErr w:type="spellEnd"/>
+            <w:r>
+              <w:t>(12),</w:t>
+            </w:r>
+          </w:p>
+          <w:p>
+            <w:pPr>
+              <w:cnfStyle w:val="000000000000" w:firstRow="0" w:lastRow="0" w:firstColumn="0" w:lastColumn="0" w:oddVBand="0" w:evenVBand="0" w:oddHBand="0" w:evenHBand="0" w:firstRowFirstColumn="0" w:firstRowLastColumn="0" w:lastRowFirstColumn="0" w:lastRowLastColumn="0"/>
+            </w:pPr>
+            <w:r>
+              <w:t xml:space="preserve">                  ),</w:t>
+            </w:r>
+          </w:p>
+          <w:p>
+            <w:pPr>
+              <w:cnfStyle w:val="000000000000" w:firstRow="0" w:lastRow="0" w:firstColumn="0" w:lastColumn="0" w:oddVBand="0" w:evenVBand="0" w:oddHBand="0" w:evenHBand="0" w:firstRowFirstColumn="0" w:firstRowLastColumn="0" w:lastRowFirstColumn="0" w:lastRowLastColumn="0"/>
+            </w:pPr>
+            <w:r>
+              <w:t xml:space="preserve">                ),</w:t>
+            </w:r>
+          </w:p>
+          <w:p>
+            <w:pPr>
+              <w:cnfStyle w:val="000000000000" w:firstRow="0" w:lastRow="0" w:firstColumn="0" w:lastColumn="0" w:oddVBand="0" w:evenVBand="0" w:oddHBand="0" w:evenHBand="0" w:firstRowFirstColumn="0" w:firstRowLastColumn="0" w:lastRowFirstColumn="0" w:lastRowLastColumn="0"/>
+            </w:pPr>
+            <w:r>
+              <w:t xml:space="preserve">              ),</w:t>
+            </w:r>
+          </w:p>
+          <w:p>
+            <w:pPr>
+              <w:cnfStyle w:val="000000000000" w:firstRow="0" w:lastRow="0" w:firstColumn="0" w:lastColumn="0" w:oddVBand="0" w:evenVBand="0" w:oddHBand="0" w:evenHBand="0" w:firstRowFirstColumn="0" w:firstRowLastColumn="0" w:lastRowFirstColumn="0" w:lastRowLastColumn="0"/>
+            </w:pPr>
+            <w:r>
+              <w:t xml:space="preserve">              </w:t>
+            </w:r>
+            <w:proofErr w:type="spellStart"/>
+            <w:r>
+              <w:t>const</w:t>
+            </w:r>
+            <w:proofErr w:type="spellEnd"/>
+            <w:r>
+              <w:t xml:space="preserve"> </w:t>
+            </w:r>
+            <w:proofErr w:type="spellStart"/>
+            <w:proofErr w:type="gramStart"/>
+            <w:r>
+              <w:t>SizedBox</w:t>
+            </w:r>
+            <w:proofErr w:type="spellEnd"/>
+            <w:r>
+              <w:t>(</w:t>
+            </w:r>
+            <w:proofErr w:type="spellStart"/>
+            <w:proofErr w:type="gramEnd"/>
+            <w:r>
+              <w:t>height</w:t>
+            </w:r>
+            <w:proofErr w:type="spellEnd"/>
+            <w:r>
+              <w:t>: 24),</w:t>
+            </w:r>
+          </w:p>
+          <w:p>
+            <w:pPr>
+              <w:cnfStyle w:val="000000000000" w:firstRow="0" w:lastRow="0" w:firstColumn="0" w:lastColumn="0" w:oddVBand="0" w:evenVBand="0" w:oddHBand="0" w:evenHBand="0" w:firstRowFirstColumn="0" w:firstRowLastColumn="0" w:lastRowFirstColumn="0" w:lastRowLastColumn="0"/>
+            </w:pPr>
+            <w:r>
+              <w:t xml:space="preserve">            ],</w:t>
+            </w:r>
+          </w:p>
+          <w:p>
+            <w:pPr>
+              <w:cnfStyle w:val="000000000000" w:firstRow="0" w:lastRow="0" w:firstColumn="0" w:lastColumn="0" w:oddVBand="0" w:evenVBand="0" w:oddHBand="0" w:evenHBand="0" w:firstRowFirstColumn="0" w:firstRowLastColumn="0" w:lastRowFirstColumn="0" w:lastRowLastColumn="0"/>
+            </w:pPr>
+            <w:r>
+              <w:t xml:space="preserve">          ),</w:t>
+            </w:r>
+          </w:p>
+          <w:p>
+            <w:pPr>
+              <w:cnfStyle w:val="000000000000" w:firstRow="0" w:lastRow="0" w:firstColumn="0" w:lastColumn="0" w:oddVBand="0" w:evenVBand="0" w:oddHBand="0" w:evenHBand="0" w:firstRowFirstColumn="0" w:firstRowLastColumn="0" w:lastRowFirstColumn="0" w:lastRowLastColumn="0"/>
+            </w:pPr>
+            <w:r>
+              <w:t xml:space="preserve">        );</w:t>
+            </w:r>
+          </w:p>
+          <w:p>
+            <w:pPr>
+              <w:cnfStyle w:val="000000000000" w:firstRow="0" w:lastRow="0" w:firstColumn="0" w:lastColumn="0" w:oddVBand="0" w:evenVBand="0" w:oddHBand="0" w:evenHBand="0" w:firstRowFirstColumn="0" w:firstRowLastColumn="0" w:lastRowFirstColumn="0" w:lastRowLastColumn="0"/>
+            </w:pPr>
+            <w:r>
+              <w:t xml:space="preserve">      },</w:t>
+            </w:r>
+          </w:p>
+          <w:p>
+            <w:pPr>
+              <w:cnfStyle w:val="000000000000" w:firstRow="0" w:lastRow="0" w:firstColumn="0" w:lastColumn="0" w:oddVBand="0" w:evenVBand="0" w:oddHBand="0" w:evenHBand="0" w:firstRowFirstColumn="0" w:firstRowLastColumn="0" w:lastRowFirstColumn="0" w:lastRowLastColumn="0"/>
+            </w:pPr>
+            <w:r>
+              <w:t xml:space="preserve">    );</w:t>
+            </w:r>
+          </w:p>
+          <w:p>
+            <w:pPr>
+              <w:cnfStyle w:val="000000000000" w:firstRow="0" w:lastRow="0" w:firstColumn="0" w:lastColumn="0" w:oddVBand="0" w:evenVBand="0" w:oddHBand="0" w:evenHBand="0" w:firstRowFirstColumn="0" w:firstRowLastColumn="0" w:lastRowFirstColumn="0" w:lastRowLastColumn="0"/>
+            </w:pPr>
+            <w:r>
+              <w:t xml:space="preserve">  }</w:t>
+            </w:r>
+          </w:p>
+          <w:p>
+            <w:pPr>
+              <w:cnfStyle w:val="000000000000" w:firstRow="0" w:lastRow="0" w:firstColumn="0" w:lastColumn="0" w:oddVBand="0" w:evenVBand="0" w:oddHBand="0" w:evenHBand="0" w:firstRowFirstColumn="0" w:firstRowLastColumn="0" w:lastRowFirstColumn="0" w:lastRowLastColumn="0"/>
+            </w:pPr>
+            <w:r>
+              <w:t xml:space="preserve">  @</w:t>
+            </w:r>
+            <w:proofErr w:type="spellStart"/>
+            <w:r>
+              <w:t>override</w:t>
+            </w:r>
+            <w:proofErr w:type="spellEnd"/>
+          </w:p>
+          <w:p>
+            <w:pPr>
+              <w:cnfStyle w:val="000000000000" w:firstRow="0" w:lastRow="0" w:firstColumn="0" w:lastColumn="0" w:oddVBand="0" w:evenVBand="0" w:oddHBand="0" w:evenHBand="0" w:firstRowFirstColumn="0" w:firstRowLastColumn="0" w:lastRowFirstColumn="0" w:lastRowLastColumn="0"/>
+            </w:pPr>
+            <w:r>
+              <w:t xml:space="preserve">  Widget </w:t>
+            </w:r>
+            <w:proofErr w:type="spellStart"/>
+            <w:proofErr w:type="gramStart"/>
+            <w:r>
+              <w:t>build</w:t>
+            </w:r>
+            <w:proofErr w:type="spellEnd"/>
+            <w:r>
+              <w:t>(</w:t>
+            </w:r>
+            <w:proofErr w:type="spellStart"/>
+            <w:proofErr w:type="gramEnd"/>
+            <w:r>
+              <w:t>BuildContext</w:t>
+            </w:r>
+            <w:proofErr w:type="spellEnd"/>
+            <w:r>
+              <w:t xml:space="preserve"> </w:t>
+            </w:r>
+            <w:proofErr w:type="spellStart"/>
+            <w:r>
+              <w:t>context</w:t>
+            </w:r>
+            <w:proofErr w:type="spellEnd"/>
+            <w:r>
+              <w:t>) {</w:t>
+            </w:r>
+          </w:p>
+          <w:p>
+            <w:pPr>
+              <w:cnfStyle w:val="000000000000" w:firstRow="0" w:lastRow="0" w:firstColumn="0" w:lastColumn="0" w:oddVBand="0" w:evenVBand="0" w:oddHBand="0" w:evenHBand="0" w:firstRowFirstColumn="0" w:firstRowLastColumn="0" w:lastRowFirstColumn="0" w:lastRowLastColumn="0"/>
+            </w:pPr>
+            <w:r>
+              <w:t xml:space="preserve">    </w:t>
+            </w:r>
+            <w:proofErr w:type="spellStart"/>
+            <w:r>
+              <w:t>return</w:t>
+            </w:r>
+            <w:proofErr w:type="spellEnd"/>
+            <w:r>
+              <w:t xml:space="preserve"> </w:t>
+            </w:r>
+            <w:proofErr w:type="spellStart"/>
+            <w:proofErr w:type="gramStart"/>
+            <w:r>
+              <w:t>IconButton</w:t>
+            </w:r>
+            <w:proofErr w:type="spellEnd"/>
+            <w:r>
+              <w:t>(</w:t>
+            </w:r>
+            <w:proofErr w:type="gramEnd"/>
+          </w:p>
+          <w:p>
+            <w:pPr>
+              <w:cnfStyle w:val="000000000000" w:firstRow="0" w:lastRow="0" w:firstColumn="0" w:lastColumn="0" w:oddVBand="0" w:evenVBand="0" w:oddHBand="0" w:evenHBand="0" w:firstRowFirstColumn="0" w:firstRowLastColumn="0" w:lastRowFirstColumn="0" w:lastRowLastColumn="0"/>
+            </w:pPr>
+            <w:r>
+              <w:t xml:space="preserve">      </w:t>
+            </w:r>
+            <w:proofErr w:type="spellStart"/>
+            <w:r>
+              <w:t>icon</w:t>
+            </w:r>
+            <w:proofErr w:type="spellEnd"/>
+            <w:r>
+              <w:t xml:space="preserve">: </w:t>
+            </w:r>
+            <w:proofErr w:type="spellStart"/>
+            <w:r>
+              <w:t>const</w:t>
+            </w:r>
+            <w:proofErr w:type="spellEnd"/>
+            <w:r>
+              <w:t xml:space="preserve"> </w:t>
+            </w:r>
+            <w:proofErr w:type="spellStart"/>
+            <w:proofErr w:type="gramStart"/>
+            <w:r>
+              <w:t>Icon</w:t>
+            </w:r>
+            <w:proofErr w:type="spellEnd"/>
+            <w:r>
+              <w:t>(</w:t>
+            </w:r>
+            <w:proofErr w:type="spellStart"/>
+            <w:proofErr w:type="gramEnd"/>
+            <w:r>
+              <w:t>Icons.coffee</w:t>
+            </w:r>
+            <w:proofErr w:type="spellEnd"/>
+            <w:r>
+              <w:t>),</w:t>
+            </w:r>
+          </w:p>
+          <w:p>
+            <w:pPr>
+              <w:cnfStyle w:val="000000000000" w:firstRow="0" w:lastRow="0" w:firstColumn="0" w:lastColumn="0" w:oddVBand="0" w:evenVBand="0" w:oddHBand="0" w:evenHBand="0" w:firstRowFirstColumn="0" w:firstRowLastColumn="0" w:lastRowFirstColumn="0" w:lastRowLastColumn="0"/>
+            </w:pPr>
+            <w:r>
+              <w:t xml:space="preserve">      </w:t>
+            </w:r>
+            <w:proofErr w:type="spellStart"/>
+            <w:r>
+              <w:t>tooltip</w:t>
+            </w:r>
+            <w:proofErr w:type="spellEnd"/>
+            <w:r>
+              <w:t>: 'Apoyo económico',</w:t>
+            </w:r>
+          </w:p>
+          <w:p>
+            <w:pPr>
+              <w:cnfStyle w:val="000000000000" w:firstRow="0" w:lastRow="0" w:firstColumn="0" w:lastColumn="0" w:oddVBand="0" w:evenVBand="0" w:oddHBand="0" w:evenHBand="0" w:firstRowFirstColumn="0" w:firstRowLastColumn="0" w:lastRowFirstColumn="0" w:lastRowLastColumn="0"/>
+            </w:pPr>
+            <w:r>
+              <w:t xml:space="preserve">      </w:t>
+            </w:r>
+            <w:proofErr w:type="spellStart"/>
+            <w:r>
+              <w:t>onPressed</w:t>
+            </w:r>
+            <w:proofErr w:type="spellEnd"/>
+            <w:r>
+              <w:t>: () =&gt; _</w:t>
+            </w:r>
+            <w:proofErr w:type="spellStart"/>
+            <w:r>
+              <w:t>showSupportBottomSheet</w:t>
+            </w:r>
+            <w:proofErr w:type="spellEnd"/>
+            <w:r>
+              <w:t>(</w:t>
+            </w:r>
+            <w:proofErr w:type="spellStart"/>
+            <w:r>
+              <w:t>context</w:t>
+            </w:r>
+            <w:proofErr w:type="spellEnd"/>
+            <w:r>
+              <w:t>),</w:t>
+            </w:r>
+          </w:p>
+          <w:p>
+            <w:pPr>
+              <w:cnfStyle w:val="000000000000" w:firstRow="0" w:lastRow="0" w:firstColumn="0" w:lastColumn="0" w:oddVBand="0" w:evenVBand="0" w:oddHBand="0" w:evenHBand="0" w:firstRowFirstColumn="0" w:firstRowLastColumn="0" w:lastRowFirstColumn="0" w:lastRowLastColumn="0"/>
+            </w:pPr>
+            <w:r>
+              <w:t xml:space="preserve">    );</w:t>
+            </w:r>
+          </w:p>
+          <w:p>
+            <w:pPr>
+              <w:cnfStyle w:val="000000000000" w:firstRow="0" w:lastRow="0" w:firstColumn="0" w:lastColumn="0" w:oddVBand="0" w:evenVBand="0" w:oddHBand="0" w:evenHBand="0" w:firstRowFirstColumn="0" w:firstRowLastColumn="0" w:lastRowFirstColumn="0" w:lastRowLastColumn="0"/>
+            </w:pPr>
+            <w:r>
+              <w:t xml:space="preserve">  }</w:t>
+            </w:r>
+          </w:p>
+          <w:p>
+            <w:pPr>
+              <w:cnfStyle w:val="000000000000" w:firstRow="0" w:lastRow="0" w:firstColumn="0" w:lastColumn="0" w:oddVBand="0" w:evenVBand="0" w:oddHBand="0" w:evenHBand="0" w:firstRowFirstColumn="0" w:firstRowLastColumn="0" w:lastRowFirstColumn="0" w:lastRowLastColumn="0"/>
+            </w:pPr>
+            <w:r>
+              <w:t>}</w:t>
+            </w:r>
+          </w:p>
+          <w:p>
+            <w:pPr>
+              <w:cnfStyle w:val="000000000000" w:firstRow="0" w:lastRow="0" w:firstColumn="0" w:lastColumn="0" w:oddVBand="0" w:evenVBand="0" w:oddHBand="0" w:evenHBand="0" w:firstRowFirstColumn="0" w:firstRowLastColumn="0" w:lastRowFirstColumn="0" w:lastRowLastColumn="0"/>
+            </w:pPr>
+            <w:r>
+              <w:t>¿Cómo integrarlo a tu Aplicación?</w:t>
+            </w:r>
+          </w:p>
+          <w:p>
+            <w:pPr>
+              <w:cnfStyle w:val="000000000000" w:firstRow="0" w:lastRow="0" w:firstColumn="0" w:lastColumn="0" w:oddVBand="0" w:evenVBand="0" w:oddHBand="0" w:evenHBand="0" w:firstRowFirstColumn="0" w:firstRowLastColumn="0" w:lastRowFirstColumn="0" w:lastRowLastColumn="0"/>
+            </w:pPr>
+            <w:r>
+              <w:t>Busca tu archivo que contiene el widget base (</w:t>
+            </w:r>
+            <w:proofErr w:type="spellStart"/>
+            <w:r>
+              <w:t>AppBar</w:t>
+            </w:r>
+            <w:proofErr w:type="spellEnd"/>
+            <w:r>
+              <w:t xml:space="preserve"> de </w:t>
+            </w:r>
+            <w:proofErr w:type="spellStart"/>
+            <w:r>
+              <w:t>Scaffold</w:t>
+            </w:r>
+            <w:proofErr w:type="spellEnd"/>
+            <w:r>
+              <w:t>) y simplemente inserta </w:t>
+            </w:r>
+            <w:proofErr w:type="spellStart"/>
+            <w:proofErr w:type="gramStart"/>
+            <w:r>
+              <w:t>SupportButton</w:t>
+            </w:r>
+            <w:proofErr w:type="spellEnd"/>
+            <w:r>
+              <w:t>(</w:t>
+            </w:r>
+            <w:proofErr w:type="gramEnd"/>
+            <w:r>
+              <w:t>) al lado de tu botón de cambio de temas:</w:t>
+            </w:r>
+          </w:p>
+          <w:p>
+            <w:pPr>
+              <w:cnfStyle w:val="000000000000" w:firstRow="0" w:lastRow="0" w:firstColumn="0" w:lastColumn="0" w:oddVBand="0" w:evenVBand="0" w:oddHBand="0" w:evenHBand="0" w:firstRowFirstColumn="0" w:firstRowLastColumn="0" w:lastRowFirstColumn="0" w:lastRowLastColumn="0"/>
+            </w:pPr>
+            <w:proofErr w:type="spellStart"/>
+            <w:r>
+              <w:t>dart</w:t>
+            </w:r>
+            <w:proofErr w:type="spellEnd"/>
+          </w:p>
+          <w:p>
+            <w:pPr>
+              <w:cnfStyle w:val="000000000000" w:firstRow="0" w:lastRow="0" w:firstColumn="0" w:lastColumn="0" w:oddVBand="0" w:evenVBand="0" w:oddHBand="0" w:evenHBand="0" w:firstRowFirstColumn="0" w:firstRowLastColumn="0" w:lastRowFirstColumn="0" w:lastRowLastColumn="0"/>
+            </w:pPr>
+            <w:r>
+              <w:t>// Recuerda importar el archivo del botón</w:t>
+            </w:r>
+          </w:p>
+          <w:p>
+            <w:pPr>
+              <w:cnfStyle w:val="000000000000" w:firstRow="0" w:lastRow="0" w:firstColumn="0" w:lastColumn="0" w:oddVBand="0" w:evenVBand="0" w:oddHBand="0" w:evenHBand="0" w:firstRowFirstColumn="0" w:firstRowLastColumn="0" w:lastRowFirstColumn="0" w:lastRowLastColumn="0"/>
+            </w:pPr>
+            <w:proofErr w:type="spellStart"/>
+            <w:r>
+              <w:t>import</w:t>
+            </w:r>
+            <w:proofErr w:type="spellEnd"/>
+            <w:r>
+              <w:t xml:space="preserve"> '</w:t>
+            </w:r>
+            <w:proofErr w:type="spellStart"/>
+            <w:proofErr w:type="gramStart"/>
+            <w:r>
+              <w:t>package:dolar_bcv</w:t>
+            </w:r>
+            <w:proofErr w:type="spellEnd"/>
+            <w:r>
+              <w:t>/</w:t>
+            </w:r>
+            <w:proofErr w:type="spellStart"/>
+            <w:r>
+              <w:t>ui</w:t>
+            </w:r>
+            <w:proofErr w:type="spellEnd"/>
+            <w:r>
+              <w:t>/widgets/</w:t>
+            </w:r>
+            <w:proofErr w:type="spellStart"/>
+            <w:r>
+              <w:t>support_button.dart</w:t>
+            </w:r>
+            <w:proofErr w:type="spellEnd"/>
+            <w:proofErr w:type="gramEnd"/>
+            <w:r>
+              <w:t>';</w:t>
+            </w:r>
+          </w:p>
+          <w:p>
+            <w:pPr>
+              <w:cnfStyle w:val="000000000000" w:firstRow="0" w:lastRow="0" w:firstColumn="0" w:lastColumn="0" w:oddVBand="0" w:evenVBand="0" w:oddHBand="0" w:evenHBand="0" w:firstRowFirstColumn="0" w:firstRowLastColumn="0" w:lastRowFirstColumn="0" w:lastRowLastColumn="0"/>
+            </w:pPr>
+            <w:r>
+              <w:t xml:space="preserve">// ... en tu </w:t>
+            </w:r>
+            <w:proofErr w:type="spellStart"/>
+            <w:r>
+              <w:t>AppBar</w:t>
+            </w:r>
+            <w:proofErr w:type="spellEnd"/>
+            <w:r>
+              <w:t xml:space="preserve">: </w:t>
+            </w:r>
+          </w:p>
+          <w:p>
+            <w:pPr>
+              <w:cnfStyle w:val="000000000000" w:firstRow="0" w:lastRow="0" w:firstColumn="0" w:lastColumn="0" w:oddVBand="0" w:evenVBand="0" w:oddHBand="0" w:evenHBand="0" w:firstRowFirstColumn="0" w:firstRowLastColumn="0" w:lastRowFirstColumn="0" w:lastRowLastColumn="0"/>
+            </w:pPr>
+            <w:proofErr w:type="spellStart"/>
+            <w:proofErr w:type="gramStart"/>
+            <w:r>
+              <w:t>AppBar</w:t>
+            </w:r>
+            <w:proofErr w:type="spellEnd"/>
+            <w:r>
+              <w:t>(</w:t>
+            </w:r>
+            <w:proofErr w:type="gramEnd"/>
+          </w:p>
+          <w:p>
+            <w:pPr>
+              <w:cnfStyle w:val="000000000000" w:firstRow="0" w:lastRow="0" w:firstColumn="0" w:lastColumn="0" w:oddVBand="0" w:evenVBand="0" w:oddHBand="0" w:evenHBand="0" w:firstRowFirstColumn="0" w:firstRowLastColumn="0" w:lastRowFirstColumn="0" w:lastRowLastColumn="0"/>
+            </w:pPr>
+            <w:r>
+              <w:t xml:space="preserve">  // ...</w:t>
+            </w:r>
+          </w:p>
+          <w:p>
+            <w:pPr>
+              <w:cnfStyle w:val="000000000000" w:firstRow="0" w:lastRow="0" w:firstColumn="0" w:lastColumn="0" w:oddVBand="0" w:evenVBand="0" w:oddHBand="0" w:evenHBand="0" w:firstRowFirstColumn="0" w:firstRowLastColumn="0" w:lastRowFirstColumn="0" w:lastRowLastColumn="0"/>
+            </w:pPr>
+            <w:r>
+              <w:t xml:space="preserve">  </w:t>
+            </w:r>
+            <w:proofErr w:type="spellStart"/>
+            <w:r>
+              <w:t>actions</w:t>
+            </w:r>
+            <w:proofErr w:type="spellEnd"/>
+            <w:r>
+              <w:t>: [</w:t>
+            </w:r>
+          </w:p>
+          <w:p>
+            <w:pPr>
+              <w:cnfStyle w:val="000000000000" w:firstRow="0" w:lastRow="0" w:firstColumn="0" w:lastColumn="0" w:oddVBand="0" w:evenVBand="0" w:oddHBand="0" w:evenHBand="0" w:firstRowFirstColumn="0" w:firstRowLastColumn="0" w:lastRowFirstColumn="0" w:lastRowLastColumn="0"/>
+            </w:pPr>
+            <w:r>
+              <w:t xml:space="preserve">    </w:t>
+            </w:r>
+            <w:proofErr w:type="spellStart"/>
+            <w:r>
+              <w:t>const</w:t>
+            </w:r>
+            <w:proofErr w:type="spellEnd"/>
+            <w:r>
+              <w:t xml:space="preserve"> </w:t>
+            </w:r>
+            <w:proofErr w:type="spellStart"/>
+            <w:proofErr w:type="gramStart"/>
+            <w:r>
+              <w:t>SupportButton</w:t>
+            </w:r>
+            <w:proofErr w:type="spellEnd"/>
+            <w:r>
+              <w:t>(</w:t>
+            </w:r>
+            <w:proofErr w:type="gramEnd"/>
+            <w:r>
+              <w:t>), // &lt;--- Agrega el Botón que creamos</w:t>
+            </w:r>
+          </w:p>
+          <w:p>
+            <w:pPr>
+              <w:cnfStyle w:val="000000000000" w:firstRow="0" w:lastRow="0" w:firstColumn="0" w:lastColumn="0" w:oddVBand="0" w:evenVBand="0" w:oddHBand="0" w:evenHBand="0" w:firstRowFirstColumn="0" w:firstRowLastColumn="0" w:lastRowFirstColumn="0" w:lastRowLastColumn="0"/>
+            </w:pPr>
+            <w:r>
+              <w:t xml:space="preserve">    </w:t>
+            </w:r>
+            <w:proofErr w:type="spellStart"/>
+            <w:proofErr w:type="gramStart"/>
+            <w:r>
+              <w:t>IconButton</w:t>
+            </w:r>
+            <w:proofErr w:type="spellEnd"/>
+            <w:r>
+              <w:t>(</w:t>
+            </w:r>
+            <w:proofErr w:type="gramEnd"/>
+          </w:p>
+          <w:p>
+            <w:pPr>
+              <w:cnfStyle w:val="000000000000" w:firstRow="0" w:lastRow="0" w:firstColumn="0" w:lastColumn="0" w:oddVBand="0" w:evenVBand="0" w:oddHBand="0" w:evenHBand="0" w:firstRowFirstColumn="0" w:firstRowLastColumn="0" w:lastRowFirstColumn="0" w:lastRowLastColumn="0"/>
+            </w:pPr>
+            <w:r>
+              <w:t xml:space="preserve">      </w:t>
+            </w:r>
+            <w:proofErr w:type="spellStart"/>
+            <w:r>
+              <w:t>icon</w:t>
+            </w:r>
+            <w:proofErr w:type="spellEnd"/>
+            <w:r>
+              <w:t xml:space="preserve">: </w:t>
+            </w:r>
+            <w:proofErr w:type="spellStart"/>
+            <w:r>
+              <w:t>Icon</w:t>
+            </w:r>
+            <w:proofErr w:type="spellEnd"/>
+            <w:r>
+              <w:t>(</w:t>
+            </w:r>
+            <w:proofErr w:type="spellStart"/>
+            <w:r>
+              <w:t>Icons.light_mode</w:t>
+            </w:r>
+            <w:proofErr w:type="spellEnd"/>
+            <w:r>
+              <w:t>),</w:t>
+            </w:r>
+          </w:p>
+          <w:p>
+            <w:pPr>
+              <w:cnfStyle w:val="000000000000" w:firstRow="0" w:lastRow="0" w:firstColumn="0" w:lastColumn="0" w:oddVBand="0" w:evenVBand="0" w:oddHBand="0" w:evenHBand="0" w:firstRowFirstColumn="0" w:firstRowLastColumn="0" w:lastRowFirstColumn="0" w:lastRowLastColumn="0"/>
+            </w:pPr>
+            <w:r>
+              <w:t xml:space="preserve">      </w:t>
+            </w:r>
+            <w:proofErr w:type="spellStart"/>
+            <w:r>
+              <w:t>onPressed</w:t>
+            </w:r>
+            <w:proofErr w:type="spellEnd"/>
+            <w:r>
+              <w:t xml:space="preserve">: () </w:t>
+            </w:r>
+            <w:proofErr w:type="gramStart"/>
+            <w:r>
+              <w:t>{ /</w:t>
+            </w:r>
+            <w:proofErr w:type="gramEnd"/>
+            <w:r>
+              <w:t>* código para cambiar tema */ },</w:t>
+            </w:r>
+          </w:p>
+          <w:p>
+            <w:pPr>
+              <w:cnfStyle w:val="000000000000" w:firstRow="0" w:lastRow="0" w:firstColumn="0" w:lastColumn="0" w:oddVBand="0" w:evenVBand="0" w:oddHBand="0" w:evenHBand="0" w:firstRowFirstColumn="0" w:firstRowLastColumn="0" w:lastRowFirstColumn="0" w:lastRowLastColumn="0"/>
+            </w:pPr>
+            <w:r>
+              <w:t xml:space="preserve">    ),</w:t>
+            </w:r>
+          </w:p>
+          <w:p>
+            <w:pPr>
+              <w:cnfStyle w:val="000000000000" w:firstRow="0" w:lastRow="0" w:firstColumn="0" w:lastColumn="0" w:oddVBand="0" w:evenVBand="0" w:oddHBand="0" w:evenHBand="0" w:firstRowFirstColumn="0" w:firstRowLastColumn="0" w:lastRowFirstColumn="0" w:lastRowLastColumn="0"/>
+            </w:pPr>
+            <w:r>
+              <w:t xml:space="preserve">  ],</w:t>
+            </w:r>
+          </w:p>
+          <w:p>
+            <w:pPr>
+              <w:cnfStyle w:val="000000000000" w:firstRow="0" w:lastRow="0" w:firstColumn="0" w:lastColumn="0" w:oddVBand="0" w:evenVBand="0" w:oddHBand="0" w:evenHBand="0" w:firstRowFirstColumn="0" w:firstRowLastColumn="0" w:lastRowFirstColumn="0" w:lastRowLastColumn="0"/>
+            </w:pPr>
+            <w:r>
+              <w:t>)</w:t>
+            </w:r>
+          </w:p>
+          <w:p>
+            <w:pPr>
+              <w:cnfStyle w:val="000000000000" w:firstRow="0" w:lastRow="0" w:firstColumn="0" w:lastColumn="0" w:oddVBand="0" w:evenVBand="0" w:oddHBand="0" w:evenHBand="0" w:firstRowFirstColumn="0" w:firstRowLastColumn="0" w:lastRowFirstColumn="0" w:lastRowLastColumn="0"/>
+            </w:pPr>
+            <w:r>
+              <w:t>¡Eso debería dejar todo listo! Avísame si necesitas hacer algún ajuste en particular sobre el diseño o el comportamiento.</w:t>
+            </w:r>
+          </w:p>
+          <w:p>
+            <w:pPr>
+              <w:cnfStyle w:val="000000000000" w:firstRow="0" w:lastRow="0" w:firstColumn="0" w:lastColumn="0" w:oddVBand="0" w:evenVBand="0" w:oddHBand="0" w:evenHBand="0" w:firstRowFirstColumn="0" w:firstRowLastColumn="0" w:lastRowFirstColumn="0" w:lastRowLastColumn="0"/>
+            </w:pPr>
+          </w:p>
+        </w:tc>
+      </w:tr>
+      <w:tr>
+        <w:trPr>
+          <w:cnfStyle w:val="000000100000" w:firstRow="0" w:lastRow="0" w:firstColumn="0" w:lastColumn="0" w:oddVBand="0" w:evenVBand="0" w:oddHBand="1" w:evenHBand="0" w:firstRowFirstColumn="0" w:firstRowLastColumn="0" w:lastRowFirstColumn="0" w:lastRowLastColumn="0"/>
+        </w:trPr>
+        <w:tc>
+          <w:tcPr>
+            <w:cnfStyle w:val="001000000000" w:firstRow="0" w:lastRow="0" w:firstColumn="1" w:lastColumn="0" w:oddVBand="0" w:evenVBand="0" w:oddHBand="0" w:evenHBand="0" w:firstRowFirstColumn="0" w:firstRowLastColumn="0" w:lastRowFirstColumn="0" w:lastRowLastColumn="0"/>
+            <w:tcW w:w="1056" w:type="dxa"/>
+          </w:tcPr>
+          <w:p>
+            <w:pPr>
+              <w:rPr>
+                <w:i w:val="0"/>
+                <w:iCs w:val="0"/>
+              </w:rPr>
+            </w:pPr>
+            <w:r>
+              <w:rPr>
+                <w:i w:val="0"/>
+                <w:iCs w:val="0"/>
+              </w:rPr>
+              <w:lastRenderedPageBreak/>
+              <w:t>7/4/2026</w:t>
+            </w:r>
+          </w:p>
+        </w:tc>
+        <w:tc>
+          <w:tcPr>
+            <w:tcW w:w="9619" w:type="dxa"/>
+          </w:tcPr>
+          <w:p>
+            <w:pPr>
+              <w:cnfStyle w:val="000000100000" w:firstRow="0" w:lastRow="0" w:firstColumn="0" w:lastColumn="0" w:oddVBand="0" w:evenVBand="0" w:oddHBand="1" w:evenHBand="0" w:firstRowFirstColumn="0" w:firstRowLastColumn="0" w:lastRowFirstColumn="0" w:lastRowLastColumn="0"/>
+            </w:pPr>
+            <w:r>
+              <w:t>Vamos a probar si todo quedó bien en el celular</w:t>
+            </w:r>
+          </w:p>
+          <w:p>
+            <w:pPr>
+              <w:cnfStyle w:val="000000100000" w:firstRow="0" w:lastRow="0" w:firstColumn="0" w:lastColumn="0" w:oddVBand="0" w:evenVBand="0" w:oddHBand="1" w:evenHBand="0" w:firstRowFirstColumn="0" w:firstRowLastColumn="0" w:lastRowFirstColumn="0" w:lastRowLastColumn="0"/>
+            </w:pPr>
+          </w:p>
+        </w:tc>
+      </w:tr>
+      <w:tr>
+        <w:tc>
+          <w:tcPr>
+            <w:cnfStyle w:val="001000000000" w:firstRow="0" w:lastRow="0" w:firstColumn="1" w:lastColumn="0" w:oddVBand="0" w:evenVBand="0" w:oddHBand="0" w:evenHBand="0" w:firstRowFirstColumn="0" w:firstRowLastColumn="0" w:lastRowFirstColumn="0" w:lastRowLastColumn="0"/>
+            <w:tcW w:w="1056" w:type="dxa"/>
+          </w:tcPr>
+          <w:p>
+            <w:pPr>
+              <w:rPr>
+                <w:i w:val="0"/>
+                <w:iCs w:val="0"/>
+              </w:rPr>
+            </w:pPr>
+          </w:p>
+        </w:tc>
+        <w:tc>
+          <w:tcPr>
+            <w:tcW w:w="9619" w:type="dxa"/>
+          </w:tcPr>
+          <w:p>
+            <w:pPr>
+              <w:cnfStyle w:val="000000000000" w:firstRow="0" w:lastRow="0" w:firstColumn="0" w:lastColumn="0" w:oddVBand="0" w:evenVBand="0" w:oddHBand="0" w:evenHBand="0" w:firstRowFirstColumn="0" w:firstRowLastColumn="0" w:lastRowFirstColumn="0" w:lastRowLastColumn="0"/>
+            </w:pPr>
+            <w:r>
+              <w:t>Listo. Ya he integrado automáticamente el widget de </w:t>
+            </w:r>
+            <w:proofErr w:type="spellStart"/>
+            <w:r>
+              <w:t>SupportButton</w:t>
+            </w:r>
+            <w:proofErr w:type="spellEnd"/>
+            <w:r>
+              <w:t> directamente en la pantalla principal de tu app (</w:t>
+            </w:r>
+            <w:proofErr w:type="spellStart"/>
+            <w:r>
+              <w:t>home_</w:t>
+            </w:r>
+            <w:proofErr w:type="gramStart"/>
+            <w:r>
+              <w:t>screen.dart</w:t>
+            </w:r>
+            <w:proofErr w:type="spellEnd"/>
+            <w:proofErr w:type="gramEnd"/>
+            <w:r>
+              <w:t>), justo al lado izquierdo de tu icono para cambiar el modo oscuro/claro, tal cual me solicitaste.</w:t>
+            </w:r>
+          </w:p>
+          <w:p>
+            <w:pPr>
+              <w:cnfStyle w:val="000000000000" w:firstRow="0" w:lastRow="0" w:firstColumn="0" w:lastColumn="0" w:oddVBand="0" w:evenVBand="0" w:oddHBand="0" w:evenHBand="0" w:firstRowFirstColumn="0" w:firstRowLastColumn="0" w:lastRowFirstColumn="0" w:lastRowLastColumn="0"/>
+            </w:pPr>
+            <w:r>
+              <w:t>Puedes recompilar y probar todo en tu celular. El paquete </w:t>
+            </w:r>
+            <w:proofErr w:type="spellStart"/>
+            <w:r>
+              <w:t>url_launcher</w:t>
+            </w:r>
+            <w:proofErr w:type="spellEnd"/>
+            <w:r>
+              <w:t> ya fue añadido a las dependencias y el botón te abrirá el menú en la parte inferior (suavizado y estructurado con </w:t>
+            </w:r>
+            <w:proofErr w:type="spellStart"/>
+            <w:r>
+              <w:t>ModalBottomSheet</w:t>
+            </w:r>
+            <w:proofErr w:type="spellEnd"/>
+            <w:r>
+              <w:t>) con todas las modalidades de pago preparadas.</w:t>
+            </w:r>
+          </w:p>
+          <w:p>
+            <w:pPr>
+              <w:cnfStyle w:val="000000000000" w:firstRow="0" w:lastRow="0" w:firstColumn="0" w:lastColumn="0" w:oddVBand="0" w:evenVBand="0" w:oddHBand="0" w:evenHBand="0" w:firstRowFirstColumn="0" w:firstRowLastColumn="0" w:lastRowFirstColumn="0" w:lastRowLastColumn="0"/>
+            </w:pPr>
+            <w:r>
+              <w:lastRenderedPageBreak/>
+              <w:t xml:space="preserve">¡Prueba en tu dispositivo y me avisas si quieres que ajuste algún </w:t>
+            </w:r>
+            <w:proofErr w:type="spellStart"/>
+            <w:r>
+              <w:t>pad</w:t>
+            </w:r>
+            <w:proofErr w:type="spellEnd"/>
+            <w:r>
+              <w:t>/margen o los colores de los botones!</w:t>
+            </w:r>
+          </w:p>
+          <w:p>
+            <w:pPr>
+              <w:cnfStyle w:val="000000000000" w:firstRow="0" w:lastRow="0" w:firstColumn="0" w:lastColumn="0" w:oddVBand="0" w:evenVBand="0" w:oddHBand="0" w:evenHBand="0" w:firstRowFirstColumn="0" w:firstRowLastColumn="0" w:lastRowFirstColumn="0" w:lastRowLastColumn="0"/>
+            </w:pPr>
+          </w:p>
+        </w:tc>
+      </w:tr>
+      <w:tr>
+        <w:trPr>
+          <w:cnfStyle w:val="000000100000" w:firstRow="0" w:lastRow="0" w:firstColumn="0" w:lastColumn="0" w:oddVBand="0" w:evenVBand="0" w:oddHBand="1" w:evenHBand="0" w:firstRowFirstColumn="0" w:firstRowLastColumn="0" w:lastRowFirstColumn="0" w:lastRowLastColumn="0"/>
+        </w:trPr>
+        <w:tc>
+          <w:tcPr>
+            <w:cnfStyle w:val="001000000000" w:firstRow="0" w:lastRow="0" w:firstColumn="1" w:lastColumn="0" w:oddVBand="0" w:evenVBand="0" w:oddHBand="0" w:evenHBand="0" w:firstRowFirstColumn="0" w:firstRowLastColumn="0" w:lastRowFirstColumn="0" w:lastRowLastColumn="0"/>
+            <w:tcW w:w="1056" w:type="dxa"/>
+          </w:tcPr>
+          <w:p>
+            <w:pPr>
+              <w:rPr>
+                <w:i w:val="0"/>
+                <w:iCs w:val="0"/>
+              </w:rPr>
+            </w:pPr>
+            <w:r>
+              <w:rPr>
+                <w:i w:val="0"/>
+                <w:iCs w:val="0"/>
+              </w:rPr>
+              <w:lastRenderedPageBreak/>
+              <w:t>7/4/2026</w:t>
+            </w:r>
+          </w:p>
+        </w:tc>
+        <w:tc>
+          <w:tcPr>
+            <w:tcW w:w="9619" w:type="dxa"/>
+          </w:tcPr>
+          <w:p>
+            <w:pPr>
+              <w:cnfStyle w:val="000000100000" w:firstRow="0" w:lastRow="0" w:firstColumn="0" w:lastColumn="0" w:oddVBand="0" w:evenVBand="0" w:oddHBand="1" w:evenHBand="0" w:firstRowFirstColumn="0" w:firstRowLastColumn="0" w:lastRowFirstColumn="0" w:lastRowLastColumn="0"/>
+            </w:pPr>
+            <w:r>
+              <w:t xml:space="preserve">Hay un detallito que se está quedando pendiente. Es el de cambiar el símbolo de </w:t>
+            </w:r>
+            <w:proofErr w:type="spellStart"/>
+            <w:r>
+              <w:t>flutter</w:t>
+            </w:r>
+            <w:proofErr w:type="spellEnd"/>
+            <w:r>
+              <w:t xml:space="preserve"> que trae por defecto la aplicación. Dime dónde esa imagen o icono y cómo puedo cambiarlo por otro que yo he diseñado en una imagen </w:t>
+            </w:r>
+            <w:proofErr w:type="spellStart"/>
+            <w:r>
+              <w:t>png</w:t>
+            </w:r>
+            <w:proofErr w:type="spellEnd"/>
+            <w:r>
+              <w:t>.</w:t>
+            </w:r>
+          </w:p>
+          <w:p>
+            <w:pPr>
+              <w:cnfStyle w:val="000000100000" w:firstRow="0" w:lastRow="0" w:firstColumn="0" w:lastColumn="0" w:oddVBand="0" w:evenVBand="0" w:oddHBand="1" w:evenHBand="0" w:firstRowFirstColumn="0" w:firstRowLastColumn="0" w:lastRowFirstColumn="0" w:lastRowLastColumn="0"/>
+            </w:pPr>
+          </w:p>
+        </w:tc>
+      </w:tr>
+      <w:tr>
+        <w:tc>
+          <w:tcPr>
+            <w:cnfStyle w:val="001000000000" w:firstRow="0" w:lastRow="0" w:firstColumn="1" w:lastColumn="0" w:oddVBand="0" w:evenVBand="0" w:oddHBand="0" w:evenHBand="0" w:firstRowFirstColumn="0" w:firstRowLastColumn="0" w:lastRowFirstColumn="0" w:lastRowLastColumn="0"/>
+            <w:tcW w:w="1056" w:type="dxa"/>
+          </w:tcPr>
+          <w:p>
+            <w:pPr>
+              <w:rPr>
+                <w:i w:val="0"/>
+                <w:iCs w:val="0"/>
+              </w:rPr>
+            </w:pPr>
+          </w:p>
+        </w:tc>
+        <w:tc>
+          <w:tcPr>
+            <w:tcW w:w="9619" w:type="dxa"/>
+          </w:tcPr>
           <w:p>
             <w:pPr>
               <w:cnfStyle w:val="000000000000" w:firstRow="0" w:lastRow="0" w:firstColumn="0" w:lastColumn="0" w:oddVBand="0" w:evenVBand="0" w:oddHBand="0" w:evenHBand="0" w:firstRowFirstColumn="0" w:firstRowLastColumn="0" w:lastRowFirstColumn="0" w:lastRowLastColumn="0"/>

</xml_diff>